<commit_message>
cambios en los logos de los formatos word
</commit_message>
<xml_diff>
--- a/server/templates/transporte/Entrega_Instrucciones.docx
+++ b/server/templates/transporte/Entrega_Instrucciones.docx
@@ -1,8 +1,8 @@
 
 <file path=word/document.xml><?xml version="1.0" encoding="utf-8"?>
-<w:document xmlns:wpc="http://schemas.microsoft.com/office/word/2010/wordprocessingCanvas" xmlns:cx="http://schemas.microsoft.com/office/drawing/2014/chartex" xmlns:cx1="http://schemas.microsoft.com/office/drawing/2015/9/8/chartex" xmlns:cx2="http://schemas.microsoft.com/office/drawing/2015/10/21/chartex" xmlns:cx3="http://schemas.microsoft.com/office/drawing/2016/5/9/chartex" xmlns:cx4="http://schemas.microsoft.com/office/drawing/2016/5/10/chartex" xmlns:cx5="http://schemas.microsoft.com/office/drawing/2016/5/11/chartex" xmlns:cx6="http://schemas.microsoft.com/office/drawing/2016/5/12/chartex" xmlns:cx7="http://schemas.microsoft.com/office/drawing/2016/5/13/chartex" xmlns:cx8="http://schemas.microsoft.com/office/drawing/2016/5/14/chartex" xmlns:mc="http://schemas.openxmlformats.org/markup-compatibility/2006" xmlns:aink="http://schemas.microsoft.com/office/drawing/2016/ink" xmlns:am3d="http://schemas.microsoft.com/office/drawing/2017/model3d" xmlns:o="urn:schemas-microsoft-com:office:office" xmlns:oel="http://schemas.microsoft.com/office/2019/extlst" xmlns:r="http://schemas.openxmlformats.org/officeDocument/2006/relationships" xmlns:m="http://schemas.openxmlformats.org/officeDocument/2006/math" xmlns:v="urn:schemas-microsoft-com:vml" xmlns:wp14="http://schemas.microsoft.com/office/word/2010/wordprocessingDrawing" xmlns:wp="http://schemas.openxmlformats.org/drawingml/2006/wordprocessingDrawing" xmlns:w10="urn:schemas-microsoft-com:office:word" xmlns:w="http://schemas.openxmlformats.org/wordprocessingml/2006/main" xmlns:w14="http://schemas.microsoft.com/office/word/2010/wordml" xmlns:w15="http://schemas.microsoft.com/office/word/2012/wordml" xmlns:w16cex="http://schemas.microsoft.com/office/word/2018/wordml/cex" xmlns:w16cid="http://schemas.microsoft.com/office/word/2016/wordml/cid" xmlns:w16="http://schemas.microsoft.com/office/word/2018/wordml" xmlns:w16du="http://schemas.microsoft.com/office/word/2023/wordml/word16du" xmlns:w16sdtdh="http://schemas.microsoft.com/office/word/2020/wordml/sdtdatahash" xmlns:w16se="http://schemas.microsoft.com/office/word/2015/wordml/symex" xmlns:wpg="http://schemas.microsoft.com/office/word/2010/wordprocessingGroup" xmlns:wpi="http://schemas.microsoft.com/office/word/2010/wordprocessingInk" xmlns:wne="http://schemas.microsoft.com/office/word/2006/wordml" xmlns:wps="http://schemas.microsoft.com/office/word/2010/wordprocessingShape" mc:Ignorable="w14 w15 w16se w16cid w16 w16cex w16sdtdh w16du wp14">
+<w:document xmlns:wpc="http://schemas.microsoft.com/office/word/2010/wordprocessingCanvas" xmlns:cx="http://schemas.microsoft.com/office/drawing/2014/chartex" xmlns:cx1="http://schemas.microsoft.com/office/drawing/2015/9/8/chartex" xmlns:cx2="http://schemas.microsoft.com/office/drawing/2015/10/21/chartex" xmlns:cx3="http://schemas.microsoft.com/office/drawing/2016/5/9/chartex" xmlns:cx4="http://schemas.microsoft.com/office/drawing/2016/5/10/chartex" xmlns:cx5="http://schemas.microsoft.com/office/drawing/2016/5/11/chartex" xmlns:cx6="http://schemas.microsoft.com/office/drawing/2016/5/12/chartex" xmlns:cx7="http://schemas.microsoft.com/office/drawing/2016/5/13/chartex" xmlns:cx8="http://schemas.microsoft.com/office/drawing/2016/5/14/chartex" xmlns:mc="http://schemas.openxmlformats.org/markup-compatibility/2006" xmlns:aink="http://schemas.microsoft.com/office/drawing/2016/ink" xmlns:am3d="http://schemas.microsoft.com/office/drawing/2017/model3d" xmlns:o="urn:schemas-microsoft-com:office:office" xmlns:oel="http://schemas.microsoft.com/office/2019/extlst" xmlns:r="http://schemas.openxmlformats.org/officeDocument/2006/relationships" xmlns:m="http://schemas.openxmlformats.org/officeDocument/2006/math" xmlns:v="urn:schemas-microsoft-com:vml" xmlns:wp14="http://schemas.microsoft.com/office/word/2010/wordprocessingDrawing" xmlns:wp="http://schemas.openxmlformats.org/drawingml/2006/wordprocessingDrawing" xmlns:w10="urn:schemas-microsoft-com:office:word" xmlns:w="http://schemas.openxmlformats.org/wordprocessingml/2006/main" xmlns:w14="http://schemas.microsoft.com/office/word/2010/wordml" xmlns:w15="http://schemas.microsoft.com/office/word/2012/wordml" xmlns:w16cex="http://schemas.microsoft.com/office/word/2018/wordml/cex" xmlns:w16cid="http://schemas.microsoft.com/office/word/2016/wordml/cid" xmlns:w16="http://schemas.microsoft.com/office/word/2018/wordml" xmlns:w16du="http://schemas.microsoft.com/office/word/2023/wordml/word16du" xmlns:w16sdtdh="http://schemas.microsoft.com/office/word/2020/wordml/sdtdatahash" xmlns:w16sdtfl="http://schemas.microsoft.com/office/word/2024/wordml/sdtformatlock" xmlns:w16se="http://schemas.microsoft.com/office/word/2015/wordml/symex" xmlns:wpg="http://schemas.microsoft.com/office/word/2010/wordprocessingGroup" xmlns:wpi="http://schemas.microsoft.com/office/word/2010/wordprocessingInk" xmlns:wne="http://schemas.microsoft.com/office/word/2006/wordml" xmlns:wps="http://schemas.microsoft.com/office/word/2010/wordprocessingShape" mc:Ignorable="w14 w15 w16se w16cid w16 w16cex w16sdtdh w16sdtfl w16du wp14">
   <w:body>
-    <w:p xmlns:wp14="http://schemas.microsoft.com/office/word/2010/wordml" wp14:textId="77777777">
+    <w:p>
       <w:pPr>
         <w:widowControl w:val="0"/>
         <w:pBdr>
@@ -15,12 +15,12 @@
         <w:spacing w:after="0"/>
       </w:pPr>
     </w:p>
-    <w:p xmlns:wp14="http://schemas.microsoft.com/office/word/2010/wordml" wp14:textId="77777777">
+    <w:p>
       <w:pPr>
         <w:spacing w:after="0" w:line="240" w:lineRule="auto"/>
         <w:jc w:val="center"/>
         <w:rPr>
-          <w:rFonts w:ascii="Tahoma" w:hAnsi="Tahoma" w:eastAsia="Tahoma" w:cs="Tahoma"/>
+          <w:rFonts w:ascii="Tahoma" w:eastAsia="Tahoma" w:hAnsi="Tahoma" w:cs="Tahoma"/>
           <w:b/>
           <w:sz w:val="24"/>
           <w:szCs w:val="24"/>
@@ -28,7 +28,7 @@
       </w:pPr>
       <w:r>
         <w:rPr>
-          <w:rFonts w:ascii="Tahoma" w:hAnsi="Tahoma" w:eastAsia="Tahoma" w:cs="Tahoma"/>
+          <w:rFonts w:ascii="Tahoma" w:eastAsia="Tahoma" w:hAnsi="Tahoma" w:cs="Tahoma"/>
           <w:b/>
           <w:sz w:val="24"/>
           <w:szCs w:val="24"/>
@@ -36,46 +36,48 @@
         <w:t xml:space="preserve">ENTREGA DE CARGA E INSTRUCCIONES DE MANEJO </w:t>
       </w:r>
     </w:p>
-    <w:p xmlns:wp14="http://schemas.microsoft.com/office/word/2010/wordml" wp14:textId="77777777">
+    <w:p>
       <w:pPr>
         <w:spacing w:after="0" w:line="240" w:lineRule="auto"/>
         <w:jc w:val="center"/>
         <w:rPr>
-          <w:rFonts w:ascii="Tahoma" w:hAnsi="Tahoma" w:eastAsia="Tahoma" w:cs="Tahoma"/>
+          <w:rFonts w:ascii="Tahoma" w:eastAsia="Tahoma" w:hAnsi="Tahoma" w:cs="Tahoma"/>
           <w:sz w:val="24"/>
           <w:szCs w:val="24"/>
         </w:rPr>
       </w:pPr>
     </w:p>
-    <w:p xmlns:wp14="http://schemas.microsoft.com/office/word/2010/wordml" wp14:textId="2D31497E">
+    <w:p>
       <w:pPr>
         <w:spacing w:after="0" w:line="240" w:lineRule="auto"/>
         <w:jc w:val="both"/>
         <w:rPr>
-          <w:rFonts w:ascii="Tahoma" w:hAnsi="Tahoma" w:eastAsia="Tahoma" w:cs="Tahoma"/>
-          <w:sz w:val="24"/>
-          <w:szCs w:val="24"/>
-        </w:rPr>
-      </w:pPr>
-      <w:r>
-        <w:rPr>
-          <w:rFonts w:ascii="Tahoma" w:hAnsi="Tahoma" w:eastAsia="Tahoma" w:cs="Tahoma"/>
+          <w:rFonts w:ascii="Tahoma" w:eastAsia="Tahoma" w:hAnsi="Tahoma" w:cs="Tahoma"/>
+          <w:sz w:val="24"/>
+          <w:szCs w:val="24"/>
+        </w:rPr>
+      </w:pPr>
+      <w:r>
+        <w:rPr>
+          <w:rFonts w:ascii="Tahoma" w:eastAsia="Tahoma" w:hAnsi="Tahoma" w:cs="Tahoma"/>
           <w:sz w:val="24"/>
           <w:szCs w:val="24"/>
         </w:rPr>
         <w:t xml:space="preserve">CELIFRUT SAS, identificada con NIT 900.885.896-4, ENCOMIENDA a la empresa trasportadora {transportadora} identificada con </w:t>
       </w:r>
-      <w:r>
-        <w:rPr>
-          <w:rFonts w:ascii="Tahoma" w:hAnsi="Tahoma" w:eastAsia="Tahoma" w:cs="Tahoma"/>
+      <w:proofErr w:type="spellStart"/>
+      <w:r>
+        <w:rPr>
+          <w:rFonts w:ascii="Tahoma" w:eastAsia="Tahoma" w:hAnsi="Tahoma" w:cs="Tahoma"/>
           <w:sz w:val="24"/>
           <w:szCs w:val="24"/>
         </w:rPr>
         <w:t>Nit</w:t>
       </w:r>
-      <w:r>
-        <w:rPr>
-          <w:rFonts w:ascii="Tahoma" w:hAnsi="Tahoma" w:eastAsia="Tahoma" w:cs="Tahoma"/>
+      <w:proofErr w:type="spellEnd"/>
+      <w:r>
+        <w:rPr>
+          <w:rFonts w:ascii="Tahoma" w:eastAsia="Tahoma" w:hAnsi="Tahoma" w:cs="Tahoma"/>
           <w:sz w:val="24"/>
           <w:szCs w:val="24"/>
         </w:rPr>
@@ -83,23 +85,26 @@
       </w:r>
       <w:r>
         <w:rPr>
-          <w:rFonts w:ascii="Tahoma" w:hAnsi="Tahoma" w:eastAsia="Tahoma" w:cs="Tahoma"/>
+          <w:rFonts w:ascii="Tahoma" w:eastAsia="Tahoma" w:hAnsi="Tahoma" w:cs="Tahoma"/>
           <w:sz w:val="24"/>
           <w:szCs w:val="24"/>
         </w:rPr>
         <w:t xml:space="preserve"> {</w:t>
       </w:r>
-      <w:r>
-        <w:rPr>
-          <w:rFonts w:ascii="Tahoma" w:hAnsi="Tahoma" w:eastAsia="Tahoma" w:cs="Tahoma"/>
+      <w:proofErr w:type="spellStart"/>
+      <w:proofErr w:type="gramStart"/>
+      <w:r>
+        <w:rPr>
+          <w:rFonts w:ascii="Tahoma" w:eastAsia="Tahoma" w:hAnsi="Tahoma" w:cs="Tahoma"/>
           <w:sz w:val="24"/>
           <w:szCs w:val="24"/>
         </w:rPr>
         <w:t>nit</w:t>
       </w:r>
-      <w:r>
-        <w:rPr>
-          <w:rFonts w:ascii="Tahoma" w:hAnsi="Tahoma" w:eastAsia="Tahoma" w:cs="Tahoma"/>
+      <w:proofErr w:type="spellEnd"/>
+      <w:r>
+        <w:rPr>
+          <w:rFonts w:ascii="Tahoma" w:eastAsia="Tahoma" w:hAnsi="Tahoma" w:cs="Tahoma"/>
           <w:sz w:val="24"/>
           <w:szCs w:val="24"/>
         </w:rPr>
@@ -107,19 +112,28 @@
       </w:r>
       <w:r>
         <w:rPr>
-          <w:rFonts w:ascii="Tahoma" w:hAnsi="Tahoma" w:eastAsia="Tahoma" w:cs="Tahoma"/>
-          <w:sz w:val="24"/>
-          <w:szCs w:val="24"/>
-        </w:rPr>
-        <w:t xml:space="preserve">  la carga relacionada a continuación:</w:t>
+          <w:rFonts w:ascii="Tahoma" w:eastAsia="Tahoma" w:hAnsi="Tahoma" w:cs="Tahoma"/>
+          <w:sz w:val="24"/>
+          <w:szCs w:val="24"/>
+        </w:rPr>
+        <w:t xml:space="preserve">  la</w:t>
+      </w:r>
+      <w:proofErr w:type="gramEnd"/>
+      <w:r>
+        <w:rPr>
+          <w:rFonts w:ascii="Tahoma" w:eastAsia="Tahoma" w:hAnsi="Tahoma" w:cs="Tahoma"/>
+          <w:sz w:val="24"/>
+          <w:szCs w:val="24"/>
+        </w:rPr>
+        <w:t xml:space="preserve"> carga relacionada a continuación:</w:t>
       </w:r>
     </w:p>
-    <w:p xmlns:wp14="http://schemas.microsoft.com/office/word/2010/wordml" wp14:textId="77777777">
+    <w:p>
       <w:pPr>
         <w:spacing w:after="0" w:line="240" w:lineRule="auto"/>
         <w:jc w:val="both"/>
         <w:rPr>
-          <w:rFonts w:ascii="Tahoma" w:hAnsi="Tahoma" w:eastAsia="Tahoma" w:cs="Tahoma"/>
+          <w:rFonts w:ascii="Tahoma" w:eastAsia="Tahoma" w:hAnsi="Tahoma" w:cs="Tahoma"/>
           <w:sz w:val="24"/>
           <w:szCs w:val="24"/>
         </w:rPr>
@@ -139,9 +153,10 @@
         <w:gridCol w:w="1985"/>
         <w:gridCol w:w="567"/>
       </w:tblGrid>
-      <w:tr xmlns:wp14="http://schemas.microsoft.com/office/word/2010/wordml" wp14:textId="77777777">
+      <w:tr>
         <w:trPr>
           <w:gridAfter w:val="1"/>
+          <w:wAfter w:w="567" w:type="dxa"/>
           <w:trHeight w:val="288"/>
         </w:trPr>
         <w:tc>
@@ -153,14 +168,13 @@
               <w:bottom w:val="nil"/>
               <w:right w:val="nil"/>
             </w:tcBorders>
-            <w:shd w:val="clear" w:color="auto" w:fill="auto"/>
             <w:vAlign w:val="center"/>
           </w:tcPr>
-          <w:p wp14:textId="77777777">
+          <w:p>
             <w:pPr>
               <w:spacing w:after="0" w:line="240" w:lineRule="auto"/>
               <w:rPr>
-                <w:rFonts w:ascii="Tahoma" w:hAnsi="Tahoma" w:eastAsia="Tahoma" w:cs="Tahoma"/>
+                <w:rFonts w:ascii="Tahoma" w:eastAsia="Tahoma" w:hAnsi="Tahoma" w:cs="Tahoma"/>
                 <w:color w:val="000000"/>
                 <w:sz w:val="18"/>
                 <w:szCs w:val="18"/>
@@ -168,7 +182,7 @@
             </w:pPr>
             <w:r>
               <w:rPr>
-                <w:rFonts w:ascii="Tahoma" w:hAnsi="Tahoma" w:eastAsia="Tahoma" w:cs="Tahoma"/>
+                <w:rFonts w:ascii="Tahoma" w:eastAsia="Tahoma" w:hAnsi="Tahoma" w:cs="Tahoma"/>
                 <w:color w:val="000000"/>
                 <w:sz w:val="18"/>
                 <w:szCs w:val="18"/>
@@ -187,14 +201,13 @@
               <w:bottom w:val="nil"/>
               <w:right w:val="nil"/>
             </w:tcBorders>
-            <w:shd w:val="clear" w:color="auto" w:fill="auto"/>
             <w:vAlign w:val="center"/>
           </w:tcPr>
-          <w:p wp14:textId="77777777">
+          <w:p>
             <w:pPr>
               <w:spacing w:after="0" w:line="240" w:lineRule="auto"/>
               <w:rPr>
-                <w:rFonts w:ascii="Tahoma" w:hAnsi="Tahoma" w:eastAsia="Tahoma" w:cs="Tahoma"/>
+                <w:rFonts w:ascii="Tahoma" w:eastAsia="Tahoma" w:hAnsi="Tahoma" w:cs="Tahoma"/>
                 <w:color w:val="000000"/>
                 <w:sz w:val="18"/>
                 <w:szCs w:val="18"/>
@@ -202,7 +215,7 @@
             </w:pPr>
             <w:r>
               <w:rPr>
-                <w:rFonts w:ascii="Tahoma" w:hAnsi="Tahoma" w:eastAsia="Tahoma" w:cs="Tahoma"/>
+                <w:rFonts w:ascii="Tahoma" w:eastAsia="Tahoma" w:hAnsi="Tahoma" w:cs="Tahoma"/>
                 <w:sz w:val="18"/>
                 <w:szCs w:val="18"/>
               </w:rPr>
@@ -211,9 +224,10 @@
           </w:p>
         </w:tc>
       </w:tr>
-      <w:tr xmlns:wp14="http://schemas.microsoft.com/office/word/2010/wordml" wp14:textId="77777777">
+      <w:tr>
         <w:trPr>
           <w:gridAfter w:val="1"/>
+          <w:wAfter w:w="567" w:type="dxa"/>
           <w:trHeight w:val="288"/>
         </w:trPr>
         <w:tc>
@@ -225,14 +239,13 @@
               <w:bottom w:val="nil"/>
               <w:right w:val="nil"/>
             </w:tcBorders>
-            <w:shd w:val="clear" w:color="auto" w:fill="auto"/>
             <w:vAlign w:val="center"/>
           </w:tcPr>
-          <w:p wp14:textId="77777777">
+          <w:p>
             <w:pPr>
               <w:spacing w:after="0" w:line="240" w:lineRule="auto"/>
               <w:rPr>
-                <w:rFonts w:ascii="Tahoma" w:hAnsi="Tahoma" w:eastAsia="Tahoma" w:cs="Tahoma"/>
+                <w:rFonts w:ascii="Tahoma" w:eastAsia="Tahoma" w:hAnsi="Tahoma" w:cs="Tahoma"/>
                 <w:color w:val="000000"/>
                 <w:sz w:val="18"/>
                 <w:szCs w:val="18"/>
@@ -240,7 +253,7 @@
             </w:pPr>
             <w:r>
               <w:rPr>
-                <w:rFonts w:ascii="Tahoma" w:hAnsi="Tahoma" w:eastAsia="Tahoma" w:cs="Tahoma"/>
+                <w:rFonts w:ascii="Tahoma" w:eastAsia="Tahoma" w:hAnsi="Tahoma" w:cs="Tahoma"/>
                 <w:color w:val="000000"/>
                 <w:sz w:val="18"/>
                 <w:szCs w:val="18"/>
@@ -259,14 +272,13 @@
               <w:bottom w:val="nil"/>
               <w:right w:val="nil"/>
             </w:tcBorders>
-            <w:shd w:val="clear" w:color="auto" w:fill="auto"/>
             <w:vAlign w:val="center"/>
           </w:tcPr>
-          <w:p wp14:textId="77777777">
+          <w:p>
             <w:pPr>
               <w:spacing w:after="0" w:line="240" w:lineRule="auto"/>
               <w:rPr>
-                <w:rFonts w:ascii="Tahoma" w:hAnsi="Tahoma" w:eastAsia="Tahoma" w:cs="Tahoma"/>
+                <w:rFonts w:ascii="Tahoma" w:eastAsia="Tahoma" w:hAnsi="Tahoma" w:cs="Tahoma"/>
                 <w:color w:val="000000"/>
                 <w:sz w:val="18"/>
                 <w:szCs w:val="18"/>
@@ -274,18 +286,37 @@
             </w:pPr>
             <w:r>
               <w:rPr>
-                <w:rFonts w:ascii="Tahoma" w:hAnsi="Tahoma" w:eastAsia="Tahoma" w:cs="Tahoma"/>
-                <w:sz w:val="18"/>
-                <w:szCs w:val="18"/>
-              </w:rPr>
-              <w:t>{tipo_fruta}</w:t>
+                <w:rFonts w:ascii="Tahoma" w:eastAsia="Tahoma" w:hAnsi="Tahoma" w:cs="Tahoma"/>
+                <w:sz w:val="18"/>
+                <w:szCs w:val="18"/>
+              </w:rPr>
+              <w:t>{</w:t>
+            </w:r>
+            <w:proofErr w:type="spellStart"/>
+            <w:r>
+              <w:rPr>
+                <w:rFonts w:ascii="Tahoma" w:eastAsia="Tahoma" w:hAnsi="Tahoma" w:cs="Tahoma"/>
+                <w:sz w:val="18"/>
+                <w:szCs w:val="18"/>
+              </w:rPr>
+              <w:t>tipo_fruta</w:t>
+            </w:r>
+            <w:proofErr w:type="spellEnd"/>
+            <w:r>
+              <w:rPr>
+                <w:rFonts w:ascii="Tahoma" w:eastAsia="Tahoma" w:hAnsi="Tahoma" w:cs="Tahoma"/>
+                <w:sz w:val="18"/>
+                <w:szCs w:val="18"/>
+              </w:rPr>
+              <w:t>}</w:t>
             </w:r>
           </w:p>
         </w:tc>
       </w:tr>
-      <w:tr xmlns:wp14="http://schemas.microsoft.com/office/word/2010/wordml" wp14:textId="77777777">
+      <w:tr>
         <w:trPr>
           <w:gridAfter w:val="1"/>
+          <w:wAfter w:w="567" w:type="dxa"/>
           <w:trHeight w:val="288"/>
         </w:trPr>
         <w:tc>
@@ -297,24 +328,23 @@
               <w:bottom w:val="nil"/>
               <w:right w:val="nil"/>
             </w:tcBorders>
-            <w:shd w:val="clear" w:color="auto" w:fill="auto"/>
             <w:vAlign w:val="center"/>
           </w:tcPr>
-          <w:p wp14:textId="77777777">
+          <w:p>
             <w:pPr>
               <w:spacing w:after="0" w:line="240" w:lineRule="auto"/>
               <w:rPr>
-                <w:rFonts w:ascii="Tahoma" w:hAnsi="Tahoma" w:eastAsia="Tahoma" w:cs="Tahoma"/>
+                <w:rFonts w:ascii="Tahoma" w:eastAsia="Tahoma" w:hAnsi="Tahoma" w:cs="Tahoma"/>
                 <w:color w:val="000000"/>
                 <w:sz w:val="18"/>
                 <w:szCs w:val="18"/>
               </w:rPr>
             </w:pPr>
-            <w:bookmarkStart w:name="bookmark=id.gjdgxs" w:colFirst="0" w:colLast="0" w:id="0"/>
+            <w:bookmarkStart w:id="0" w:name="bookmark=id.gjdgxs" w:colFirst="0" w:colLast="0"/>
             <w:bookmarkEnd w:id="0"/>
             <w:r>
               <w:rPr>
-                <w:rFonts w:ascii="Tahoma" w:hAnsi="Tahoma" w:eastAsia="Tahoma" w:cs="Tahoma"/>
+                <w:rFonts w:ascii="Tahoma" w:eastAsia="Tahoma" w:hAnsi="Tahoma" w:cs="Tahoma"/>
                 <w:color w:val="000000"/>
                 <w:sz w:val="18"/>
                 <w:szCs w:val="18"/>
@@ -333,14 +363,13 @@
               <w:bottom w:val="nil"/>
               <w:right w:val="nil"/>
             </w:tcBorders>
-            <w:shd w:val="clear" w:color="auto" w:fill="auto"/>
             <w:vAlign w:val="center"/>
           </w:tcPr>
-          <w:p wp14:textId="77777777">
+          <w:p>
             <w:pPr>
               <w:spacing w:after="0" w:line="240" w:lineRule="auto"/>
               <w:rPr>
-                <w:rFonts w:ascii="Tahoma" w:hAnsi="Tahoma" w:eastAsia="Tahoma" w:cs="Tahoma"/>
+                <w:rFonts w:ascii="Tahoma" w:eastAsia="Tahoma" w:hAnsi="Tahoma" w:cs="Tahoma"/>
                 <w:color w:val="000000"/>
                 <w:sz w:val="18"/>
                 <w:szCs w:val="18"/>
@@ -348,7 +377,7 @@
             </w:pPr>
             <w:r>
               <w:rPr>
-                <w:rFonts w:ascii="Tahoma" w:hAnsi="Tahoma" w:eastAsia="Tahoma" w:cs="Tahoma"/>
+                <w:rFonts w:ascii="Tahoma" w:eastAsia="Tahoma" w:hAnsi="Tahoma" w:cs="Tahoma"/>
                 <w:sz w:val="18"/>
                 <w:szCs w:val="18"/>
               </w:rPr>
@@ -357,9 +386,10 @@
           </w:p>
         </w:tc>
       </w:tr>
-      <w:tr xmlns:wp14="http://schemas.microsoft.com/office/word/2010/wordml" wp14:textId="77777777">
+      <w:tr>
         <w:trPr>
           <w:gridAfter w:val="1"/>
+          <w:wAfter w:w="567" w:type="dxa"/>
           <w:trHeight w:val="166"/>
         </w:trPr>
         <w:tc>
@@ -371,14 +401,13 @@
               <w:bottom w:val="nil"/>
               <w:right w:val="nil"/>
             </w:tcBorders>
-            <w:shd w:val="clear" w:color="auto" w:fill="auto"/>
             <w:vAlign w:val="center"/>
           </w:tcPr>
-          <w:p wp14:textId="77777777">
+          <w:p>
             <w:pPr>
               <w:spacing w:after="0" w:line="240" w:lineRule="auto"/>
               <w:rPr>
-                <w:rFonts w:ascii="Tahoma" w:hAnsi="Tahoma" w:eastAsia="Tahoma" w:cs="Tahoma"/>
+                <w:rFonts w:ascii="Tahoma" w:eastAsia="Tahoma" w:hAnsi="Tahoma" w:cs="Tahoma"/>
                 <w:color w:val="000000"/>
                 <w:sz w:val="18"/>
                 <w:szCs w:val="18"/>
@@ -386,7 +415,7 @@
             </w:pPr>
             <w:r>
               <w:rPr>
-                <w:rFonts w:ascii="Tahoma" w:hAnsi="Tahoma" w:eastAsia="Tahoma" w:cs="Tahoma"/>
+                <w:rFonts w:ascii="Tahoma" w:eastAsia="Tahoma" w:hAnsi="Tahoma" w:cs="Tahoma"/>
                 <w:color w:val="000000"/>
                 <w:sz w:val="18"/>
                 <w:szCs w:val="18"/>
@@ -405,14 +434,13 @@
               <w:bottom w:val="nil"/>
               <w:right w:val="nil"/>
             </w:tcBorders>
-            <w:shd w:val="clear" w:color="auto" w:fill="auto"/>
             <w:vAlign w:val="center"/>
           </w:tcPr>
-          <w:p wp14:textId="77777777">
+          <w:p>
             <w:pPr>
               <w:spacing w:after="0" w:line="240" w:lineRule="auto"/>
               <w:rPr>
-                <w:rFonts w:ascii="Tahoma" w:hAnsi="Tahoma" w:eastAsia="Tahoma" w:cs="Tahoma"/>
+                <w:rFonts w:ascii="Tahoma" w:eastAsia="Tahoma" w:hAnsi="Tahoma" w:cs="Tahoma"/>
                 <w:color w:val="000000"/>
                 <w:sz w:val="18"/>
                 <w:szCs w:val="18"/>
@@ -420,7 +448,7 @@
             </w:pPr>
             <w:r>
               <w:rPr>
-                <w:rFonts w:ascii="Tahoma" w:hAnsi="Tahoma" w:eastAsia="Tahoma" w:cs="Tahoma"/>
+                <w:rFonts w:ascii="Tahoma" w:eastAsia="Tahoma" w:hAnsi="Tahoma" w:cs="Tahoma"/>
                 <w:sz w:val="18"/>
                 <w:szCs w:val="18"/>
               </w:rPr>
@@ -429,9 +457,10 @@
           </w:p>
         </w:tc>
       </w:tr>
-      <w:tr xmlns:wp14="http://schemas.microsoft.com/office/word/2010/wordml" wp14:textId="77777777">
+      <w:tr>
         <w:trPr>
           <w:gridAfter w:val="1"/>
+          <w:wAfter w:w="567" w:type="dxa"/>
           <w:trHeight w:val="288"/>
         </w:trPr>
         <w:tc>
@@ -443,14 +472,13 @@
               <w:bottom w:val="nil"/>
               <w:right w:val="nil"/>
             </w:tcBorders>
-            <w:shd w:val="clear" w:color="auto" w:fill="auto"/>
             <w:vAlign w:val="center"/>
           </w:tcPr>
-          <w:p wp14:textId="77777777">
+          <w:p>
             <w:pPr>
               <w:spacing w:after="0" w:line="240" w:lineRule="auto"/>
               <w:rPr>
-                <w:rFonts w:ascii="Tahoma" w:hAnsi="Tahoma" w:eastAsia="Tahoma" w:cs="Tahoma"/>
+                <w:rFonts w:ascii="Tahoma" w:eastAsia="Tahoma" w:hAnsi="Tahoma" w:cs="Tahoma"/>
                 <w:color w:val="000000"/>
                 <w:sz w:val="18"/>
                 <w:szCs w:val="18"/>
@@ -458,7 +486,7 @@
             </w:pPr>
             <w:r>
               <w:rPr>
-                <w:rFonts w:ascii="Tahoma" w:hAnsi="Tahoma" w:eastAsia="Tahoma" w:cs="Tahoma"/>
+                <w:rFonts w:ascii="Tahoma" w:eastAsia="Tahoma" w:hAnsi="Tahoma" w:cs="Tahoma"/>
                 <w:color w:val="000000"/>
                 <w:sz w:val="18"/>
                 <w:szCs w:val="18"/>
@@ -477,14 +505,13 @@
               <w:bottom w:val="nil"/>
               <w:right w:val="nil"/>
             </w:tcBorders>
-            <w:shd w:val="clear" w:color="auto" w:fill="auto"/>
             <w:vAlign w:val="center"/>
           </w:tcPr>
-          <w:p wp14:textId="77777777">
+          <w:p>
             <w:pPr>
               <w:spacing w:after="0" w:line="240" w:lineRule="auto"/>
               <w:rPr>
-                <w:rFonts w:ascii="Tahoma" w:hAnsi="Tahoma" w:eastAsia="Tahoma" w:cs="Tahoma"/>
+                <w:rFonts w:ascii="Tahoma" w:eastAsia="Tahoma" w:hAnsi="Tahoma" w:cs="Tahoma"/>
                 <w:color w:val="000000"/>
                 <w:sz w:val="18"/>
                 <w:szCs w:val="18"/>
@@ -492,18 +519,37 @@
             </w:pPr>
             <w:r>
               <w:rPr>
-                <w:rFonts w:ascii="Tahoma" w:hAnsi="Tahoma" w:eastAsia="Tahoma" w:cs="Tahoma"/>
-                <w:sz w:val="18"/>
-                <w:szCs w:val="18"/>
-              </w:rPr>
-              <w:t>{trailer}</w:t>
+                <w:rFonts w:ascii="Tahoma" w:eastAsia="Tahoma" w:hAnsi="Tahoma" w:cs="Tahoma"/>
+                <w:sz w:val="18"/>
+                <w:szCs w:val="18"/>
+              </w:rPr>
+              <w:t>{</w:t>
+            </w:r>
+            <w:proofErr w:type="spellStart"/>
+            <w:r>
+              <w:rPr>
+                <w:rFonts w:ascii="Tahoma" w:eastAsia="Tahoma" w:hAnsi="Tahoma" w:cs="Tahoma"/>
+                <w:sz w:val="18"/>
+                <w:szCs w:val="18"/>
+              </w:rPr>
+              <w:t>trailer</w:t>
+            </w:r>
+            <w:proofErr w:type="spellEnd"/>
+            <w:r>
+              <w:rPr>
+                <w:rFonts w:ascii="Tahoma" w:eastAsia="Tahoma" w:hAnsi="Tahoma" w:cs="Tahoma"/>
+                <w:sz w:val="18"/>
+                <w:szCs w:val="18"/>
+              </w:rPr>
+              <w:t>}</w:t>
             </w:r>
           </w:p>
         </w:tc>
       </w:tr>
-      <w:tr xmlns:wp14="http://schemas.microsoft.com/office/word/2010/wordml" wp14:textId="77777777">
+      <w:tr>
         <w:trPr>
           <w:gridAfter w:val="1"/>
+          <w:wAfter w:w="567" w:type="dxa"/>
           <w:trHeight w:val="288"/>
         </w:trPr>
         <w:tc>
@@ -515,14 +561,13 @@
               <w:bottom w:val="nil"/>
               <w:right w:val="nil"/>
             </w:tcBorders>
-            <w:shd w:val="clear" w:color="auto" w:fill="auto"/>
             <w:vAlign w:val="center"/>
           </w:tcPr>
-          <w:p wp14:textId="77777777">
+          <w:p>
             <w:pPr>
               <w:spacing w:after="0" w:line="240" w:lineRule="auto"/>
               <w:rPr>
-                <w:rFonts w:ascii="Tahoma" w:hAnsi="Tahoma" w:eastAsia="Tahoma" w:cs="Tahoma"/>
+                <w:rFonts w:ascii="Tahoma" w:eastAsia="Tahoma" w:hAnsi="Tahoma" w:cs="Tahoma"/>
                 <w:color w:val="000000"/>
                 <w:sz w:val="18"/>
                 <w:szCs w:val="18"/>
@@ -530,7 +575,7 @@
             </w:pPr>
             <w:r>
               <w:rPr>
-                <w:rFonts w:ascii="Tahoma" w:hAnsi="Tahoma" w:eastAsia="Tahoma" w:cs="Tahoma"/>
+                <w:rFonts w:ascii="Tahoma" w:eastAsia="Tahoma" w:hAnsi="Tahoma" w:cs="Tahoma"/>
                 <w:color w:val="000000"/>
                 <w:sz w:val="18"/>
                 <w:szCs w:val="18"/>
@@ -549,14 +594,13 @@
               <w:bottom w:val="nil"/>
               <w:right w:val="nil"/>
             </w:tcBorders>
-            <w:shd w:val="clear" w:color="auto" w:fill="auto"/>
             <w:vAlign w:val="center"/>
           </w:tcPr>
-          <w:p wp14:textId="77777777">
+          <w:p>
             <w:pPr>
               <w:spacing w:after="0" w:line="240" w:lineRule="auto"/>
               <w:rPr>
-                <w:rFonts w:ascii="Tahoma" w:hAnsi="Tahoma" w:eastAsia="Tahoma" w:cs="Tahoma"/>
+                <w:rFonts w:ascii="Tahoma" w:eastAsia="Tahoma" w:hAnsi="Tahoma" w:cs="Tahoma"/>
                 <w:color w:val="000000"/>
                 <w:sz w:val="18"/>
                 <w:szCs w:val="18"/>
@@ -564,7 +608,7 @@
             </w:pPr>
             <w:r>
               <w:rPr>
-                <w:rFonts w:ascii="Tahoma" w:hAnsi="Tahoma" w:eastAsia="Tahoma" w:cs="Tahoma"/>
+                <w:rFonts w:ascii="Tahoma" w:eastAsia="Tahoma" w:hAnsi="Tahoma" w:cs="Tahoma"/>
                 <w:sz w:val="18"/>
                 <w:szCs w:val="18"/>
               </w:rPr>
@@ -573,9 +617,10 @@
           </w:p>
         </w:tc>
       </w:tr>
-      <w:tr xmlns:wp14="http://schemas.microsoft.com/office/word/2010/wordml" wp14:textId="77777777">
+      <w:tr>
         <w:trPr>
           <w:gridAfter w:val="1"/>
+          <w:wAfter w:w="567" w:type="dxa"/>
           <w:trHeight w:val="288"/>
         </w:trPr>
         <w:tc>
@@ -587,14 +632,13 @@
               <w:bottom w:val="nil"/>
               <w:right w:val="nil"/>
             </w:tcBorders>
-            <w:shd w:val="clear" w:color="auto" w:fill="auto"/>
             <w:vAlign w:val="center"/>
           </w:tcPr>
-          <w:p wp14:textId="77777777">
+          <w:p>
             <w:pPr>
               <w:spacing w:after="0" w:line="240" w:lineRule="auto"/>
               <w:rPr>
-                <w:rFonts w:ascii="Tahoma" w:hAnsi="Tahoma" w:eastAsia="Tahoma" w:cs="Tahoma"/>
+                <w:rFonts w:ascii="Tahoma" w:eastAsia="Tahoma" w:hAnsi="Tahoma" w:cs="Tahoma"/>
                 <w:color w:val="000000"/>
                 <w:sz w:val="18"/>
                 <w:szCs w:val="18"/>
@@ -602,7 +646,7 @@
             </w:pPr>
             <w:r>
               <w:rPr>
-                <w:rFonts w:ascii="Tahoma" w:hAnsi="Tahoma" w:eastAsia="Tahoma" w:cs="Tahoma"/>
+                <w:rFonts w:ascii="Tahoma" w:eastAsia="Tahoma" w:hAnsi="Tahoma" w:cs="Tahoma"/>
                 <w:color w:val="000000"/>
                 <w:sz w:val="18"/>
                 <w:szCs w:val="18"/>
@@ -621,14 +665,13 @@
               <w:bottom w:val="nil"/>
               <w:right w:val="nil"/>
             </w:tcBorders>
-            <w:shd w:val="clear" w:color="auto" w:fill="auto"/>
             <w:vAlign w:val="center"/>
           </w:tcPr>
-          <w:p wp14:textId="77777777">
+          <w:p>
             <w:pPr>
               <w:spacing w:after="0" w:line="240" w:lineRule="auto"/>
               <w:rPr>
-                <w:rFonts w:ascii="Tahoma" w:hAnsi="Tahoma" w:eastAsia="Tahoma" w:cs="Tahoma"/>
+                <w:rFonts w:ascii="Tahoma" w:eastAsia="Tahoma" w:hAnsi="Tahoma" w:cs="Tahoma"/>
                 <w:color w:val="000000"/>
                 <w:sz w:val="18"/>
                 <w:szCs w:val="18"/>
@@ -636,7 +679,7 @@
             </w:pPr>
             <w:r>
               <w:rPr>
-                <w:rFonts w:ascii="Tahoma" w:hAnsi="Tahoma" w:eastAsia="Tahoma" w:cs="Tahoma"/>
+                <w:rFonts w:ascii="Tahoma" w:eastAsia="Tahoma" w:hAnsi="Tahoma" w:cs="Tahoma"/>
                 <w:color w:val="000000"/>
                 <w:sz w:val="18"/>
                 <w:szCs w:val="18"/>
@@ -646,9 +689,10 @@
           </w:p>
         </w:tc>
       </w:tr>
-      <w:tr xmlns:wp14="http://schemas.microsoft.com/office/word/2010/wordml" wp14:textId="77777777">
+      <w:tr>
         <w:trPr>
           <w:gridAfter w:val="1"/>
+          <w:wAfter w:w="567" w:type="dxa"/>
           <w:trHeight w:val="300"/>
         </w:trPr>
         <w:tc>
@@ -660,14 +704,13 @@
               <w:bottom w:val="nil"/>
               <w:right w:val="nil"/>
             </w:tcBorders>
-            <w:shd w:val="clear" w:color="auto" w:fill="auto"/>
             <w:vAlign w:val="center"/>
           </w:tcPr>
-          <w:p wp14:textId="77777777">
+          <w:p>
             <w:pPr>
               <w:spacing w:after="0" w:line="240" w:lineRule="auto"/>
               <w:rPr>
-                <w:rFonts w:ascii="Tahoma" w:hAnsi="Tahoma" w:eastAsia="Tahoma" w:cs="Tahoma"/>
+                <w:rFonts w:ascii="Tahoma" w:eastAsia="Tahoma" w:hAnsi="Tahoma" w:cs="Tahoma"/>
                 <w:color w:val="000000"/>
                 <w:sz w:val="18"/>
                 <w:szCs w:val="18"/>
@@ -675,7 +718,7 @@
             </w:pPr>
             <w:r>
               <w:rPr>
-                <w:rFonts w:ascii="Tahoma" w:hAnsi="Tahoma" w:eastAsia="Tahoma" w:cs="Tahoma"/>
+                <w:rFonts w:ascii="Tahoma" w:eastAsia="Tahoma" w:hAnsi="Tahoma" w:cs="Tahoma"/>
                 <w:color w:val="000000"/>
                 <w:sz w:val="18"/>
                 <w:szCs w:val="18"/>
@@ -694,14 +737,13 @@
               <w:bottom w:val="nil"/>
               <w:right w:val="nil"/>
             </w:tcBorders>
-            <w:shd w:val="clear" w:color="auto" w:fill="auto"/>
             <w:vAlign w:val="center"/>
           </w:tcPr>
-          <w:p wp14:textId="77777777">
+          <w:p>
             <w:pPr>
               <w:spacing w:after="0" w:line="240" w:lineRule="auto"/>
               <w:rPr>
-                <w:rFonts w:ascii="Tahoma" w:hAnsi="Tahoma" w:eastAsia="Tahoma" w:cs="Tahoma"/>
+                <w:rFonts w:ascii="Tahoma" w:eastAsia="Tahoma" w:hAnsi="Tahoma" w:cs="Tahoma"/>
                 <w:color w:val="000000"/>
                 <w:sz w:val="18"/>
                 <w:szCs w:val="18"/>
@@ -709,15 +751,33 @@
             </w:pPr>
             <w:r>
               <w:rPr>
-                <w:rFonts w:ascii="Tahoma" w:hAnsi="Tahoma" w:eastAsia="Tahoma" w:cs="Tahoma"/>
-                <w:sz w:val="18"/>
-                <w:szCs w:val="18"/>
-              </w:rPr>
-              <w:t>{total_cajas}</w:t>
+                <w:rFonts w:ascii="Tahoma" w:eastAsia="Tahoma" w:hAnsi="Tahoma" w:cs="Tahoma"/>
+                <w:sz w:val="18"/>
+                <w:szCs w:val="18"/>
+              </w:rPr>
+              <w:t>{</w:t>
+            </w:r>
+            <w:proofErr w:type="spellStart"/>
+            <w:r>
+              <w:rPr>
+                <w:rFonts w:ascii="Tahoma" w:eastAsia="Tahoma" w:hAnsi="Tahoma" w:cs="Tahoma"/>
+                <w:sz w:val="18"/>
+                <w:szCs w:val="18"/>
+              </w:rPr>
+              <w:t>total_cajas</w:t>
+            </w:r>
+            <w:proofErr w:type="spellEnd"/>
+            <w:r>
+              <w:rPr>
+                <w:rFonts w:ascii="Tahoma" w:eastAsia="Tahoma" w:hAnsi="Tahoma" w:cs="Tahoma"/>
+                <w:sz w:val="18"/>
+                <w:szCs w:val="18"/>
+              </w:rPr>
+              <w:t>}</w:t>
             </w:r>
             <w:r>
               <w:rPr>
-                <w:rFonts w:ascii="Tahoma" w:hAnsi="Tahoma" w:eastAsia="Tahoma" w:cs="Tahoma"/>
+                <w:rFonts w:ascii="Tahoma" w:eastAsia="Tahoma" w:hAnsi="Tahoma" w:cs="Tahoma"/>
                 <w:color w:val="000000"/>
                 <w:sz w:val="18"/>
                 <w:szCs w:val="18"/>
@@ -727,9 +787,10 @@
           </w:p>
         </w:tc>
       </w:tr>
-      <w:tr xmlns:wp14="http://schemas.microsoft.com/office/word/2010/wordml" wp14:textId="77777777">
+      <w:tr>
         <w:trPr>
           <w:gridAfter w:val="1"/>
+          <w:wAfter w:w="567" w:type="dxa"/>
           <w:trHeight w:val="300"/>
         </w:trPr>
         <w:tc>
@@ -741,14 +802,13 @@
               <w:bottom w:val="nil"/>
               <w:right w:val="nil"/>
             </w:tcBorders>
-            <w:shd w:val="clear" w:color="auto" w:fill="auto"/>
             <w:vAlign w:val="center"/>
           </w:tcPr>
-          <w:p wp14:textId="77777777">
+          <w:p>
             <w:pPr>
               <w:spacing w:after="0" w:line="240" w:lineRule="auto"/>
               <w:rPr>
-                <w:rFonts w:ascii="Tahoma" w:hAnsi="Tahoma" w:eastAsia="Tahoma" w:cs="Tahoma"/>
+                <w:rFonts w:ascii="Tahoma" w:eastAsia="Tahoma" w:hAnsi="Tahoma" w:cs="Tahoma"/>
                 <w:color w:val="000000"/>
                 <w:sz w:val="18"/>
                 <w:szCs w:val="18"/>
@@ -756,7 +816,7 @@
             </w:pPr>
             <w:r>
               <w:rPr>
-                <w:rFonts w:ascii="Tahoma" w:hAnsi="Tahoma" w:eastAsia="Tahoma" w:cs="Tahoma"/>
+                <w:rFonts w:ascii="Tahoma" w:eastAsia="Tahoma" w:hAnsi="Tahoma" w:cs="Tahoma"/>
                 <w:color w:val="000000"/>
                 <w:sz w:val="18"/>
                 <w:szCs w:val="18"/>
@@ -775,14 +835,13 @@
               <w:bottom w:val="nil"/>
               <w:right w:val="nil"/>
             </w:tcBorders>
-            <w:shd w:val="clear" w:color="auto" w:fill="auto"/>
             <w:vAlign w:val="center"/>
           </w:tcPr>
-          <w:p wp14:textId="77777777">
+          <w:p>
             <w:pPr>
               <w:spacing w:after="0" w:line="240" w:lineRule="auto"/>
               <w:rPr>
-                <w:rFonts w:ascii="Tahoma" w:hAnsi="Tahoma" w:eastAsia="Tahoma" w:cs="Tahoma"/>
+                <w:rFonts w:ascii="Tahoma" w:eastAsia="Tahoma" w:hAnsi="Tahoma" w:cs="Tahoma"/>
                 <w:color w:val="000000"/>
                 <w:sz w:val="18"/>
                 <w:szCs w:val="18"/>
@@ -790,15 +849,33 @@
             </w:pPr>
             <w:r>
               <w:rPr>
-                <w:rFonts w:ascii="Tahoma" w:hAnsi="Tahoma" w:eastAsia="Tahoma" w:cs="Tahoma"/>
-                <w:sz w:val="18"/>
-                <w:szCs w:val="18"/>
-              </w:rPr>
-              <w:t>{total_cajas_net}</w:t>
+                <w:rFonts w:ascii="Tahoma" w:eastAsia="Tahoma" w:hAnsi="Tahoma" w:cs="Tahoma"/>
+                <w:sz w:val="18"/>
+                <w:szCs w:val="18"/>
+              </w:rPr>
+              <w:t>{</w:t>
+            </w:r>
+            <w:proofErr w:type="spellStart"/>
+            <w:r>
+              <w:rPr>
+                <w:rFonts w:ascii="Tahoma" w:eastAsia="Tahoma" w:hAnsi="Tahoma" w:cs="Tahoma"/>
+                <w:sz w:val="18"/>
+                <w:szCs w:val="18"/>
+              </w:rPr>
+              <w:t>total_cajas_net</w:t>
+            </w:r>
+            <w:proofErr w:type="spellEnd"/>
+            <w:r>
+              <w:rPr>
+                <w:rFonts w:ascii="Tahoma" w:eastAsia="Tahoma" w:hAnsi="Tahoma" w:cs="Tahoma"/>
+                <w:sz w:val="18"/>
+                <w:szCs w:val="18"/>
+              </w:rPr>
+              <w:t>}</w:t>
             </w:r>
             <w:r>
               <w:rPr>
-                <w:rFonts w:ascii="Tahoma" w:hAnsi="Tahoma" w:eastAsia="Tahoma" w:cs="Tahoma"/>
+                <w:rFonts w:ascii="Tahoma" w:eastAsia="Tahoma" w:hAnsi="Tahoma" w:cs="Tahoma"/>
                 <w:color w:val="000000"/>
                 <w:sz w:val="18"/>
                 <w:szCs w:val="18"/>
@@ -808,9 +885,10 @@
           </w:p>
         </w:tc>
       </w:tr>
-      <w:tr xmlns:wp14="http://schemas.microsoft.com/office/word/2010/wordml" wp14:textId="77777777">
+      <w:tr>
         <w:trPr>
           <w:gridAfter w:val="1"/>
+          <w:wAfter w:w="567" w:type="dxa"/>
           <w:trHeight w:val="300"/>
         </w:trPr>
         <w:tc>
@@ -822,14 +900,13 @@
               <w:bottom w:val="nil"/>
               <w:right w:val="nil"/>
             </w:tcBorders>
-            <w:shd w:val="clear" w:color="auto" w:fill="auto"/>
             <w:vAlign w:val="center"/>
           </w:tcPr>
-          <w:p wp14:textId="77777777">
+          <w:p>
             <w:pPr>
               <w:spacing w:after="0" w:line="240" w:lineRule="auto"/>
               <w:rPr>
-                <w:rFonts w:ascii="Tahoma" w:hAnsi="Tahoma" w:eastAsia="Tahoma" w:cs="Tahoma"/>
+                <w:rFonts w:ascii="Tahoma" w:eastAsia="Tahoma" w:hAnsi="Tahoma" w:cs="Tahoma"/>
                 <w:color w:val="000000"/>
                 <w:sz w:val="18"/>
                 <w:szCs w:val="18"/>
@@ -837,7 +914,7 @@
             </w:pPr>
             <w:r>
               <w:rPr>
-                <w:rFonts w:ascii="Tahoma" w:hAnsi="Tahoma" w:eastAsia="Tahoma" w:cs="Tahoma"/>
+                <w:rFonts w:ascii="Tahoma" w:eastAsia="Tahoma" w:hAnsi="Tahoma" w:cs="Tahoma"/>
                 <w:color w:val="000000"/>
                 <w:sz w:val="18"/>
                 <w:szCs w:val="18"/>
@@ -856,14 +933,13 @@
               <w:bottom w:val="nil"/>
               <w:right w:val="nil"/>
             </w:tcBorders>
-            <w:shd w:val="clear" w:color="auto" w:fill="auto"/>
             <w:vAlign w:val="center"/>
           </w:tcPr>
-          <w:p wp14:textId="77777777">
+          <w:p>
             <w:pPr>
               <w:spacing w:after="0" w:line="240" w:lineRule="auto"/>
               <w:rPr>
-                <w:rFonts w:ascii="Tahoma" w:hAnsi="Tahoma" w:eastAsia="Tahoma" w:cs="Tahoma"/>
+                <w:rFonts w:ascii="Tahoma" w:eastAsia="Tahoma" w:hAnsi="Tahoma" w:cs="Tahoma"/>
                 <w:color w:val="000000"/>
                 <w:sz w:val="18"/>
                 <w:szCs w:val="18"/>
@@ -871,7 +947,7 @@
             </w:pPr>
             <w:r>
               <w:rPr>
-                <w:rFonts w:ascii="Tahoma" w:hAnsi="Tahoma" w:eastAsia="Tahoma" w:cs="Tahoma"/>
+                <w:rFonts w:ascii="Tahoma" w:eastAsia="Tahoma" w:hAnsi="Tahoma" w:cs="Tahoma"/>
                 <w:color w:val="000000"/>
                 <w:sz w:val="18"/>
                 <w:szCs w:val="18"/>
@@ -881,9 +957,10 @@
           </w:p>
         </w:tc>
       </w:tr>
-      <w:tr xmlns:wp14="http://schemas.microsoft.com/office/word/2010/wordml" wp14:textId="77777777">
+      <w:tr>
         <w:trPr>
           <w:gridAfter w:val="1"/>
+          <w:wAfter w:w="567" w:type="dxa"/>
           <w:trHeight w:val="288"/>
         </w:trPr>
         <w:tc>
@@ -895,14 +972,13 @@
               <w:bottom w:val="nil"/>
               <w:right w:val="nil"/>
             </w:tcBorders>
-            <w:shd w:val="clear" w:color="auto" w:fill="auto"/>
             <w:vAlign w:val="center"/>
           </w:tcPr>
-          <w:p wp14:textId="77777777">
+          <w:p>
             <w:pPr>
               <w:spacing w:after="0" w:line="240" w:lineRule="auto"/>
               <w:rPr>
-                <w:rFonts w:ascii="Tahoma" w:hAnsi="Tahoma" w:eastAsia="Tahoma" w:cs="Tahoma"/>
+                <w:rFonts w:ascii="Tahoma" w:eastAsia="Tahoma" w:hAnsi="Tahoma" w:cs="Tahoma"/>
                 <w:color w:val="000000"/>
                 <w:sz w:val="18"/>
                 <w:szCs w:val="18"/>
@@ -910,7 +986,7 @@
             </w:pPr>
             <w:r>
               <w:rPr>
-                <w:rFonts w:ascii="Tahoma" w:hAnsi="Tahoma" w:eastAsia="Tahoma" w:cs="Tahoma"/>
+                <w:rFonts w:ascii="Tahoma" w:eastAsia="Tahoma" w:hAnsi="Tahoma" w:cs="Tahoma"/>
                 <w:color w:val="000000"/>
                 <w:sz w:val="18"/>
                 <w:szCs w:val="18"/>
@@ -929,14 +1005,13 @@
               <w:bottom w:val="nil"/>
               <w:right w:val="nil"/>
             </w:tcBorders>
-            <w:shd w:val="clear" w:color="auto" w:fill="auto"/>
             <w:vAlign w:val="center"/>
           </w:tcPr>
-          <w:p wp14:textId="77777777">
+          <w:p>
             <w:pPr>
               <w:spacing w:after="0" w:line="240" w:lineRule="auto"/>
               <w:rPr>
-                <w:rFonts w:ascii="Tahoma" w:hAnsi="Tahoma" w:eastAsia="Tahoma" w:cs="Tahoma"/>
+                <w:rFonts w:ascii="Tahoma" w:eastAsia="Tahoma" w:hAnsi="Tahoma" w:cs="Tahoma"/>
                 <w:color w:val="000000"/>
                 <w:sz w:val="18"/>
                 <w:szCs w:val="18"/>
@@ -944,7 +1019,7 @@
             </w:pPr>
             <w:r>
               <w:rPr>
-                <w:rFonts w:ascii="Tahoma" w:hAnsi="Tahoma" w:eastAsia="Tahoma" w:cs="Tahoma"/>
+                <w:rFonts w:ascii="Tahoma" w:eastAsia="Tahoma" w:hAnsi="Tahoma" w:cs="Tahoma"/>
                 <w:sz w:val="18"/>
                 <w:szCs w:val="18"/>
               </w:rPr>
@@ -952,7 +1027,7 @@
             </w:r>
             <w:r>
               <w:rPr>
-                <w:rFonts w:ascii="Tahoma" w:hAnsi="Tahoma" w:eastAsia="Tahoma" w:cs="Tahoma"/>
+                <w:rFonts w:ascii="Tahoma" w:eastAsia="Tahoma" w:hAnsi="Tahoma" w:cs="Tahoma"/>
                 <w:color w:val="000000"/>
                 <w:sz w:val="18"/>
                 <w:szCs w:val="18"/>
@@ -962,7 +1037,7 @@
           </w:p>
         </w:tc>
       </w:tr>
-      <w:tr xmlns:wp14="http://schemas.microsoft.com/office/word/2010/wordml" wp14:textId="77777777">
+      <w:tr>
         <w:trPr>
           <w:trHeight w:val="288"/>
         </w:trPr>
@@ -976,14 +1051,13 @@
               <w:bottom w:val="nil"/>
               <w:right w:val="nil"/>
             </w:tcBorders>
-            <w:shd w:val="clear" w:color="auto" w:fill="auto"/>
             <w:vAlign w:val="center"/>
           </w:tcPr>
-          <w:p wp14:textId="77777777">
+          <w:p>
             <w:pPr>
               <w:spacing w:after="0" w:line="240" w:lineRule="auto"/>
               <w:rPr>
-                <w:rFonts w:ascii="Tahoma" w:hAnsi="Tahoma" w:eastAsia="Tahoma" w:cs="Tahoma"/>
+                <w:rFonts w:ascii="Tahoma" w:eastAsia="Tahoma" w:hAnsi="Tahoma" w:cs="Tahoma"/>
                 <w:sz w:val="24"/>
                 <w:szCs w:val="24"/>
               </w:rPr>
@@ -1000,14 +1074,13 @@
               <w:bottom w:val="nil"/>
               <w:right w:val="nil"/>
             </w:tcBorders>
-            <w:shd w:val="clear" w:color="auto" w:fill="auto"/>
             <w:vAlign w:val="center"/>
           </w:tcPr>
-          <w:p wp14:textId="77777777">
+          <w:p>
             <w:pPr>
               <w:spacing w:after="0" w:line="240" w:lineRule="auto"/>
               <w:rPr>
-                <w:rFonts w:ascii="Tahoma" w:hAnsi="Tahoma" w:eastAsia="Tahoma" w:cs="Tahoma"/>
+                <w:rFonts w:ascii="Tahoma" w:eastAsia="Tahoma" w:hAnsi="Tahoma" w:cs="Tahoma"/>
                 <w:sz w:val="24"/>
                 <w:szCs w:val="24"/>
               </w:rPr>
@@ -1016,37 +1089,37 @@
         </w:tc>
       </w:tr>
     </w:tbl>
-    <w:p xmlns:wp14="http://schemas.microsoft.com/office/word/2010/wordml" wp14:textId="77777777">
+    <w:p>
       <w:pPr>
         <w:spacing w:after="0" w:line="240" w:lineRule="auto"/>
         <w:jc w:val="both"/>
         <w:rPr>
-          <w:rFonts w:ascii="Tahoma" w:hAnsi="Tahoma" w:eastAsia="Tahoma" w:cs="Tahoma"/>
-          <w:sz w:val="24"/>
-          <w:szCs w:val="24"/>
-        </w:rPr>
-      </w:pPr>
-      <w:r>
-        <w:rPr>
-          <w:rFonts w:ascii="Tahoma" w:hAnsi="Tahoma" w:eastAsia="Tahoma" w:cs="Tahoma"/>
+          <w:rFonts w:ascii="Tahoma" w:eastAsia="Tahoma" w:hAnsi="Tahoma" w:cs="Tahoma"/>
+          <w:sz w:val="24"/>
+          <w:szCs w:val="24"/>
+        </w:rPr>
+      </w:pPr>
+      <w:r>
+        <w:rPr>
+          <w:rFonts w:ascii="Tahoma" w:eastAsia="Tahoma" w:hAnsi="Tahoma" w:cs="Tahoma"/>
           <w:sz w:val="24"/>
           <w:szCs w:val="24"/>
         </w:rPr>
         <w:t>De igual manera se INFORMA que los procesos de preparación, embalaje y cargue de la fruta se realizaron bajo los estándares de calidad exigidos por la autoridad competente (ICA); por lo tanto, la carga se entrega en PERFECTAS CONDICIONES con un Sistema De Monitoreo De Temperatura que graba la temperatura compacta, instalado en el pallet N°10. En consecuencia, el transportador de la mercancía será responsable de:</w:t>
       </w:r>
     </w:p>
-    <w:p xmlns:wp14="http://schemas.microsoft.com/office/word/2010/wordml" wp14:textId="77777777">
+    <w:p>
       <w:pPr>
         <w:spacing w:after="0" w:line="240" w:lineRule="auto"/>
         <w:jc w:val="both"/>
         <w:rPr>
-          <w:rFonts w:ascii="Tahoma" w:hAnsi="Tahoma" w:eastAsia="Tahoma" w:cs="Tahoma"/>
+          <w:rFonts w:ascii="Tahoma" w:eastAsia="Tahoma" w:hAnsi="Tahoma" w:cs="Tahoma"/>
           <w:sz w:val="24"/>
           <w:szCs w:val="24"/>
         </w:rPr>
       </w:pPr>
     </w:p>
-    <w:p xmlns:wp14="http://schemas.microsoft.com/office/word/2010/wordml" wp14:textId="77777777">
+    <w:p>
       <w:pPr>
         <w:numPr>
           <w:ilvl w:val="0"/>
@@ -1062,7 +1135,7 @@
         <w:spacing w:after="0" w:line="240" w:lineRule="auto"/>
         <w:jc w:val="both"/>
         <w:rPr>
-          <w:rFonts w:ascii="Tahoma" w:hAnsi="Tahoma" w:eastAsia="Tahoma" w:cs="Tahoma"/>
+          <w:rFonts w:ascii="Tahoma" w:eastAsia="Tahoma" w:hAnsi="Tahoma" w:cs="Tahoma"/>
           <w:color w:val="000000"/>
           <w:sz w:val="24"/>
           <w:szCs w:val="24"/>
@@ -1070,7 +1143,7 @@
       </w:pPr>
       <w:r>
         <w:rPr>
-          <w:rFonts w:ascii="Tahoma" w:hAnsi="Tahoma" w:eastAsia="Tahoma" w:cs="Tahoma"/>
+          <w:rFonts w:ascii="Tahoma" w:eastAsia="Tahoma" w:hAnsi="Tahoma" w:cs="Tahoma"/>
           <w:color w:val="000000"/>
           <w:sz w:val="24"/>
           <w:szCs w:val="24"/>
@@ -1078,7 +1151,7 @@
         <w:t>Mantener constante la temperatura durante todo el recorrido.</w:t>
       </w:r>
     </w:p>
-    <w:p xmlns:wp14="http://schemas.microsoft.com/office/word/2010/wordml" wp14:textId="77777777">
+    <w:p>
       <w:pPr>
         <w:numPr>
           <w:ilvl w:val="0"/>
@@ -1094,7 +1167,7 @@
         <w:spacing w:after="0" w:line="240" w:lineRule="auto"/>
         <w:jc w:val="both"/>
         <w:rPr>
-          <w:rFonts w:ascii="Tahoma" w:hAnsi="Tahoma" w:eastAsia="Tahoma" w:cs="Tahoma"/>
+          <w:rFonts w:ascii="Tahoma" w:eastAsia="Tahoma" w:hAnsi="Tahoma" w:cs="Tahoma"/>
           <w:color w:val="000000"/>
           <w:sz w:val="24"/>
           <w:szCs w:val="24"/>
@@ -1102,7 +1175,7 @@
       </w:pPr>
       <w:r>
         <w:rPr>
-          <w:rFonts w:ascii="Tahoma" w:hAnsi="Tahoma" w:eastAsia="Tahoma" w:cs="Tahoma"/>
+          <w:rFonts w:ascii="Tahoma" w:eastAsia="Tahoma" w:hAnsi="Tahoma" w:cs="Tahoma"/>
           <w:color w:val="000000"/>
           <w:sz w:val="24"/>
           <w:szCs w:val="24"/>
@@ -1110,7 +1183,7 @@
         <w:t xml:space="preserve">El camión debe contar con los equipos necesarios para la protección de la carga. </w:t>
       </w:r>
     </w:p>
-    <w:p xmlns:wp14="http://schemas.microsoft.com/office/word/2010/wordml" wp14:textId="77777777">
+    <w:p>
       <w:pPr>
         <w:numPr>
           <w:ilvl w:val="0"/>
@@ -1126,7 +1199,7 @@
         <w:spacing w:after="0" w:line="240" w:lineRule="auto"/>
         <w:jc w:val="both"/>
         <w:rPr>
-          <w:rFonts w:ascii="Tahoma" w:hAnsi="Tahoma" w:eastAsia="Tahoma" w:cs="Tahoma"/>
+          <w:rFonts w:ascii="Tahoma" w:eastAsia="Tahoma" w:hAnsi="Tahoma" w:cs="Tahoma"/>
           <w:color w:val="000000"/>
           <w:sz w:val="24"/>
           <w:szCs w:val="24"/>
@@ -1134,7 +1207,7 @@
       </w:pPr>
       <w:r>
         <w:rPr>
-          <w:rFonts w:ascii="Tahoma" w:hAnsi="Tahoma" w:eastAsia="Tahoma" w:cs="Tahoma"/>
+          <w:rFonts w:ascii="Tahoma" w:eastAsia="Tahoma" w:hAnsi="Tahoma" w:cs="Tahoma"/>
           <w:color w:val="000000"/>
           <w:sz w:val="24"/>
           <w:szCs w:val="24"/>
@@ -1142,7 +1215,7 @@
         <w:t>Velar por el cuidado de la carga desde la planta hasta el puerto de destino.</w:t>
       </w:r>
     </w:p>
-    <w:p xmlns:wp14="http://schemas.microsoft.com/office/word/2010/wordml" wp14:textId="77777777">
+    <w:p>
       <w:pPr>
         <w:numPr>
           <w:ilvl w:val="0"/>
@@ -1158,7 +1231,7 @@
         <w:spacing w:after="0" w:line="240" w:lineRule="auto"/>
         <w:jc w:val="both"/>
         <w:rPr>
-          <w:rFonts w:ascii="Tahoma" w:hAnsi="Tahoma" w:eastAsia="Tahoma" w:cs="Tahoma"/>
+          <w:rFonts w:ascii="Tahoma" w:eastAsia="Tahoma" w:hAnsi="Tahoma" w:cs="Tahoma"/>
           <w:color w:val="000000"/>
           <w:sz w:val="24"/>
           <w:szCs w:val="24"/>
@@ -1166,7 +1239,7 @@
       </w:pPr>
       <w:r>
         <w:rPr>
-          <w:rFonts w:ascii="Tahoma" w:hAnsi="Tahoma" w:eastAsia="Tahoma" w:cs="Tahoma"/>
+          <w:rFonts w:ascii="Tahoma" w:eastAsia="Tahoma" w:hAnsi="Tahoma" w:cs="Tahoma"/>
           <w:color w:val="000000"/>
           <w:sz w:val="24"/>
           <w:szCs w:val="24"/>
@@ -1174,30 +1247,30 @@
         <w:t>Informar inmediatamente a CELIFRUT cualquier novedad que se presente durante el recorrido de la carga.</w:t>
       </w:r>
     </w:p>
-    <w:p xmlns:wp14="http://schemas.microsoft.com/office/word/2010/wordml" wp14:textId="77777777">
+    <w:p>
       <w:pPr>
         <w:spacing w:after="0" w:line="240" w:lineRule="auto"/>
         <w:jc w:val="both"/>
         <w:rPr>
-          <w:rFonts w:ascii="Tahoma" w:hAnsi="Tahoma" w:eastAsia="Tahoma" w:cs="Tahoma"/>
+          <w:rFonts w:ascii="Tahoma" w:eastAsia="Tahoma" w:hAnsi="Tahoma" w:cs="Tahoma"/>
           <w:sz w:val="24"/>
           <w:szCs w:val="24"/>
         </w:rPr>
       </w:pPr>
     </w:p>
-    <w:p xmlns:wp14="http://schemas.microsoft.com/office/word/2010/wordml" wp14:textId="436BD5F5">
+    <w:p>
       <w:pPr>
         <w:spacing w:after="0" w:line="240" w:lineRule="auto"/>
         <w:jc w:val="both"/>
         <w:rPr>
-          <w:rFonts w:ascii="Tahoma" w:hAnsi="Tahoma" w:eastAsia="Tahoma" w:cs="Tahoma"/>
-          <w:sz w:val="24"/>
-          <w:szCs w:val="24"/>
-        </w:rPr>
-      </w:pPr>
-      <w:r>
-        <w:rPr>
-          <w:rFonts w:ascii="Tahoma" w:hAnsi="Tahoma" w:eastAsia="Tahoma" w:cs="Tahoma"/>
+          <w:rFonts w:ascii="Tahoma" w:eastAsia="Tahoma" w:hAnsi="Tahoma" w:cs="Tahoma"/>
+          <w:sz w:val="24"/>
+          <w:szCs w:val="24"/>
+        </w:rPr>
+      </w:pPr>
+      <w:r>
+        <w:rPr>
+          <w:rFonts w:ascii="Tahoma" w:eastAsia="Tahoma" w:hAnsi="Tahoma" w:cs="Tahoma"/>
           <w:sz w:val="24"/>
           <w:szCs w:val="24"/>
         </w:rPr>
@@ -1205,23 +1278,25 @@
       </w:r>
       <w:r>
         <w:rPr>
-          <w:rFonts w:ascii="Tahoma" w:hAnsi="Tahoma" w:eastAsia="Tahoma" w:cs="Tahoma"/>
+          <w:rFonts w:ascii="Tahoma" w:eastAsia="Tahoma" w:hAnsi="Tahoma" w:cs="Tahoma"/>
           <w:sz w:val="24"/>
           <w:szCs w:val="24"/>
         </w:rPr>
         <w:t>{</w:t>
       </w:r>
-      <w:r>
-        <w:rPr>
-          <w:rFonts w:ascii="Tahoma" w:hAnsi="Tahoma" w:eastAsia="Tahoma" w:cs="Tahoma"/>
+      <w:proofErr w:type="spellStart"/>
+      <w:r>
+        <w:rPr>
+          <w:rFonts w:ascii="Tahoma" w:eastAsia="Tahoma" w:hAnsi="Tahoma" w:cs="Tahoma"/>
           <w:sz w:val="24"/>
           <w:szCs w:val="24"/>
         </w:rPr>
         <w:t>fecha_dia_escrito</w:t>
       </w:r>
-      <w:r>
-        <w:rPr>
-          <w:rFonts w:ascii="Tahoma" w:hAnsi="Tahoma" w:eastAsia="Tahoma" w:cs="Tahoma"/>
+      <w:proofErr w:type="spellEnd"/>
+      <w:r>
+        <w:rPr>
+          <w:rFonts w:ascii="Tahoma" w:eastAsia="Tahoma" w:hAnsi="Tahoma" w:cs="Tahoma"/>
           <w:sz w:val="24"/>
           <w:szCs w:val="24"/>
         </w:rPr>
@@ -1229,7 +1304,7 @@
       </w:r>
       <w:r>
         <w:rPr>
-          <w:rFonts w:ascii="Tahoma" w:hAnsi="Tahoma" w:eastAsia="Tahoma" w:cs="Tahoma"/>
+          <w:rFonts w:ascii="Tahoma" w:eastAsia="Tahoma" w:hAnsi="Tahoma" w:cs="Tahoma"/>
           <w:sz w:val="24"/>
           <w:szCs w:val="24"/>
         </w:rPr>
@@ -1237,23 +1312,25 @@
       </w:r>
       <w:r>
         <w:rPr>
-          <w:rFonts w:ascii="Tahoma" w:hAnsi="Tahoma" w:eastAsia="Tahoma" w:cs="Tahoma"/>
+          <w:rFonts w:ascii="Tahoma" w:eastAsia="Tahoma" w:hAnsi="Tahoma" w:cs="Tahoma"/>
           <w:sz w:val="24"/>
           <w:szCs w:val="24"/>
         </w:rPr>
         <w:t>{</w:t>
       </w:r>
-      <w:r>
-        <w:rPr>
-          <w:rFonts w:ascii="Tahoma" w:hAnsi="Tahoma" w:eastAsia="Tahoma" w:cs="Tahoma"/>
+      <w:proofErr w:type="spellStart"/>
+      <w:r>
+        <w:rPr>
+          <w:rFonts w:ascii="Tahoma" w:eastAsia="Tahoma" w:hAnsi="Tahoma" w:cs="Tahoma"/>
           <w:sz w:val="24"/>
           <w:szCs w:val="24"/>
         </w:rPr>
         <w:t>fecha_dia</w:t>
       </w:r>
-      <w:r>
-        <w:rPr>
-          <w:rFonts w:ascii="Tahoma" w:hAnsi="Tahoma" w:eastAsia="Tahoma" w:cs="Tahoma"/>
+      <w:proofErr w:type="spellEnd"/>
+      <w:r>
+        <w:rPr>
+          <w:rFonts w:ascii="Tahoma" w:eastAsia="Tahoma" w:hAnsi="Tahoma" w:cs="Tahoma"/>
           <w:sz w:val="24"/>
           <w:szCs w:val="24"/>
         </w:rPr>
@@ -1261,7 +1338,7 @@
       </w:r>
       <w:r>
         <w:rPr>
-          <w:rFonts w:ascii="Tahoma" w:hAnsi="Tahoma" w:eastAsia="Tahoma" w:cs="Tahoma"/>
+          <w:rFonts w:ascii="Tahoma" w:eastAsia="Tahoma" w:hAnsi="Tahoma" w:cs="Tahoma"/>
           <w:sz w:val="24"/>
           <w:szCs w:val="24"/>
         </w:rPr>
@@ -1269,15 +1346,16 @@
       </w:r>
       <w:r>
         <w:rPr>
-          <w:rFonts w:ascii="Tahoma" w:hAnsi="Tahoma" w:eastAsia="Tahoma" w:cs="Tahoma"/>
+          <w:rFonts w:ascii="Tahoma" w:eastAsia="Tahoma" w:hAnsi="Tahoma" w:cs="Tahoma"/>
           <w:sz w:val="24"/>
           <w:szCs w:val="24"/>
         </w:rPr>
         <w:t>{</w:t>
       </w:r>
-      <w:r>
-        <w:rPr>
-          <w:rFonts w:ascii="Tahoma" w:hAnsi="Tahoma" w:eastAsia="Tahoma" w:cs="Tahoma"/>
+      <w:proofErr w:type="spellStart"/>
+      <w:r>
+        <w:rPr>
+          <w:rFonts w:ascii="Tahoma" w:eastAsia="Tahoma" w:hAnsi="Tahoma" w:cs="Tahoma"/>
           <w:sz w:val="24"/>
           <w:szCs w:val="24"/>
         </w:rPr>
@@ -1285,7 +1363,7 @@
       </w:r>
       <w:r>
         <w:rPr>
-          <w:rFonts w:ascii="Tahoma" w:hAnsi="Tahoma" w:eastAsia="Tahoma" w:cs="Tahoma"/>
+          <w:rFonts w:ascii="Tahoma" w:eastAsia="Tahoma" w:hAnsi="Tahoma" w:cs="Tahoma"/>
           <w:sz w:val="24"/>
           <w:szCs w:val="24"/>
         </w:rPr>
@@ -1293,15 +1371,16 @@
       </w:r>
       <w:r>
         <w:rPr>
-          <w:rFonts w:ascii="Tahoma" w:hAnsi="Tahoma" w:eastAsia="Tahoma" w:cs="Tahoma"/>
+          <w:rFonts w:ascii="Tahoma" w:eastAsia="Tahoma" w:hAnsi="Tahoma" w:cs="Tahoma"/>
           <w:sz w:val="24"/>
           <w:szCs w:val="24"/>
         </w:rPr>
         <w:t>mes</w:t>
       </w:r>
-      <w:r>
-        <w:rPr>
-          <w:rFonts w:ascii="Tahoma" w:hAnsi="Tahoma" w:eastAsia="Tahoma" w:cs="Tahoma"/>
+      <w:proofErr w:type="spellEnd"/>
+      <w:r>
+        <w:rPr>
+          <w:rFonts w:ascii="Tahoma" w:eastAsia="Tahoma" w:hAnsi="Tahoma" w:cs="Tahoma"/>
           <w:sz w:val="24"/>
           <w:szCs w:val="24"/>
         </w:rPr>
@@ -1309,7 +1388,7 @@
       </w:r>
       <w:r>
         <w:rPr>
-          <w:rFonts w:ascii="Tahoma" w:hAnsi="Tahoma" w:eastAsia="Tahoma" w:cs="Tahoma"/>
+          <w:rFonts w:ascii="Tahoma" w:eastAsia="Tahoma" w:hAnsi="Tahoma" w:cs="Tahoma"/>
           <w:sz w:val="24"/>
           <w:szCs w:val="24"/>
         </w:rPr>
@@ -1317,7 +1396,7 @@
       </w:r>
       <w:r>
         <w:rPr>
-          <w:rFonts w:ascii="Tahoma" w:hAnsi="Tahoma" w:eastAsia="Tahoma" w:cs="Tahoma"/>
+          <w:rFonts w:ascii="Tahoma" w:eastAsia="Tahoma" w:hAnsi="Tahoma" w:cs="Tahoma"/>
           <w:sz w:val="24"/>
           <w:szCs w:val="24"/>
         </w:rPr>
@@ -1325,7 +1404,7 @@
       </w:r>
       <w:r>
         <w:rPr>
-          <w:rFonts w:ascii="Tahoma" w:hAnsi="Tahoma" w:eastAsia="Tahoma" w:cs="Tahoma"/>
+          <w:rFonts w:ascii="Tahoma" w:eastAsia="Tahoma" w:hAnsi="Tahoma" w:cs="Tahoma"/>
           <w:sz w:val="24"/>
           <w:szCs w:val="24"/>
         </w:rPr>
@@ -1333,48 +1412,48 @@
       </w:r>
       <w:r>
         <w:rPr>
-          <w:rFonts w:ascii="Tahoma" w:hAnsi="Tahoma" w:eastAsia="Tahoma" w:cs="Tahoma"/>
+          <w:rFonts w:ascii="Tahoma" w:eastAsia="Tahoma" w:hAnsi="Tahoma" w:cs="Tahoma"/>
           <w:sz w:val="24"/>
           <w:szCs w:val="24"/>
         </w:rPr>
         <w:t>5)</w:t>
       </w:r>
     </w:p>
-    <w:p xmlns:wp14="http://schemas.microsoft.com/office/word/2010/wordml" wp14:textId="77777777">
+    <w:p>
       <w:pPr>
         <w:spacing w:after="0" w:line="240" w:lineRule="auto"/>
         <w:jc w:val="both"/>
         <w:rPr>
-          <w:rFonts w:ascii="Tahoma" w:hAnsi="Tahoma" w:eastAsia="Tahoma" w:cs="Tahoma"/>
+          <w:rFonts w:ascii="Tahoma" w:eastAsia="Tahoma" w:hAnsi="Tahoma" w:cs="Tahoma"/>
           <w:sz w:val="24"/>
           <w:szCs w:val="24"/>
         </w:rPr>
       </w:pPr>
     </w:p>
-    <w:p xmlns:wp14="http://schemas.microsoft.com/office/word/2010/wordml" wp14:textId="77777777">
+    <w:p>
       <w:pPr>
         <w:spacing w:after="0" w:line="240" w:lineRule="auto"/>
         <w:jc w:val="both"/>
         <w:rPr>
-          <w:rFonts w:ascii="Tahoma" w:hAnsi="Tahoma" w:eastAsia="Tahoma" w:cs="Tahoma"/>
+          <w:rFonts w:ascii="Tahoma" w:eastAsia="Tahoma" w:hAnsi="Tahoma" w:cs="Tahoma"/>
           <w:sz w:val="24"/>
           <w:szCs w:val="24"/>
         </w:rPr>
       </w:pPr>
     </w:p>
-    <w:p xmlns:wp14="http://schemas.microsoft.com/office/word/2010/wordml" wp14:textId="77777777">
+    <w:p>
       <w:pPr>
         <w:spacing w:after="0" w:line="240" w:lineRule="auto"/>
         <w:jc w:val="both"/>
         <w:rPr>
-          <w:rFonts w:ascii="Tahoma" w:hAnsi="Tahoma" w:eastAsia="Tahoma" w:cs="Tahoma"/>
-          <w:sz w:val="24"/>
-          <w:szCs w:val="24"/>
-        </w:rPr>
-      </w:pPr>
-      <w:r>
-        <w:rPr>
-          <w:rFonts w:ascii="Tahoma" w:hAnsi="Tahoma" w:eastAsia="Tahoma" w:cs="Tahoma"/>
+          <w:rFonts w:ascii="Tahoma" w:eastAsia="Tahoma" w:hAnsi="Tahoma" w:cs="Tahoma"/>
+          <w:sz w:val="24"/>
+          <w:szCs w:val="24"/>
+        </w:rPr>
+      </w:pPr>
+      <w:r>
+        <w:rPr>
+          <w:rFonts w:ascii="Tahoma" w:eastAsia="Tahoma" w:hAnsi="Tahoma" w:cs="Tahoma"/>
           <w:sz w:val="24"/>
           <w:szCs w:val="24"/>
         </w:rPr>
@@ -1382,7 +1461,7 @@
       </w:r>
       <w:r>
         <w:rPr>
-          <w:rFonts w:ascii="Tahoma" w:hAnsi="Tahoma" w:eastAsia="Tahoma" w:cs="Tahoma"/>
+          <w:rFonts w:ascii="Tahoma" w:eastAsia="Tahoma" w:hAnsi="Tahoma" w:cs="Tahoma"/>
           <w:sz w:val="24"/>
           <w:szCs w:val="24"/>
         </w:rPr>
@@ -1390,7 +1469,7 @@
       </w:r>
       <w:r>
         <w:rPr>
-          <w:rFonts w:ascii="Tahoma" w:hAnsi="Tahoma" w:eastAsia="Tahoma" w:cs="Tahoma"/>
+          <w:rFonts w:ascii="Tahoma" w:eastAsia="Tahoma" w:hAnsi="Tahoma" w:cs="Tahoma"/>
           <w:sz w:val="24"/>
           <w:szCs w:val="24"/>
         </w:rPr>
@@ -1398,7 +1477,7 @@
       </w:r>
       <w:r>
         <w:rPr>
-          <w:rFonts w:ascii="Tahoma" w:hAnsi="Tahoma" w:eastAsia="Tahoma" w:cs="Tahoma"/>
+          <w:rFonts w:ascii="Tahoma" w:eastAsia="Tahoma" w:hAnsi="Tahoma" w:cs="Tahoma"/>
           <w:sz w:val="24"/>
           <w:szCs w:val="24"/>
         </w:rPr>
@@ -1406,7 +1485,7 @@
       </w:r>
       <w:r>
         <w:rPr>
-          <w:rFonts w:ascii="Tahoma" w:hAnsi="Tahoma" w:eastAsia="Tahoma" w:cs="Tahoma"/>
+          <w:rFonts w:ascii="Tahoma" w:eastAsia="Tahoma" w:hAnsi="Tahoma" w:cs="Tahoma"/>
           <w:sz w:val="24"/>
           <w:szCs w:val="24"/>
         </w:rPr>
@@ -1414,70 +1493,63 @@
       </w:r>
       <w:r>
         <w:rPr>
-          <w:rFonts w:ascii="Tahoma" w:hAnsi="Tahoma" w:eastAsia="Tahoma" w:cs="Tahoma"/>
+          <w:rFonts w:ascii="Tahoma" w:eastAsia="Tahoma" w:hAnsi="Tahoma" w:cs="Tahoma"/>
           <w:sz w:val="24"/>
           <w:szCs w:val="24"/>
         </w:rPr>
         <w:tab/>
-      </w:r>
-      <w:r>
-        <w:rPr>
-          <w:rFonts w:ascii="Tahoma" w:hAnsi="Tahoma" w:eastAsia="Tahoma" w:cs="Tahoma"/>
-          <w:sz w:val="24"/>
-          <w:szCs w:val="24"/>
-        </w:rPr>
         <w:t xml:space="preserve">Recibe </w:t>
       </w:r>
     </w:p>
-    <w:p xmlns:wp14="http://schemas.microsoft.com/office/word/2010/wordml" wp14:textId="77777777">
+    <w:p>
       <w:pPr>
         <w:spacing w:after="0" w:line="240" w:lineRule="auto"/>
         <w:jc w:val="both"/>
         <w:rPr>
-          <w:rFonts w:ascii="Tahoma" w:hAnsi="Tahoma" w:eastAsia="Tahoma" w:cs="Tahoma"/>
+          <w:rFonts w:ascii="Tahoma" w:eastAsia="Tahoma" w:hAnsi="Tahoma" w:cs="Tahoma"/>
           <w:b/>
           <w:sz w:val="24"/>
           <w:szCs w:val="24"/>
         </w:rPr>
       </w:pPr>
     </w:p>
-    <w:p xmlns:wp14="http://schemas.microsoft.com/office/word/2010/wordml" wp14:textId="77777777">
+    <w:p>
       <w:pPr>
         <w:spacing w:after="0" w:line="240" w:lineRule="auto"/>
         <w:jc w:val="both"/>
         <w:rPr>
-          <w:rFonts w:ascii="Tahoma" w:hAnsi="Tahoma" w:eastAsia="Tahoma" w:cs="Tahoma"/>
+          <w:rFonts w:ascii="Tahoma" w:eastAsia="Tahoma" w:hAnsi="Tahoma" w:cs="Tahoma"/>
           <w:b/>
           <w:sz w:val="24"/>
           <w:szCs w:val="24"/>
         </w:rPr>
       </w:pPr>
     </w:p>
-    <w:p xmlns:wp14="http://schemas.microsoft.com/office/word/2010/wordml" wp14:textId="77777777">
+    <w:p>
       <w:pPr>
         <w:spacing w:after="0" w:line="240" w:lineRule="auto"/>
         <w:jc w:val="both"/>
         <w:rPr>
-          <w:rFonts w:ascii="Tahoma" w:hAnsi="Tahoma" w:eastAsia="Tahoma" w:cs="Tahoma"/>
+          <w:rFonts w:ascii="Tahoma" w:eastAsia="Tahoma" w:hAnsi="Tahoma" w:cs="Tahoma"/>
           <w:b/>
           <w:sz w:val="24"/>
           <w:szCs w:val="24"/>
         </w:rPr>
       </w:pPr>
     </w:p>
-    <w:p xmlns:wp14="http://schemas.microsoft.com/office/word/2010/wordml" wp14:textId="77777777">
+    <w:p>
       <w:pPr>
         <w:spacing w:after="0" w:line="240" w:lineRule="auto"/>
         <w:jc w:val="both"/>
         <w:rPr>
-          <w:rFonts w:ascii="Tahoma" w:hAnsi="Tahoma" w:eastAsia="Tahoma" w:cs="Tahoma"/>
-          <w:sz w:val="24"/>
-          <w:szCs w:val="24"/>
-        </w:rPr>
-      </w:pPr>
-      <w:r>
-        <w:rPr>
-          <w:rFonts w:ascii="Tahoma" w:hAnsi="Tahoma" w:eastAsia="Tahoma" w:cs="Tahoma"/>
+          <w:rFonts w:ascii="Tahoma" w:eastAsia="Tahoma" w:hAnsi="Tahoma" w:cs="Tahoma"/>
+          <w:sz w:val="24"/>
+          <w:szCs w:val="24"/>
+        </w:rPr>
+      </w:pPr>
+      <w:r>
+        <w:rPr>
+          <w:rFonts w:ascii="Tahoma" w:eastAsia="Tahoma" w:hAnsi="Tahoma" w:cs="Tahoma"/>
           <w:sz w:val="24"/>
           <w:szCs w:val="24"/>
         </w:rPr>
@@ -1485,7 +1557,7 @@
       </w:r>
       <w:r>
         <w:rPr>
-          <w:rFonts w:ascii="Tahoma" w:hAnsi="Tahoma" w:eastAsia="Tahoma" w:cs="Tahoma"/>
+          <w:rFonts w:ascii="Tahoma" w:eastAsia="Tahoma" w:hAnsi="Tahoma" w:cs="Tahoma"/>
           <w:sz w:val="24"/>
           <w:szCs w:val="24"/>
         </w:rPr>
@@ -1493,41 +1565,34 @@
       </w:r>
       <w:r>
         <w:rPr>
-          <w:rFonts w:ascii="Tahoma" w:hAnsi="Tahoma" w:eastAsia="Tahoma" w:cs="Tahoma"/>
+          <w:rFonts w:ascii="Tahoma" w:eastAsia="Tahoma" w:hAnsi="Tahoma" w:cs="Tahoma"/>
           <w:sz w:val="24"/>
           <w:szCs w:val="24"/>
         </w:rPr>
         <w:tab/>
-      </w:r>
-      <w:r>
-        <w:rPr>
-          <w:rFonts w:ascii="Tahoma" w:hAnsi="Tahoma" w:eastAsia="Tahoma" w:cs="Tahoma"/>
-          <w:sz w:val="24"/>
-          <w:szCs w:val="24"/>
-        </w:rPr>
         <w:t>_________________________</w:t>
       </w:r>
       <w:r>
         <w:rPr>
-          <w:rFonts w:ascii="Tahoma" w:hAnsi="Tahoma" w:eastAsia="Tahoma" w:cs="Tahoma"/>
+          <w:rFonts w:ascii="Tahoma" w:eastAsia="Tahoma" w:hAnsi="Tahoma" w:cs="Tahoma"/>
           <w:sz w:val="24"/>
           <w:szCs w:val="24"/>
         </w:rPr>
         <w:tab/>
       </w:r>
     </w:p>
-    <w:p xmlns:wp14="http://schemas.microsoft.com/office/word/2010/wordml" wp14:textId="77777777">
+    <w:p>
       <w:pPr>
         <w:spacing w:after="0"/>
         <w:rPr>
-          <w:rFonts w:ascii="Tahoma" w:hAnsi="Tahoma" w:eastAsia="Tahoma" w:cs="Tahoma"/>
-          <w:sz w:val="24"/>
-          <w:szCs w:val="24"/>
-        </w:rPr>
-      </w:pPr>
-      <w:r>
-        <w:rPr>
-          <w:rFonts w:ascii="Tahoma" w:hAnsi="Tahoma" w:eastAsia="Tahoma" w:cs="Tahoma"/>
+          <w:rFonts w:ascii="Tahoma" w:eastAsia="Tahoma" w:hAnsi="Tahoma" w:cs="Tahoma"/>
+          <w:sz w:val="24"/>
+          <w:szCs w:val="24"/>
+        </w:rPr>
+      </w:pPr>
+      <w:r>
+        <w:rPr>
+          <w:rFonts w:ascii="Tahoma" w:eastAsia="Tahoma" w:hAnsi="Tahoma" w:cs="Tahoma"/>
           <w:sz w:val="24"/>
           <w:szCs w:val="24"/>
         </w:rPr>
@@ -1535,7 +1600,7 @@
       </w:r>
       <w:r>
         <w:rPr>
-          <w:rFonts w:ascii="Tahoma" w:hAnsi="Tahoma" w:eastAsia="Tahoma" w:cs="Tahoma"/>
+          <w:rFonts w:ascii="Tahoma" w:eastAsia="Tahoma" w:hAnsi="Tahoma" w:cs="Tahoma"/>
           <w:sz w:val="24"/>
           <w:szCs w:val="24"/>
         </w:rPr>
@@ -1543,7 +1608,7 @@
       </w:r>
       <w:r>
         <w:rPr>
-          <w:rFonts w:ascii="Tahoma" w:hAnsi="Tahoma" w:eastAsia="Tahoma" w:cs="Tahoma"/>
+          <w:rFonts w:ascii="Tahoma" w:eastAsia="Tahoma" w:hAnsi="Tahoma" w:cs="Tahoma"/>
           <w:sz w:val="24"/>
           <w:szCs w:val="24"/>
         </w:rPr>
@@ -1551,7 +1616,7 @@
       </w:r>
       <w:r>
         <w:rPr>
-          <w:rFonts w:ascii="Tahoma" w:hAnsi="Tahoma" w:eastAsia="Tahoma" w:cs="Tahoma"/>
+          <w:rFonts w:ascii="Tahoma" w:eastAsia="Tahoma" w:hAnsi="Tahoma" w:cs="Tahoma"/>
           <w:sz w:val="24"/>
           <w:szCs w:val="24"/>
         </w:rPr>
@@ -1559,7 +1624,7 @@
       </w:r>
       <w:r>
         <w:rPr>
-          <w:rFonts w:ascii="Tahoma" w:hAnsi="Tahoma" w:eastAsia="Tahoma" w:cs="Tahoma"/>
+          <w:rFonts w:ascii="Tahoma" w:eastAsia="Tahoma" w:hAnsi="Tahoma" w:cs="Tahoma"/>
           <w:sz w:val="24"/>
           <w:szCs w:val="24"/>
         </w:rPr>
@@ -1567,7 +1632,7 @@
       </w:r>
       <w:r>
         <w:rPr>
-          <w:rFonts w:ascii="Tahoma" w:hAnsi="Tahoma" w:eastAsia="Tahoma" w:cs="Tahoma"/>
+          <w:rFonts w:ascii="Tahoma" w:eastAsia="Tahoma" w:hAnsi="Tahoma" w:cs="Tahoma"/>
           <w:sz w:val="24"/>
           <w:szCs w:val="24"/>
         </w:rPr>
@@ -1575,33 +1640,26 @@
       </w:r>
       <w:r>
         <w:rPr>
-          <w:rFonts w:ascii="Tahoma" w:hAnsi="Tahoma" w:eastAsia="Tahoma" w:cs="Tahoma"/>
+          <w:rFonts w:ascii="Tahoma" w:eastAsia="Tahoma" w:hAnsi="Tahoma" w:cs="Tahoma"/>
           <w:sz w:val="24"/>
           <w:szCs w:val="24"/>
         </w:rPr>
         <w:tab/>
-      </w:r>
-      <w:r>
-        <w:rPr>
-          <w:rFonts w:ascii="Tahoma" w:hAnsi="Tahoma" w:eastAsia="Tahoma" w:cs="Tahoma"/>
-          <w:sz w:val="24"/>
-          <w:szCs w:val="24"/>
-        </w:rPr>
         <w:t xml:space="preserve">C.C. </w:t>
       </w:r>
     </w:p>
-    <w:p xmlns:wp14="http://schemas.microsoft.com/office/word/2010/wordml" wp14:textId="77777777">
+    <w:p>
       <w:pPr>
         <w:spacing w:after="0"/>
         <w:rPr>
-          <w:rFonts w:ascii="Tahoma" w:hAnsi="Tahoma" w:eastAsia="Tahoma" w:cs="Tahoma"/>
-          <w:sz w:val="24"/>
-          <w:szCs w:val="24"/>
-        </w:rPr>
-      </w:pPr>
-      <w:r>
-        <w:rPr>
-          <w:rFonts w:ascii="Tahoma" w:hAnsi="Tahoma" w:eastAsia="Tahoma" w:cs="Tahoma"/>
+          <w:rFonts w:ascii="Tahoma" w:eastAsia="Tahoma" w:hAnsi="Tahoma" w:cs="Tahoma"/>
+          <w:sz w:val="24"/>
+          <w:szCs w:val="24"/>
+        </w:rPr>
+      </w:pPr>
+      <w:r>
+        <w:rPr>
+          <w:rFonts w:ascii="Tahoma" w:eastAsia="Tahoma" w:hAnsi="Tahoma" w:cs="Tahoma"/>
           <w:sz w:val="24"/>
           <w:szCs w:val="24"/>
         </w:rPr>
@@ -1609,7 +1667,7 @@
       </w:r>
       <w:r>
         <w:rPr>
-          <w:rFonts w:ascii="Tahoma" w:hAnsi="Tahoma" w:eastAsia="Tahoma" w:cs="Tahoma"/>
+          <w:rFonts w:ascii="Tahoma" w:eastAsia="Tahoma" w:hAnsi="Tahoma" w:cs="Tahoma"/>
           <w:sz w:val="24"/>
           <w:szCs w:val="24"/>
         </w:rPr>
@@ -1617,7 +1675,7 @@
       </w:r>
       <w:r>
         <w:rPr>
-          <w:rFonts w:ascii="Tahoma" w:hAnsi="Tahoma" w:eastAsia="Tahoma" w:cs="Tahoma"/>
+          <w:rFonts w:ascii="Tahoma" w:eastAsia="Tahoma" w:hAnsi="Tahoma" w:cs="Tahoma"/>
           <w:sz w:val="24"/>
           <w:szCs w:val="24"/>
         </w:rPr>
@@ -1625,7 +1683,7 @@
       </w:r>
       <w:r>
         <w:rPr>
-          <w:rFonts w:ascii="Tahoma" w:hAnsi="Tahoma" w:eastAsia="Tahoma" w:cs="Tahoma"/>
+          <w:rFonts w:ascii="Tahoma" w:eastAsia="Tahoma" w:hAnsi="Tahoma" w:cs="Tahoma"/>
           <w:sz w:val="24"/>
           <w:szCs w:val="24"/>
         </w:rPr>
@@ -1633,7 +1691,7 @@
       </w:r>
       <w:r>
         <w:rPr>
-          <w:rFonts w:ascii="Tahoma" w:hAnsi="Tahoma" w:eastAsia="Tahoma" w:cs="Tahoma"/>
+          <w:rFonts w:ascii="Tahoma" w:eastAsia="Tahoma" w:hAnsi="Tahoma" w:cs="Tahoma"/>
           <w:sz w:val="24"/>
           <w:szCs w:val="24"/>
         </w:rPr>
@@ -1641,27 +1699,22 @@
       </w:r>
       <w:r>
         <w:rPr>
-          <w:rFonts w:ascii="Tahoma" w:hAnsi="Tahoma" w:eastAsia="Tahoma" w:cs="Tahoma"/>
+          <w:rFonts w:ascii="Tahoma" w:eastAsia="Tahoma" w:hAnsi="Tahoma" w:cs="Tahoma"/>
           <w:sz w:val="24"/>
           <w:szCs w:val="24"/>
         </w:rPr>
         <w:tab/>
-      </w:r>
-      <w:r>
-        <w:rPr>
-          <w:rFonts w:ascii="Tahoma" w:hAnsi="Tahoma" w:eastAsia="Tahoma" w:cs="Tahoma"/>
-          <w:sz w:val="24"/>
-          <w:szCs w:val="24"/>
-        </w:rPr>
         <w:t xml:space="preserve">Hora: </w:t>
       </w:r>
     </w:p>
     <w:sectPr>
       <w:headerReference w:type="even" r:id="rId8"/>
       <w:headerReference w:type="default" r:id="rId9"/>
-      <w:footerReference w:type="default" r:id="rId10"/>
-      <w:headerReference w:type="first" r:id="rId11"/>
-      <w:pgSz w:w="12240" w:h="15840" w:orient="portrait"/>
+      <w:footerReference w:type="even" r:id="rId10"/>
+      <w:footerReference w:type="default" r:id="rId11"/>
+      <w:headerReference w:type="first" r:id="rId12"/>
+      <w:footerReference w:type="first" r:id="rId13"/>
+      <w:pgSz w:w="12240" w:h="15840"/>
       <w:pgMar w:top="1417" w:right="1183" w:bottom="1417" w:left="1701" w:header="708" w:footer="708" w:gutter="0"/>
       <w:pgNumType w:start="1"/>
       <w:cols w:space="720"/>
@@ -1671,9 +1724,9 @@
 </file>
 
 <file path=word/endnotes.xml><?xml version="1.0" encoding="utf-8"?>
-<w:endnotes xmlns:wpc="http://schemas.microsoft.com/office/word/2010/wordprocessingCanvas" xmlns:cx="http://schemas.microsoft.com/office/drawing/2014/chartex" xmlns:cx1="http://schemas.microsoft.com/office/drawing/2015/9/8/chartex" xmlns:cx2="http://schemas.microsoft.com/office/drawing/2015/10/21/chartex" xmlns:cx3="http://schemas.microsoft.com/office/drawing/2016/5/9/chartex" xmlns:cx4="http://schemas.microsoft.com/office/drawing/2016/5/10/chartex" xmlns:cx5="http://schemas.microsoft.com/office/drawing/2016/5/11/chartex" xmlns:cx6="http://schemas.microsoft.com/office/drawing/2016/5/12/chartex" xmlns:cx7="http://schemas.microsoft.com/office/drawing/2016/5/13/chartex" xmlns:cx8="http://schemas.microsoft.com/office/drawing/2016/5/14/chartex" xmlns:mc="http://schemas.openxmlformats.org/markup-compatibility/2006" xmlns:aink="http://schemas.microsoft.com/office/drawing/2016/ink" xmlns:am3d="http://schemas.microsoft.com/office/drawing/2017/model3d" xmlns:o="urn:schemas-microsoft-com:office:office" xmlns:oel="http://schemas.microsoft.com/office/2019/extlst" xmlns:r="http://schemas.openxmlformats.org/officeDocument/2006/relationships" xmlns:m="http://schemas.openxmlformats.org/officeDocument/2006/math" xmlns:v="urn:schemas-microsoft-com:vml" xmlns:wp14="http://schemas.microsoft.com/office/word/2010/wordprocessingDrawing" xmlns:wp="http://schemas.openxmlformats.org/drawingml/2006/wordprocessingDrawing" xmlns:w10="urn:schemas-microsoft-com:office:word" xmlns:w="http://schemas.openxmlformats.org/wordprocessingml/2006/main" xmlns:w14="http://schemas.microsoft.com/office/word/2010/wordml" xmlns:w15="http://schemas.microsoft.com/office/word/2012/wordml" xmlns:w16cex="http://schemas.microsoft.com/office/word/2018/wordml/cex" xmlns:w16cid="http://schemas.microsoft.com/office/word/2016/wordml/cid" xmlns:w16="http://schemas.microsoft.com/office/word/2018/wordml" xmlns:w16du="http://schemas.microsoft.com/office/word/2023/wordml/word16du" xmlns:w16sdtdh="http://schemas.microsoft.com/office/word/2020/wordml/sdtdatahash" xmlns:w16se="http://schemas.microsoft.com/office/word/2015/wordml/symex" xmlns:wpg="http://schemas.microsoft.com/office/word/2010/wordprocessingGroup" xmlns:wpi="http://schemas.microsoft.com/office/word/2010/wordprocessingInk" xmlns:wne="http://schemas.microsoft.com/office/word/2006/wordml" xmlns:wps="http://schemas.microsoft.com/office/word/2010/wordprocessingShape" mc:Ignorable="w14 w15 w16se w16cid w16 w16cex w16sdtdh w16du wp14">
+<w:endnotes xmlns:wpc="http://schemas.microsoft.com/office/word/2010/wordprocessingCanvas" xmlns:cx="http://schemas.microsoft.com/office/drawing/2014/chartex" xmlns:cx1="http://schemas.microsoft.com/office/drawing/2015/9/8/chartex" xmlns:cx2="http://schemas.microsoft.com/office/drawing/2015/10/21/chartex" xmlns:cx3="http://schemas.microsoft.com/office/drawing/2016/5/9/chartex" xmlns:cx4="http://schemas.microsoft.com/office/drawing/2016/5/10/chartex" xmlns:cx5="http://schemas.microsoft.com/office/drawing/2016/5/11/chartex" xmlns:cx6="http://schemas.microsoft.com/office/drawing/2016/5/12/chartex" xmlns:cx7="http://schemas.microsoft.com/office/drawing/2016/5/13/chartex" xmlns:cx8="http://schemas.microsoft.com/office/drawing/2016/5/14/chartex" xmlns:mc="http://schemas.openxmlformats.org/markup-compatibility/2006" xmlns:aink="http://schemas.microsoft.com/office/drawing/2016/ink" xmlns:am3d="http://schemas.microsoft.com/office/drawing/2017/model3d" xmlns:o="urn:schemas-microsoft-com:office:office" xmlns:oel="http://schemas.microsoft.com/office/2019/extlst" xmlns:r="http://schemas.openxmlformats.org/officeDocument/2006/relationships" xmlns:m="http://schemas.openxmlformats.org/officeDocument/2006/math" xmlns:v="urn:schemas-microsoft-com:vml" xmlns:wp14="http://schemas.microsoft.com/office/word/2010/wordprocessingDrawing" xmlns:wp="http://schemas.openxmlformats.org/drawingml/2006/wordprocessingDrawing" xmlns:w10="urn:schemas-microsoft-com:office:word" xmlns:w="http://schemas.openxmlformats.org/wordprocessingml/2006/main" xmlns:w14="http://schemas.microsoft.com/office/word/2010/wordml" xmlns:w15="http://schemas.microsoft.com/office/word/2012/wordml" xmlns:w16cex="http://schemas.microsoft.com/office/word/2018/wordml/cex" xmlns:w16cid="http://schemas.microsoft.com/office/word/2016/wordml/cid" xmlns:w16="http://schemas.microsoft.com/office/word/2018/wordml" xmlns:w16du="http://schemas.microsoft.com/office/word/2023/wordml/word16du" xmlns:w16sdtdh="http://schemas.microsoft.com/office/word/2020/wordml/sdtdatahash" xmlns:w16sdtfl="http://schemas.microsoft.com/office/word/2024/wordml/sdtformatlock" xmlns:w16se="http://schemas.microsoft.com/office/word/2015/wordml/symex" xmlns:wpg="http://schemas.microsoft.com/office/word/2010/wordprocessingGroup" xmlns:wpi="http://schemas.microsoft.com/office/word/2010/wordprocessingInk" xmlns:wne="http://schemas.microsoft.com/office/word/2006/wordml" xmlns:wps="http://schemas.microsoft.com/office/word/2010/wordprocessingShape" mc:Ignorable="w14 w15 w16se w16cid w16 w16cex w16sdtdh w16sdtfl w16du wp14">
   <w:endnote w:type="separator" w:id="-1">
-    <w:p xmlns:wp14="http://schemas.microsoft.com/office/word/2010/wordml" wp14:textId="77777777">
+    <w:p>
       <w:pPr>
         <w:spacing w:after="0" w:line="240" w:lineRule="auto"/>
       </w:pPr>
@@ -1683,7 +1736,7 @@
     </w:p>
   </w:endnote>
   <w:endnote w:type="continuationSeparator" w:id="0">
-    <w:p xmlns:wp14="http://schemas.microsoft.com/office/word/2010/wordml" wp14:textId="77777777">
+    <w:p>
       <w:pPr>
         <w:spacing w:after="0" w:line="240" w:lineRule="auto"/>
       </w:pPr>
@@ -1696,11 +1749,21 @@
 </file>
 
 <file path=word/footer1.xml><?xml version="1.0" encoding="utf-8"?>
-<w:ftr xmlns:wpc="http://schemas.microsoft.com/office/word/2010/wordprocessingCanvas" xmlns:cx="http://schemas.microsoft.com/office/drawing/2014/chartex" xmlns:cx1="http://schemas.microsoft.com/office/drawing/2015/9/8/chartex" xmlns:cx2="http://schemas.microsoft.com/office/drawing/2015/10/21/chartex" xmlns:cx3="http://schemas.microsoft.com/office/drawing/2016/5/9/chartex" xmlns:cx4="http://schemas.microsoft.com/office/drawing/2016/5/10/chartex" xmlns:cx5="http://schemas.microsoft.com/office/drawing/2016/5/11/chartex" xmlns:cx6="http://schemas.microsoft.com/office/drawing/2016/5/12/chartex" xmlns:cx7="http://schemas.microsoft.com/office/drawing/2016/5/13/chartex" xmlns:cx8="http://schemas.microsoft.com/office/drawing/2016/5/14/chartex" xmlns:mc="http://schemas.openxmlformats.org/markup-compatibility/2006" xmlns:aink="http://schemas.microsoft.com/office/drawing/2016/ink" xmlns:am3d="http://schemas.microsoft.com/office/drawing/2017/model3d" xmlns:o="urn:schemas-microsoft-com:office:office" xmlns:oel="http://schemas.microsoft.com/office/2019/extlst" xmlns:r="http://schemas.openxmlformats.org/officeDocument/2006/relationships" xmlns:m="http://schemas.openxmlformats.org/officeDocument/2006/math" xmlns:v="urn:schemas-microsoft-com:vml" xmlns:wp14="http://schemas.microsoft.com/office/word/2010/wordprocessingDrawing" xmlns:wp="http://schemas.openxmlformats.org/drawingml/2006/wordprocessingDrawing" xmlns:w10="urn:schemas-microsoft-com:office:word" xmlns:w="http://schemas.openxmlformats.org/wordprocessingml/2006/main" xmlns:w14="http://schemas.microsoft.com/office/word/2010/wordml" xmlns:w15="http://schemas.microsoft.com/office/word/2012/wordml" xmlns:w16cex="http://schemas.microsoft.com/office/word/2018/wordml/cex" xmlns:w16cid="http://schemas.microsoft.com/office/word/2016/wordml/cid" xmlns:w16="http://schemas.microsoft.com/office/word/2018/wordml" xmlns:w16du="http://schemas.microsoft.com/office/word/2023/wordml/word16du" xmlns:w16sdtdh="http://schemas.microsoft.com/office/word/2020/wordml/sdtdatahash" xmlns:w16se="http://schemas.microsoft.com/office/word/2015/wordml/symex" xmlns:wpg="http://schemas.microsoft.com/office/word/2010/wordprocessingGroup" xmlns:wpi="http://schemas.microsoft.com/office/word/2010/wordprocessingInk" xmlns:wne="http://schemas.microsoft.com/office/word/2006/wordml" xmlns:wps="http://schemas.microsoft.com/office/word/2010/wordprocessingShape" mc:Ignorable="w14 w15 w16se w16cid w16 w16cex w16sdtdh w16du wp14">
-  <w:p xmlns:wp14="http://schemas.microsoft.com/office/word/2010/wordml" wp14:textId="77777777">
+<w:ftr xmlns:wpc="http://schemas.microsoft.com/office/word/2010/wordprocessingCanvas" xmlns:cx="http://schemas.microsoft.com/office/drawing/2014/chartex" xmlns:cx1="http://schemas.microsoft.com/office/drawing/2015/9/8/chartex" xmlns:cx2="http://schemas.microsoft.com/office/drawing/2015/10/21/chartex" xmlns:cx3="http://schemas.microsoft.com/office/drawing/2016/5/9/chartex" xmlns:cx4="http://schemas.microsoft.com/office/drawing/2016/5/10/chartex" xmlns:cx5="http://schemas.microsoft.com/office/drawing/2016/5/11/chartex" xmlns:cx6="http://schemas.microsoft.com/office/drawing/2016/5/12/chartex" xmlns:cx7="http://schemas.microsoft.com/office/drawing/2016/5/13/chartex" xmlns:cx8="http://schemas.microsoft.com/office/drawing/2016/5/14/chartex" xmlns:mc="http://schemas.openxmlformats.org/markup-compatibility/2006" xmlns:aink="http://schemas.microsoft.com/office/drawing/2016/ink" xmlns:am3d="http://schemas.microsoft.com/office/drawing/2017/model3d" xmlns:o="urn:schemas-microsoft-com:office:office" xmlns:oel="http://schemas.microsoft.com/office/2019/extlst" xmlns:r="http://schemas.openxmlformats.org/officeDocument/2006/relationships" xmlns:m="http://schemas.openxmlformats.org/officeDocument/2006/math" xmlns:v="urn:schemas-microsoft-com:vml" xmlns:wp14="http://schemas.microsoft.com/office/word/2010/wordprocessingDrawing" xmlns:wp="http://schemas.openxmlformats.org/drawingml/2006/wordprocessingDrawing" xmlns:w10="urn:schemas-microsoft-com:office:word" xmlns:w="http://schemas.openxmlformats.org/wordprocessingml/2006/main" xmlns:w14="http://schemas.microsoft.com/office/word/2010/wordml" xmlns:w15="http://schemas.microsoft.com/office/word/2012/wordml" xmlns:w16cex="http://schemas.microsoft.com/office/word/2018/wordml/cex" xmlns:w16cid="http://schemas.microsoft.com/office/word/2016/wordml/cid" xmlns:w16="http://schemas.microsoft.com/office/word/2018/wordml" xmlns:w16du="http://schemas.microsoft.com/office/word/2023/wordml/word16du" xmlns:w16sdtdh="http://schemas.microsoft.com/office/word/2020/wordml/sdtdatahash" xmlns:w16sdtfl="http://schemas.microsoft.com/office/word/2024/wordml/sdtformatlock" xmlns:w16se="http://schemas.microsoft.com/office/word/2015/wordml/symex" xmlns:wpg="http://schemas.microsoft.com/office/word/2010/wordprocessingGroup" xmlns:wpi="http://schemas.microsoft.com/office/word/2010/wordprocessingInk" xmlns:wne="http://schemas.microsoft.com/office/word/2006/wordml" xmlns:wps="http://schemas.microsoft.com/office/word/2010/wordprocessingShape" mc:Ignorable="w14 w15 w16se w16cid w16 w16cex w16sdtdh w16sdtfl w16du wp14">
+  <w:p>
+    <w:pPr>
+      <w:pStyle w:val="Piedepgina"/>
+    </w:pPr>
+  </w:p>
+</w:ftr>
+</file>
+
+<file path=word/footer2.xml><?xml version="1.0" encoding="utf-8"?>
+<w:ftr xmlns:wpc="http://schemas.microsoft.com/office/word/2010/wordprocessingCanvas" xmlns:cx="http://schemas.microsoft.com/office/drawing/2014/chartex" xmlns:cx1="http://schemas.microsoft.com/office/drawing/2015/9/8/chartex" xmlns:cx2="http://schemas.microsoft.com/office/drawing/2015/10/21/chartex" xmlns:cx3="http://schemas.microsoft.com/office/drawing/2016/5/9/chartex" xmlns:cx4="http://schemas.microsoft.com/office/drawing/2016/5/10/chartex" xmlns:cx5="http://schemas.microsoft.com/office/drawing/2016/5/11/chartex" xmlns:cx6="http://schemas.microsoft.com/office/drawing/2016/5/12/chartex" xmlns:cx7="http://schemas.microsoft.com/office/drawing/2016/5/13/chartex" xmlns:cx8="http://schemas.microsoft.com/office/drawing/2016/5/14/chartex" xmlns:mc="http://schemas.openxmlformats.org/markup-compatibility/2006" xmlns:aink="http://schemas.microsoft.com/office/drawing/2016/ink" xmlns:am3d="http://schemas.microsoft.com/office/drawing/2017/model3d" xmlns:o="urn:schemas-microsoft-com:office:office" xmlns:oel="http://schemas.microsoft.com/office/2019/extlst" xmlns:r="http://schemas.openxmlformats.org/officeDocument/2006/relationships" xmlns:m="http://schemas.openxmlformats.org/officeDocument/2006/math" xmlns:v="urn:schemas-microsoft-com:vml" xmlns:wp14="http://schemas.microsoft.com/office/word/2010/wordprocessingDrawing" xmlns:wp="http://schemas.openxmlformats.org/drawingml/2006/wordprocessingDrawing" xmlns:w10="urn:schemas-microsoft-com:office:word" xmlns:w="http://schemas.openxmlformats.org/wordprocessingml/2006/main" xmlns:w14="http://schemas.microsoft.com/office/word/2010/wordml" xmlns:w15="http://schemas.microsoft.com/office/word/2012/wordml" xmlns:w16cex="http://schemas.microsoft.com/office/word/2018/wordml/cex" xmlns:w16cid="http://schemas.microsoft.com/office/word/2016/wordml/cid" xmlns:w16="http://schemas.microsoft.com/office/word/2018/wordml" xmlns:w16du="http://schemas.microsoft.com/office/word/2023/wordml/word16du" xmlns:w16sdtdh="http://schemas.microsoft.com/office/word/2020/wordml/sdtdatahash" xmlns:w16sdtfl="http://schemas.microsoft.com/office/word/2024/wordml/sdtformatlock" xmlns:w16se="http://schemas.microsoft.com/office/word/2015/wordml/symex" xmlns:wpg="http://schemas.microsoft.com/office/word/2010/wordprocessingGroup" xmlns:wpi="http://schemas.microsoft.com/office/word/2010/wordprocessingInk" xmlns:wne="http://schemas.microsoft.com/office/word/2006/wordml" xmlns:wps="http://schemas.microsoft.com/office/word/2010/wordprocessingShape" mc:Ignorable="w14 w15 w16se w16cid w16 w16cex w16sdtdh w16sdtfl w16du wp14">
+  <w:p>
     <w:pPr>
       <w:pBdr>
-        <w:top w:val="single" w:color="A5A5A5" w:sz="4" w:space="1"/>
+        <w:top w:val="single" w:sz="4" w:space="1" w:color="A5A5A5"/>
       </w:pBdr>
       <w:tabs>
         <w:tab w:val="center" w:pos="4419"/>
@@ -1710,16 +1773,13 @@
       <w:jc w:val="center"/>
     </w:pPr>
     <w:r>
-      <w:t>Carrera 6ª Km 1 Vía el Caimo, Galería de los Plátanos Bodega 16 Armenia</w:t>
-    </w:r>
-    <w:r>
-      <w:t xml:space="preserve"> (Quindío) Celular 304 576 4804</w:t>
+      <w:t>Carrera 6ª Km 1 Vía el Caimo, Galería de los Plátanos Bodega 16 Armenia (Quindío) Celular 304 576 4804</w:t>
     </w:r>
   </w:p>
-  <w:p xmlns:wp14="http://schemas.microsoft.com/office/word/2010/wordml" wp14:textId="77777777">
+  <w:p>
     <w:pPr>
       <w:pBdr>
-        <w:top w:val="single" w:color="A5A5A5" w:sz="4" w:space="1"/>
+        <w:top w:val="single" w:sz="4" w:space="1" w:color="A5A5A5"/>
       </w:pBdr>
       <w:tabs>
         <w:tab w:val="center" w:pos="4419"/>
@@ -1728,8 +1788,13 @@
       <w:spacing w:after="0" w:line="240" w:lineRule="auto"/>
       <w:jc w:val="center"/>
     </w:pPr>
+    <w:proofErr w:type="gramStart"/>
     <w:r>
-      <w:t xml:space="preserve">www.celifrut.com  -  </w:t>
+      <w:t>www.celifrut.com  -</w:t>
+    </w:r>
+    <w:proofErr w:type="gramEnd"/>
+    <w:r>
+      <w:t xml:space="preserve">  </w:t>
     </w:r>
     <w:hyperlink r:id="rId1">
       <w:r>
@@ -1741,7 +1806,7 @@
       </w:r>
     </w:hyperlink>
   </w:p>
-  <w:p xmlns:wp14="http://schemas.microsoft.com/office/word/2010/wordml" wp14:textId="77777777">
+  <w:p>
     <w:pPr>
       <w:pBdr>
         <w:top w:val="nil"/>
@@ -1763,10 +1828,20 @@
 </w:ftr>
 </file>
 
+<file path=word/footer3.xml><?xml version="1.0" encoding="utf-8"?>
+<w:ftr xmlns:wpc="http://schemas.microsoft.com/office/word/2010/wordprocessingCanvas" xmlns:cx="http://schemas.microsoft.com/office/drawing/2014/chartex" xmlns:cx1="http://schemas.microsoft.com/office/drawing/2015/9/8/chartex" xmlns:cx2="http://schemas.microsoft.com/office/drawing/2015/10/21/chartex" xmlns:cx3="http://schemas.microsoft.com/office/drawing/2016/5/9/chartex" xmlns:cx4="http://schemas.microsoft.com/office/drawing/2016/5/10/chartex" xmlns:cx5="http://schemas.microsoft.com/office/drawing/2016/5/11/chartex" xmlns:cx6="http://schemas.microsoft.com/office/drawing/2016/5/12/chartex" xmlns:cx7="http://schemas.microsoft.com/office/drawing/2016/5/13/chartex" xmlns:cx8="http://schemas.microsoft.com/office/drawing/2016/5/14/chartex" xmlns:mc="http://schemas.openxmlformats.org/markup-compatibility/2006" xmlns:aink="http://schemas.microsoft.com/office/drawing/2016/ink" xmlns:am3d="http://schemas.microsoft.com/office/drawing/2017/model3d" xmlns:o="urn:schemas-microsoft-com:office:office" xmlns:oel="http://schemas.microsoft.com/office/2019/extlst" xmlns:r="http://schemas.openxmlformats.org/officeDocument/2006/relationships" xmlns:m="http://schemas.openxmlformats.org/officeDocument/2006/math" xmlns:v="urn:schemas-microsoft-com:vml" xmlns:wp14="http://schemas.microsoft.com/office/word/2010/wordprocessingDrawing" xmlns:wp="http://schemas.openxmlformats.org/drawingml/2006/wordprocessingDrawing" xmlns:w10="urn:schemas-microsoft-com:office:word" xmlns:w="http://schemas.openxmlformats.org/wordprocessingml/2006/main" xmlns:w14="http://schemas.microsoft.com/office/word/2010/wordml" xmlns:w15="http://schemas.microsoft.com/office/word/2012/wordml" xmlns:w16cex="http://schemas.microsoft.com/office/word/2018/wordml/cex" xmlns:w16cid="http://schemas.microsoft.com/office/word/2016/wordml/cid" xmlns:w16="http://schemas.microsoft.com/office/word/2018/wordml" xmlns:w16du="http://schemas.microsoft.com/office/word/2023/wordml/word16du" xmlns:w16sdtdh="http://schemas.microsoft.com/office/word/2020/wordml/sdtdatahash" xmlns:w16sdtfl="http://schemas.microsoft.com/office/word/2024/wordml/sdtformatlock" xmlns:w16se="http://schemas.microsoft.com/office/word/2015/wordml/symex" xmlns:wpg="http://schemas.microsoft.com/office/word/2010/wordprocessingGroup" xmlns:wpi="http://schemas.microsoft.com/office/word/2010/wordprocessingInk" xmlns:wne="http://schemas.microsoft.com/office/word/2006/wordml" xmlns:wps="http://schemas.microsoft.com/office/word/2010/wordprocessingShape" mc:Ignorable="w14 w15 w16se w16cid w16 w16cex w16sdtdh w16sdtfl w16du wp14">
+  <w:p>
+    <w:pPr>
+      <w:pStyle w:val="Piedepgina"/>
+    </w:pPr>
+  </w:p>
+</w:ftr>
+</file>
+
 <file path=word/footnotes.xml><?xml version="1.0" encoding="utf-8"?>
-<w:footnotes xmlns:wpc="http://schemas.microsoft.com/office/word/2010/wordprocessingCanvas" xmlns:cx="http://schemas.microsoft.com/office/drawing/2014/chartex" xmlns:cx1="http://schemas.microsoft.com/office/drawing/2015/9/8/chartex" xmlns:cx2="http://schemas.microsoft.com/office/drawing/2015/10/21/chartex" xmlns:cx3="http://schemas.microsoft.com/office/drawing/2016/5/9/chartex" xmlns:cx4="http://schemas.microsoft.com/office/drawing/2016/5/10/chartex" xmlns:cx5="http://schemas.microsoft.com/office/drawing/2016/5/11/chartex" xmlns:cx6="http://schemas.microsoft.com/office/drawing/2016/5/12/chartex" xmlns:cx7="http://schemas.microsoft.com/office/drawing/2016/5/13/chartex" xmlns:cx8="http://schemas.microsoft.com/office/drawing/2016/5/14/chartex" xmlns:mc="http://schemas.openxmlformats.org/markup-compatibility/2006" xmlns:aink="http://schemas.microsoft.com/office/drawing/2016/ink" xmlns:am3d="http://schemas.microsoft.com/office/drawing/2017/model3d" xmlns:o="urn:schemas-microsoft-com:office:office" xmlns:oel="http://schemas.microsoft.com/office/2019/extlst" xmlns:r="http://schemas.openxmlformats.org/officeDocument/2006/relationships" xmlns:m="http://schemas.openxmlformats.org/officeDocument/2006/math" xmlns:v="urn:schemas-microsoft-com:vml" xmlns:wp14="http://schemas.microsoft.com/office/word/2010/wordprocessingDrawing" xmlns:wp="http://schemas.openxmlformats.org/drawingml/2006/wordprocessingDrawing" xmlns:w10="urn:schemas-microsoft-com:office:word" xmlns:w="http://schemas.openxmlformats.org/wordprocessingml/2006/main" xmlns:w14="http://schemas.microsoft.com/office/word/2010/wordml" xmlns:w15="http://schemas.microsoft.com/office/word/2012/wordml" xmlns:w16cex="http://schemas.microsoft.com/office/word/2018/wordml/cex" xmlns:w16cid="http://schemas.microsoft.com/office/word/2016/wordml/cid" xmlns:w16="http://schemas.microsoft.com/office/word/2018/wordml" xmlns:w16du="http://schemas.microsoft.com/office/word/2023/wordml/word16du" xmlns:w16sdtdh="http://schemas.microsoft.com/office/word/2020/wordml/sdtdatahash" xmlns:w16se="http://schemas.microsoft.com/office/word/2015/wordml/symex" xmlns:wpg="http://schemas.microsoft.com/office/word/2010/wordprocessingGroup" xmlns:wpi="http://schemas.microsoft.com/office/word/2010/wordprocessingInk" xmlns:wne="http://schemas.microsoft.com/office/word/2006/wordml" xmlns:wps="http://schemas.microsoft.com/office/word/2010/wordprocessingShape" mc:Ignorable="w14 w15 w16se w16cid w16 w16cex w16sdtdh w16du wp14">
+<w:footnotes xmlns:wpc="http://schemas.microsoft.com/office/word/2010/wordprocessingCanvas" xmlns:cx="http://schemas.microsoft.com/office/drawing/2014/chartex" xmlns:cx1="http://schemas.microsoft.com/office/drawing/2015/9/8/chartex" xmlns:cx2="http://schemas.microsoft.com/office/drawing/2015/10/21/chartex" xmlns:cx3="http://schemas.microsoft.com/office/drawing/2016/5/9/chartex" xmlns:cx4="http://schemas.microsoft.com/office/drawing/2016/5/10/chartex" xmlns:cx5="http://schemas.microsoft.com/office/drawing/2016/5/11/chartex" xmlns:cx6="http://schemas.microsoft.com/office/drawing/2016/5/12/chartex" xmlns:cx7="http://schemas.microsoft.com/office/drawing/2016/5/13/chartex" xmlns:cx8="http://schemas.microsoft.com/office/drawing/2016/5/14/chartex" xmlns:mc="http://schemas.openxmlformats.org/markup-compatibility/2006" xmlns:aink="http://schemas.microsoft.com/office/drawing/2016/ink" xmlns:am3d="http://schemas.microsoft.com/office/drawing/2017/model3d" xmlns:o="urn:schemas-microsoft-com:office:office" xmlns:oel="http://schemas.microsoft.com/office/2019/extlst" xmlns:r="http://schemas.openxmlformats.org/officeDocument/2006/relationships" xmlns:m="http://schemas.openxmlformats.org/officeDocument/2006/math" xmlns:v="urn:schemas-microsoft-com:vml" xmlns:wp14="http://schemas.microsoft.com/office/word/2010/wordprocessingDrawing" xmlns:wp="http://schemas.openxmlformats.org/drawingml/2006/wordprocessingDrawing" xmlns:w10="urn:schemas-microsoft-com:office:word" xmlns:w="http://schemas.openxmlformats.org/wordprocessingml/2006/main" xmlns:w14="http://schemas.microsoft.com/office/word/2010/wordml" xmlns:w15="http://schemas.microsoft.com/office/word/2012/wordml" xmlns:w16cex="http://schemas.microsoft.com/office/word/2018/wordml/cex" xmlns:w16cid="http://schemas.microsoft.com/office/word/2016/wordml/cid" xmlns:w16="http://schemas.microsoft.com/office/word/2018/wordml" xmlns:w16du="http://schemas.microsoft.com/office/word/2023/wordml/word16du" xmlns:w16sdtdh="http://schemas.microsoft.com/office/word/2020/wordml/sdtdatahash" xmlns:w16sdtfl="http://schemas.microsoft.com/office/word/2024/wordml/sdtformatlock" xmlns:w16se="http://schemas.microsoft.com/office/word/2015/wordml/symex" xmlns:wpg="http://schemas.microsoft.com/office/word/2010/wordprocessingGroup" xmlns:wpi="http://schemas.microsoft.com/office/word/2010/wordprocessingInk" xmlns:wne="http://schemas.microsoft.com/office/word/2006/wordml" xmlns:wps="http://schemas.microsoft.com/office/word/2010/wordprocessingShape" mc:Ignorable="w14 w15 w16se w16cid w16 w16cex w16sdtdh w16sdtfl w16du wp14">
   <w:footnote w:type="separator" w:id="-1">
-    <w:p xmlns:wp14="http://schemas.microsoft.com/office/word/2010/wordml" wp14:textId="77777777">
+    <w:p>
       <w:pPr>
         <w:spacing w:after="0" w:line="240" w:lineRule="auto"/>
       </w:pPr>
@@ -1776,7 +1851,7 @@
     </w:p>
   </w:footnote>
   <w:footnote w:type="continuationSeparator" w:id="0">
-    <w:p xmlns:wp14="http://schemas.microsoft.com/office/word/2010/wordml" wp14:textId="77777777">
+    <w:p>
       <w:pPr>
         <w:spacing w:after="0" w:line="240" w:lineRule="auto"/>
       </w:pPr>
@@ -1789,8 +1864,8 @@
 </file>
 
 <file path=word/header1.xml><?xml version="1.0" encoding="utf-8"?>
-<w:hdr xmlns:wpc="http://schemas.microsoft.com/office/word/2010/wordprocessingCanvas" xmlns:cx="http://schemas.microsoft.com/office/drawing/2014/chartex" xmlns:cx1="http://schemas.microsoft.com/office/drawing/2015/9/8/chartex" xmlns:cx2="http://schemas.microsoft.com/office/drawing/2015/10/21/chartex" xmlns:cx3="http://schemas.microsoft.com/office/drawing/2016/5/9/chartex" xmlns:cx4="http://schemas.microsoft.com/office/drawing/2016/5/10/chartex" xmlns:cx5="http://schemas.microsoft.com/office/drawing/2016/5/11/chartex" xmlns:cx6="http://schemas.microsoft.com/office/drawing/2016/5/12/chartex" xmlns:cx7="http://schemas.microsoft.com/office/drawing/2016/5/13/chartex" xmlns:cx8="http://schemas.microsoft.com/office/drawing/2016/5/14/chartex" xmlns:mc="http://schemas.openxmlformats.org/markup-compatibility/2006" xmlns:aink="http://schemas.microsoft.com/office/drawing/2016/ink" xmlns:am3d="http://schemas.microsoft.com/office/drawing/2017/model3d" xmlns:o="urn:schemas-microsoft-com:office:office" xmlns:oel="http://schemas.microsoft.com/office/2019/extlst" xmlns:r="http://schemas.openxmlformats.org/officeDocument/2006/relationships" xmlns:m="http://schemas.openxmlformats.org/officeDocument/2006/math" xmlns:v="urn:schemas-microsoft-com:vml" xmlns:wp14="http://schemas.microsoft.com/office/word/2010/wordprocessingDrawing" xmlns:wp="http://schemas.openxmlformats.org/drawingml/2006/wordprocessingDrawing" xmlns:w10="urn:schemas-microsoft-com:office:word" xmlns:w="http://schemas.openxmlformats.org/wordprocessingml/2006/main" xmlns:w14="http://schemas.microsoft.com/office/word/2010/wordml" xmlns:w15="http://schemas.microsoft.com/office/word/2012/wordml" xmlns:w16cex="http://schemas.microsoft.com/office/word/2018/wordml/cex" xmlns:w16cid="http://schemas.microsoft.com/office/word/2016/wordml/cid" xmlns:w16="http://schemas.microsoft.com/office/word/2018/wordml" xmlns:w16du="http://schemas.microsoft.com/office/word/2023/wordml/word16du" xmlns:w16sdtdh="http://schemas.microsoft.com/office/word/2020/wordml/sdtdatahash" xmlns:w16se="http://schemas.microsoft.com/office/word/2015/wordml/symex" xmlns:wpg="http://schemas.microsoft.com/office/word/2010/wordprocessingGroup" xmlns:wpi="http://schemas.microsoft.com/office/word/2010/wordprocessingInk" xmlns:wne="http://schemas.microsoft.com/office/word/2006/wordml" xmlns:wps="http://schemas.microsoft.com/office/word/2010/wordprocessingShape" mc:Ignorable="w14 w15 w16se w16cid w16 w16cex w16sdtdh w16du wp14">
-  <w:p xmlns:wp14="http://schemas.microsoft.com/office/word/2010/wordml" wp14:textId="77777777">
+<w:hdr xmlns:wpc="http://schemas.microsoft.com/office/word/2010/wordprocessingCanvas" xmlns:cx="http://schemas.microsoft.com/office/drawing/2014/chartex" xmlns:cx1="http://schemas.microsoft.com/office/drawing/2015/9/8/chartex" xmlns:cx2="http://schemas.microsoft.com/office/drawing/2015/10/21/chartex" xmlns:cx3="http://schemas.microsoft.com/office/drawing/2016/5/9/chartex" xmlns:cx4="http://schemas.microsoft.com/office/drawing/2016/5/10/chartex" xmlns:cx5="http://schemas.microsoft.com/office/drawing/2016/5/11/chartex" xmlns:cx6="http://schemas.microsoft.com/office/drawing/2016/5/12/chartex" xmlns:cx7="http://schemas.microsoft.com/office/drawing/2016/5/13/chartex" xmlns:cx8="http://schemas.microsoft.com/office/drawing/2016/5/14/chartex" xmlns:mc="http://schemas.openxmlformats.org/markup-compatibility/2006" xmlns:aink="http://schemas.microsoft.com/office/drawing/2016/ink" xmlns:am3d="http://schemas.microsoft.com/office/drawing/2017/model3d" xmlns:o="urn:schemas-microsoft-com:office:office" xmlns:oel="http://schemas.microsoft.com/office/2019/extlst" xmlns:r="http://schemas.openxmlformats.org/officeDocument/2006/relationships" xmlns:m="http://schemas.openxmlformats.org/officeDocument/2006/math" xmlns:v="urn:schemas-microsoft-com:vml" xmlns:wp14="http://schemas.microsoft.com/office/word/2010/wordprocessingDrawing" xmlns:wp="http://schemas.openxmlformats.org/drawingml/2006/wordprocessingDrawing" xmlns:w10="urn:schemas-microsoft-com:office:word" xmlns:w="http://schemas.openxmlformats.org/wordprocessingml/2006/main" xmlns:w14="http://schemas.microsoft.com/office/word/2010/wordml" xmlns:w15="http://schemas.microsoft.com/office/word/2012/wordml" xmlns:w16cex="http://schemas.microsoft.com/office/word/2018/wordml/cex" xmlns:w16cid="http://schemas.microsoft.com/office/word/2016/wordml/cid" xmlns:w16="http://schemas.microsoft.com/office/word/2018/wordml" xmlns:w16du="http://schemas.microsoft.com/office/word/2023/wordml/word16du" xmlns:w16sdtdh="http://schemas.microsoft.com/office/word/2020/wordml/sdtdatahash" xmlns:w16sdtfl="http://schemas.microsoft.com/office/word/2024/wordml/sdtformatlock" xmlns:w16se="http://schemas.microsoft.com/office/word/2015/wordml/symex" xmlns:wpg="http://schemas.microsoft.com/office/word/2010/wordprocessingGroup" xmlns:wpi="http://schemas.microsoft.com/office/word/2010/wordprocessingInk" xmlns:wne="http://schemas.microsoft.com/office/word/2006/wordml" xmlns:wps="http://schemas.microsoft.com/office/word/2010/wordprocessingShape" mc:Ignorable="w14 w15 w16se w16cid w16 w16cex w16sdtdh w16sdtfl w16du wp14">
+  <w:p>
     <w:pPr>
       <w:pBdr>
         <w:top w:val="nil"/>
@@ -1813,7 +1888,7 @@
         <w:color w:val="000000"/>
       </w:rPr>
       <w:pict w14:anchorId="4332152B">
-        <v:shapetype id="_x0000_t75" coordsize="21600,21600" filled="f" stroked="f" o:spt="75" o:preferrelative="t" path="m@4@5l@4@11@9@11@9@5xe">
+        <v:shapetype id="_x0000_t75" coordsize="21600,21600" o:spt="75" o:preferrelative="t" path="m@4@5l@4@11@9@11@9@5xe" filled="f" stroked="f">
           <v:stroke joinstyle="miter"/>
           <v:formulas>
             <v:f eqn="if lineDrawn pixelLineWidth 0"/>
@@ -1829,11 +1904,11 @@
             <v:f eqn="prod @7 21600 pixelHeight"/>
             <v:f eqn="sum @10 21600 0"/>
           </v:formulas>
-          <v:path gradientshapeok="t" o:connecttype="rect" o:extrusionok="f"/>
+          <v:path o:extrusionok="f" gradientshapeok="t" o:connecttype="rect"/>
           <o:lock v:ext="edit" aspectratio="t"/>
         </v:shapetype>
-        <v:shape id="WordPictureWatermark2" style="position:absolute;margin-left:0;margin-top:0;width:467.5pt;height:330.45pt;z-index:-251657728;mso-position-horizontal:center;mso-position-horizontal-relative:margin;mso-position-vertical:center;mso-position-vertical-relative:margin" alt="" o:spid="_x0000_s2049" type="#_x0000_t75">
-          <v:imagedata gain="19661f" blacklevel="22938f" o:title="image1" r:id="rId1"/>
+        <v:shape id="WordPictureWatermark2" o:spid="_x0000_s1025" type="#_x0000_t75" alt="" style="position:absolute;margin-left:0;margin-top:0;width:467.5pt;height:330.45pt;z-index:-251657728;mso-position-horizontal:center;mso-position-horizontal-relative:margin;mso-position-vertical:center;mso-position-vertical-relative:margin">
+          <v:imagedata r:id="rId1" o:title="image1" gain="19661f" blacklevel="22938f"/>
           <w10:wrap anchorx="margin" anchory="margin"/>
         </v:shape>
       </w:pict>
@@ -1843,8 +1918,8 @@
 </file>
 
 <file path=word/header2.xml><?xml version="1.0" encoding="utf-8"?>
-<w:hdr xmlns:wpc="http://schemas.microsoft.com/office/word/2010/wordprocessingCanvas" xmlns:cx="http://schemas.microsoft.com/office/drawing/2014/chartex" xmlns:cx1="http://schemas.microsoft.com/office/drawing/2015/9/8/chartex" xmlns:cx2="http://schemas.microsoft.com/office/drawing/2015/10/21/chartex" xmlns:cx3="http://schemas.microsoft.com/office/drawing/2016/5/9/chartex" xmlns:cx4="http://schemas.microsoft.com/office/drawing/2016/5/10/chartex" xmlns:cx5="http://schemas.microsoft.com/office/drawing/2016/5/11/chartex" xmlns:cx6="http://schemas.microsoft.com/office/drawing/2016/5/12/chartex" xmlns:cx7="http://schemas.microsoft.com/office/drawing/2016/5/13/chartex" xmlns:cx8="http://schemas.microsoft.com/office/drawing/2016/5/14/chartex" xmlns:mc="http://schemas.openxmlformats.org/markup-compatibility/2006" xmlns:aink="http://schemas.microsoft.com/office/drawing/2016/ink" xmlns:am3d="http://schemas.microsoft.com/office/drawing/2017/model3d" xmlns:o="urn:schemas-microsoft-com:office:office" xmlns:oel="http://schemas.microsoft.com/office/2019/extlst" xmlns:r="http://schemas.openxmlformats.org/officeDocument/2006/relationships" xmlns:m="http://schemas.openxmlformats.org/officeDocument/2006/math" xmlns:v="urn:schemas-microsoft-com:vml" xmlns:wp14="http://schemas.microsoft.com/office/word/2010/wordprocessingDrawing" xmlns:wp="http://schemas.openxmlformats.org/drawingml/2006/wordprocessingDrawing" xmlns:w10="urn:schemas-microsoft-com:office:word" xmlns:w="http://schemas.openxmlformats.org/wordprocessingml/2006/main" xmlns:w14="http://schemas.microsoft.com/office/word/2010/wordml" xmlns:w15="http://schemas.microsoft.com/office/word/2012/wordml" xmlns:w16cex="http://schemas.microsoft.com/office/word/2018/wordml/cex" xmlns:w16cid="http://schemas.microsoft.com/office/word/2016/wordml/cid" xmlns:w16="http://schemas.microsoft.com/office/word/2018/wordml" xmlns:w16du="http://schemas.microsoft.com/office/word/2023/wordml/word16du" xmlns:w16sdtdh="http://schemas.microsoft.com/office/word/2020/wordml/sdtdatahash" xmlns:w16se="http://schemas.microsoft.com/office/word/2015/wordml/symex" xmlns:wpg="http://schemas.microsoft.com/office/word/2010/wordprocessingGroup" xmlns:wpi="http://schemas.microsoft.com/office/word/2010/wordprocessingInk" xmlns:wne="http://schemas.microsoft.com/office/word/2006/wordml" xmlns:wps="http://schemas.microsoft.com/office/word/2010/wordprocessingShape" xmlns:a="http://schemas.openxmlformats.org/drawingml/2006/main" xmlns:pic="http://schemas.openxmlformats.org/drawingml/2006/picture" mc:Ignorable="w14 w15 w16se w16cid w16 w16cex w16sdtdh w16du wp14">
-  <w:p xmlns:wp14="http://schemas.microsoft.com/office/word/2010/wordml" wp14:textId="77777777">
+<w:hdr xmlns:wpc="http://schemas.microsoft.com/office/word/2010/wordprocessingCanvas" xmlns:cx="http://schemas.microsoft.com/office/drawing/2014/chartex" xmlns:cx1="http://schemas.microsoft.com/office/drawing/2015/9/8/chartex" xmlns:cx2="http://schemas.microsoft.com/office/drawing/2015/10/21/chartex" xmlns:cx3="http://schemas.microsoft.com/office/drawing/2016/5/9/chartex" xmlns:cx4="http://schemas.microsoft.com/office/drawing/2016/5/10/chartex" xmlns:cx5="http://schemas.microsoft.com/office/drawing/2016/5/11/chartex" xmlns:cx6="http://schemas.microsoft.com/office/drawing/2016/5/12/chartex" xmlns:cx7="http://schemas.microsoft.com/office/drawing/2016/5/13/chartex" xmlns:cx8="http://schemas.microsoft.com/office/drawing/2016/5/14/chartex" xmlns:mc="http://schemas.openxmlformats.org/markup-compatibility/2006" xmlns:aink="http://schemas.microsoft.com/office/drawing/2016/ink" xmlns:am3d="http://schemas.microsoft.com/office/drawing/2017/model3d" xmlns:o="urn:schemas-microsoft-com:office:office" xmlns:oel="http://schemas.microsoft.com/office/2019/extlst" xmlns:r="http://schemas.openxmlformats.org/officeDocument/2006/relationships" xmlns:m="http://schemas.openxmlformats.org/officeDocument/2006/math" xmlns:v="urn:schemas-microsoft-com:vml" xmlns:wp14="http://schemas.microsoft.com/office/word/2010/wordprocessingDrawing" xmlns:wp="http://schemas.openxmlformats.org/drawingml/2006/wordprocessingDrawing" xmlns:w10="urn:schemas-microsoft-com:office:word" xmlns:w="http://schemas.openxmlformats.org/wordprocessingml/2006/main" xmlns:w14="http://schemas.microsoft.com/office/word/2010/wordml" xmlns:w15="http://schemas.microsoft.com/office/word/2012/wordml" xmlns:w16cex="http://schemas.microsoft.com/office/word/2018/wordml/cex" xmlns:w16cid="http://schemas.microsoft.com/office/word/2016/wordml/cid" xmlns:w16="http://schemas.microsoft.com/office/word/2018/wordml" xmlns:w16du="http://schemas.microsoft.com/office/word/2023/wordml/word16du" xmlns:w16sdtdh="http://schemas.microsoft.com/office/word/2020/wordml/sdtdatahash" xmlns:w16sdtfl="http://schemas.microsoft.com/office/word/2024/wordml/sdtformatlock" xmlns:w16se="http://schemas.microsoft.com/office/word/2015/wordml/symex" xmlns:wpg="http://schemas.microsoft.com/office/word/2010/wordprocessingGroup" xmlns:wpi="http://schemas.microsoft.com/office/word/2010/wordprocessingInk" xmlns:wne="http://schemas.microsoft.com/office/word/2006/wordml" xmlns:wps="http://schemas.microsoft.com/office/word/2010/wordprocessingShape" mc:Ignorable="w14 w15 w16se w16cid w16 w16cex w16sdtdh w16sdtfl w16du wp14">
+  <w:p>
     <w:pPr>
       <w:pBdr>
         <w:top w:val="nil"/>
@@ -1865,10 +1940,12 @@
     </w:pPr>
     <w:r>
       <w:rPr>
-        <w:color w:val="000000"/>
+        <w:rFonts w:ascii="Times New Roman"/>
+        <w:noProof/>
+        <w:sz w:val="20"/>
       </w:rPr>
-      <w:pict w14:anchorId="3D094D13">
-        <v:shapetype id="_x0000_t75" coordsize="21600,21600" filled="f" stroked="f" o:spt="75" o:preferrelative="t" path="m@4@5l@4@11@9@11@9@5xe">
+      <w:pict w14:anchorId="4B0CFF49">
+        <v:shapetype id="_x0000_t75" coordsize="21600,21600" o:spt="75" o:preferrelative="t" path="m@4@5l@4@11@9@11@9@5xe" filled="f" stroked="f">
           <v:stroke joinstyle="miter"/>
           <v:formulas>
             <v:f eqn="if lineDrawn pixelLineWidth 0"/>
@@ -1884,36 +1961,52 @@
             <v:f eqn="prod @7 21600 pixelHeight"/>
             <v:f eqn="sum @10 21600 0"/>
           </v:formulas>
-          <v:path gradientshapeok="t" o:connecttype="rect" o:extrusionok="f"/>
+          <v:path o:extrusionok="f" gradientshapeok="t" o:connecttype="rect"/>
           <o:lock v:ext="edit" aspectratio="t"/>
         </v:shapetype>
-        <v:shape id="WordPictureWatermark1" style="position:absolute;left:0;text-align:left;margin-left:0;margin-top:0;width:467.5pt;height:330.45pt;z-index:-251659776;mso-position-horizontal:center;mso-position-horizontal-relative:margin;mso-position-vertical:center;mso-position-vertical-relative:margin" alt="" o:spid="_x0000_s2051" type="#_x0000_t75">
-          <v:imagedata gain="19661f" blacklevel="22938f" o:title="image1" r:id="rId1"/>
+        <v:shape id="WordPictureWatermark179243720" o:spid="_x0000_s1030" type="#_x0000_t75" style="position:absolute;left:0;text-align:left;margin-left:-105.25pt;margin-top:-48.5pt;width:652.4pt;height:652.4pt;z-index:-251654656;mso-position-horizontal-relative:margin;mso-position-vertical-relative:margin" o:allowincell="f">
+          <v:imagedata r:id="rId1" o:title="Original SF" gain="19661f" blacklevel="22938f"/>
           <w10:wrap anchorx="margin" anchory="margin"/>
         </v:shape>
       </w:pict>
     </w:r>
     <w:r>
       <w:rPr>
+        <w:rFonts w:ascii="Times New Roman"/>
         <w:noProof/>
-        <w:color w:val="000000"/>
+        <w:sz w:val="20"/>
       </w:rPr>
       <w:drawing>
-        <wp:inline xmlns:wp14="http://schemas.microsoft.com/office/word/2010/wordprocessingDrawing" distT="0" distB="0" distL="0" distR="0" wp14:anchorId="2BF71CF8" wp14:editId="7777777">
-          <wp:extent cx="1079166" cy="762820"/>
-          <wp:effectExtent l="0" t="0" r="0" b="0"/>
-          <wp:docPr id="3" name="image1.jpg"/>
-          <wp:cNvGraphicFramePr/>
+        <wp:anchor distT="0" distB="0" distL="114300" distR="114300" simplePos="0" relativeHeight="251660800" behindDoc="1" locked="0" layoutInCell="1" allowOverlap="1" wp14:anchorId="46DBA26A" wp14:editId="22E367E0">
+          <wp:simplePos x="0" y="0"/>
+          <wp:positionH relativeFrom="column">
+            <wp:posOffset>5238750</wp:posOffset>
+          </wp:positionH>
+          <wp:positionV relativeFrom="paragraph">
+            <wp:posOffset>-635</wp:posOffset>
+          </wp:positionV>
+          <wp:extent cx="1149350" cy="607695"/>
+          <wp:effectExtent l="0" t="0" r="0" b="1905"/>
+          <wp:wrapNone/>
+          <wp:docPr id="1" name="Image 1"/>
+          <wp:cNvGraphicFramePr>
+            <a:graphicFrameLocks xmlns:a="http://schemas.openxmlformats.org/drawingml/2006/main"/>
+          </wp:cNvGraphicFramePr>
           <a:graphic xmlns:a="http://schemas.openxmlformats.org/drawingml/2006/main">
             <a:graphicData uri="http://schemas.openxmlformats.org/drawingml/2006/picture">
               <pic:pic xmlns:pic="http://schemas.openxmlformats.org/drawingml/2006/picture">
                 <pic:nvPicPr>
-                  <pic:cNvPr id="0" name="image1.jpg"/>
-                  <pic:cNvPicPr preferRelativeResize="0"/>
+                  <pic:cNvPr id="1" name="Image 1"/>
+                  <pic:cNvPicPr/>
                 </pic:nvPicPr>
                 <pic:blipFill>
-                  <a:blip r:embed="rId2"/>
-                  <a:srcRect/>
+                  <a:blip r:embed="rId2" cstate="print">
+                    <a:extLst>
+                      <a:ext uri="{28A0092B-C50C-407E-A947-70E740481C1C}">
+                        <a14:useLocalDpi xmlns:a14="http://schemas.microsoft.com/office/drawing/2010/main" val="0"/>
+                      </a:ext>
+                    </a:extLst>
+                  </a:blip>
                   <a:stretch>
                     <a:fillRect/>
                   </a:stretch>
@@ -1921,17 +2014,16 @@
                 <pic:spPr>
                   <a:xfrm>
                     <a:off x="0" y="0"/>
-                    <a:ext cx="1079166" cy="762820"/>
+                    <a:ext cx="1149350" cy="607695"/>
                   </a:xfrm>
                   <a:prstGeom prst="rect">
                     <a:avLst/>
                   </a:prstGeom>
-                  <a:ln/>
                 </pic:spPr>
               </pic:pic>
             </a:graphicData>
           </a:graphic>
-        </wp:inline>
+        </wp:anchor>
       </w:drawing>
     </w:r>
   </w:p>
@@ -1939,8 +2031,8 @@
 </file>
 
 <file path=word/header3.xml><?xml version="1.0" encoding="utf-8"?>
-<w:hdr xmlns:wpc="http://schemas.microsoft.com/office/word/2010/wordprocessingCanvas" xmlns:cx="http://schemas.microsoft.com/office/drawing/2014/chartex" xmlns:cx1="http://schemas.microsoft.com/office/drawing/2015/9/8/chartex" xmlns:cx2="http://schemas.microsoft.com/office/drawing/2015/10/21/chartex" xmlns:cx3="http://schemas.microsoft.com/office/drawing/2016/5/9/chartex" xmlns:cx4="http://schemas.microsoft.com/office/drawing/2016/5/10/chartex" xmlns:cx5="http://schemas.microsoft.com/office/drawing/2016/5/11/chartex" xmlns:cx6="http://schemas.microsoft.com/office/drawing/2016/5/12/chartex" xmlns:cx7="http://schemas.microsoft.com/office/drawing/2016/5/13/chartex" xmlns:cx8="http://schemas.microsoft.com/office/drawing/2016/5/14/chartex" xmlns:mc="http://schemas.openxmlformats.org/markup-compatibility/2006" xmlns:aink="http://schemas.microsoft.com/office/drawing/2016/ink" xmlns:am3d="http://schemas.microsoft.com/office/drawing/2017/model3d" xmlns:o="urn:schemas-microsoft-com:office:office" xmlns:oel="http://schemas.microsoft.com/office/2019/extlst" xmlns:r="http://schemas.openxmlformats.org/officeDocument/2006/relationships" xmlns:m="http://schemas.openxmlformats.org/officeDocument/2006/math" xmlns:v="urn:schemas-microsoft-com:vml" xmlns:wp14="http://schemas.microsoft.com/office/word/2010/wordprocessingDrawing" xmlns:wp="http://schemas.openxmlformats.org/drawingml/2006/wordprocessingDrawing" xmlns:w10="urn:schemas-microsoft-com:office:word" xmlns:w="http://schemas.openxmlformats.org/wordprocessingml/2006/main" xmlns:w14="http://schemas.microsoft.com/office/word/2010/wordml" xmlns:w15="http://schemas.microsoft.com/office/word/2012/wordml" xmlns:w16cex="http://schemas.microsoft.com/office/word/2018/wordml/cex" xmlns:w16cid="http://schemas.microsoft.com/office/word/2016/wordml/cid" xmlns:w16="http://schemas.microsoft.com/office/word/2018/wordml" xmlns:w16du="http://schemas.microsoft.com/office/word/2023/wordml/word16du" xmlns:w16sdtdh="http://schemas.microsoft.com/office/word/2020/wordml/sdtdatahash" xmlns:w16se="http://schemas.microsoft.com/office/word/2015/wordml/symex" xmlns:wpg="http://schemas.microsoft.com/office/word/2010/wordprocessingGroup" xmlns:wpi="http://schemas.microsoft.com/office/word/2010/wordprocessingInk" xmlns:wne="http://schemas.microsoft.com/office/word/2006/wordml" xmlns:wps="http://schemas.microsoft.com/office/word/2010/wordprocessingShape" mc:Ignorable="w14 w15 w16se w16cid w16 w16cex w16sdtdh w16du wp14">
-  <w:p xmlns:wp14="http://schemas.microsoft.com/office/word/2010/wordml" wp14:textId="77777777">
+<w:hdr xmlns:wpc="http://schemas.microsoft.com/office/word/2010/wordprocessingCanvas" xmlns:cx="http://schemas.microsoft.com/office/drawing/2014/chartex" xmlns:cx1="http://schemas.microsoft.com/office/drawing/2015/9/8/chartex" xmlns:cx2="http://schemas.microsoft.com/office/drawing/2015/10/21/chartex" xmlns:cx3="http://schemas.microsoft.com/office/drawing/2016/5/9/chartex" xmlns:cx4="http://schemas.microsoft.com/office/drawing/2016/5/10/chartex" xmlns:cx5="http://schemas.microsoft.com/office/drawing/2016/5/11/chartex" xmlns:cx6="http://schemas.microsoft.com/office/drawing/2016/5/12/chartex" xmlns:cx7="http://schemas.microsoft.com/office/drawing/2016/5/13/chartex" xmlns:cx8="http://schemas.microsoft.com/office/drawing/2016/5/14/chartex" xmlns:mc="http://schemas.openxmlformats.org/markup-compatibility/2006" xmlns:aink="http://schemas.microsoft.com/office/drawing/2016/ink" xmlns:am3d="http://schemas.microsoft.com/office/drawing/2017/model3d" xmlns:o="urn:schemas-microsoft-com:office:office" xmlns:oel="http://schemas.microsoft.com/office/2019/extlst" xmlns:r="http://schemas.openxmlformats.org/officeDocument/2006/relationships" xmlns:m="http://schemas.openxmlformats.org/officeDocument/2006/math" xmlns:v="urn:schemas-microsoft-com:vml" xmlns:wp14="http://schemas.microsoft.com/office/word/2010/wordprocessingDrawing" xmlns:wp="http://schemas.openxmlformats.org/drawingml/2006/wordprocessingDrawing" xmlns:w10="urn:schemas-microsoft-com:office:word" xmlns:w="http://schemas.openxmlformats.org/wordprocessingml/2006/main" xmlns:w14="http://schemas.microsoft.com/office/word/2010/wordml" xmlns:w15="http://schemas.microsoft.com/office/word/2012/wordml" xmlns:w16cex="http://schemas.microsoft.com/office/word/2018/wordml/cex" xmlns:w16cid="http://schemas.microsoft.com/office/word/2016/wordml/cid" xmlns:w16="http://schemas.microsoft.com/office/word/2018/wordml" xmlns:w16du="http://schemas.microsoft.com/office/word/2023/wordml/word16du" xmlns:w16sdtdh="http://schemas.microsoft.com/office/word/2020/wordml/sdtdatahash" xmlns:w16sdtfl="http://schemas.microsoft.com/office/word/2024/wordml/sdtformatlock" xmlns:w16se="http://schemas.microsoft.com/office/word/2015/wordml/symex" xmlns:wpg="http://schemas.microsoft.com/office/word/2010/wordprocessingGroup" xmlns:wpi="http://schemas.microsoft.com/office/word/2010/wordprocessingInk" xmlns:wne="http://schemas.microsoft.com/office/word/2006/wordml" xmlns:wps="http://schemas.microsoft.com/office/word/2010/wordprocessingShape" mc:Ignorable="w14 w15 w16se w16cid w16 w16cex w16sdtdh w16sdtfl w16du wp14">
+  <w:p>
     <w:pPr>
       <w:pBdr>
         <w:top w:val="nil"/>
@@ -1963,7 +2055,7 @@
         <w:color w:val="000000"/>
       </w:rPr>
       <w:pict w14:anchorId="0FE335AC">
-        <v:shapetype id="_x0000_t75" coordsize="21600,21600" filled="f" stroked="f" o:spt="75" o:preferrelative="t" path="m@4@5l@4@11@9@11@9@5xe">
+        <v:shapetype id="_x0000_t75" coordsize="21600,21600" o:spt="75" o:preferrelative="t" path="m@4@5l@4@11@9@11@9@5xe" filled="f" stroked="f">
           <v:stroke joinstyle="miter"/>
           <v:formulas>
             <v:f eqn="if lineDrawn pixelLineWidth 0"/>
@@ -1979,11 +2071,11 @@
             <v:f eqn="prod @7 21600 pixelHeight"/>
             <v:f eqn="sum @10 21600 0"/>
           </v:formulas>
-          <v:path gradientshapeok="t" o:connecttype="rect" o:extrusionok="f"/>
+          <v:path o:extrusionok="f" gradientshapeok="t" o:connecttype="rect"/>
           <o:lock v:ext="edit" aspectratio="t"/>
         </v:shapetype>
-        <v:shape id="WordPictureWatermark3" style="position:absolute;margin-left:0;margin-top:0;width:467.5pt;height:330.45pt;z-index:-251658752;mso-position-horizontal:center;mso-position-horizontal-relative:margin;mso-position-vertical:center;mso-position-vertical-relative:margin" alt="" o:spid="_x0000_s2050" type="#_x0000_t75">
-          <v:imagedata gain="19661f" blacklevel="22938f" o:title="image1" r:id="rId1"/>
+        <v:shape id="WordPictureWatermark3" o:spid="_x0000_s1026" type="#_x0000_t75" alt="" style="position:absolute;margin-left:0;margin-top:0;width:467.5pt;height:330.45pt;z-index:-251658752;mso-position-horizontal:center;mso-position-horizontal-relative:margin;mso-position-vertical:center;mso-position-vertical-relative:margin">
+          <v:imagedata r:id="rId1" o:title="image1" gain="19661f" blacklevel="22938f"/>
           <w10:wrap anchorx="margin" anchory="margin"/>
         </v:shape>
       </w:pict>
@@ -1993,7 +2085,7 @@
 </file>
 
 <file path=word/numbering.xml><?xml version="1.0" encoding="utf-8"?>
-<w:numbering xmlns:wpc="http://schemas.microsoft.com/office/word/2010/wordprocessingCanvas" xmlns:cx="http://schemas.microsoft.com/office/drawing/2014/chartex" xmlns:cx1="http://schemas.microsoft.com/office/drawing/2015/9/8/chartex" xmlns:cx2="http://schemas.microsoft.com/office/drawing/2015/10/21/chartex" xmlns:cx3="http://schemas.microsoft.com/office/drawing/2016/5/9/chartex" xmlns:cx4="http://schemas.microsoft.com/office/drawing/2016/5/10/chartex" xmlns:cx5="http://schemas.microsoft.com/office/drawing/2016/5/11/chartex" xmlns:cx6="http://schemas.microsoft.com/office/drawing/2016/5/12/chartex" xmlns:cx7="http://schemas.microsoft.com/office/drawing/2016/5/13/chartex" xmlns:cx8="http://schemas.microsoft.com/office/drawing/2016/5/14/chartex" xmlns:mc="http://schemas.openxmlformats.org/markup-compatibility/2006" xmlns:aink="http://schemas.microsoft.com/office/drawing/2016/ink" xmlns:am3d="http://schemas.microsoft.com/office/drawing/2017/model3d" xmlns:o="urn:schemas-microsoft-com:office:office" xmlns:oel="http://schemas.microsoft.com/office/2019/extlst" xmlns:r="http://schemas.openxmlformats.org/officeDocument/2006/relationships" xmlns:m="http://schemas.openxmlformats.org/officeDocument/2006/math" xmlns:v="urn:schemas-microsoft-com:vml" xmlns:wp14="http://schemas.microsoft.com/office/word/2010/wordprocessingDrawing" xmlns:wp="http://schemas.openxmlformats.org/drawingml/2006/wordprocessingDrawing" xmlns:w10="urn:schemas-microsoft-com:office:word" xmlns:w="http://schemas.openxmlformats.org/wordprocessingml/2006/main" xmlns:w14="http://schemas.microsoft.com/office/word/2010/wordml" xmlns:w15="http://schemas.microsoft.com/office/word/2012/wordml" xmlns:w16cex="http://schemas.microsoft.com/office/word/2018/wordml/cex" xmlns:w16cid="http://schemas.microsoft.com/office/word/2016/wordml/cid" xmlns:w16="http://schemas.microsoft.com/office/word/2018/wordml" xmlns:w16du="http://schemas.microsoft.com/office/word/2023/wordml/word16du" xmlns:w16sdtdh="http://schemas.microsoft.com/office/word/2020/wordml/sdtdatahash" xmlns:w16se="http://schemas.microsoft.com/office/word/2015/wordml/symex" xmlns:wpg="http://schemas.microsoft.com/office/word/2010/wordprocessingGroup" xmlns:wpi="http://schemas.microsoft.com/office/word/2010/wordprocessingInk" xmlns:wne="http://schemas.microsoft.com/office/word/2006/wordml" xmlns:wps="http://schemas.microsoft.com/office/word/2010/wordprocessingShape" mc:Ignorable="w14 w15 w16se w16cid w16 w16cex w16sdtdh w16du wp14">
+<w:numbering xmlns:wpc="http://schemas.microsoft.com/office/word/2010/wordprocessingCanvas" xmlns:cx="http://schemas.microsoft.com/office/drawing/2014/chartex" xmlns:cx1="http://schemas.microsoft.com/office/drawing/2015/9/8/chartex" xmlns:cx2="http://schemas.microsoft.com/office/drawing/2015/10/21/chartex" xmlns:cx3="http://schemas.microsoft.com/office/drawing/2016/5/9/chartex" xmlns:cx4="http://schemas.microsoft.com/office/drawing/2016/5/10/chartex" xmlns:cx5="http://schemas.microsoft.com/office/drawing/2016/5/11/chartex" xmlns:cx6="http://schemas.microsoft.com/office/drawing/2016/5/12/chartex" xmlns:cx7="http://schemas.microsoft.com/office/drawing/2016/5/13/chartex" xmlns:cx8="http://schemas.microsoft.com/office/drawing/2016/5/14/chartex" xmlns:mc="http://schemas.openxmlformats.org/markup-compatibility/2006" xmlns:aink="http://schemas.microsoft.com/office/drawing/2016/ink" xmlns:am3d="http://schemas.microsoft.com/office/drawing/2017/model3d" xmlns:o="urn:schemas-microsoft-com:office:office" xmlns:oel="http://schemas.microsoft.com/office/2019/extlst" xmlns:r="http://schemas.openxmlformats.org/officeDocument/2006/relationships" xmlns:m="http://schemas.openxmlformats.org/officeDocument/2006/math" xmlns:v="urn:schemas-microsoft-com:vml" xmlns:wp14="http://schemas.microsoft.com/office/word/2010/wordprocessingDrawing" xmlns:wp="http://schemas.openxmlformats.org/drawingml/2006/wordprocessingDrawing" xmlns:w10="urn:schemas-microsoft-com:office:word" xmlns:w="http://schemas.openxmlformats.org/wordprocessingml/2006/main" xmlns:w14="http://schemas.microsoft.com/office/word/2010/wordml" xmlns:w15="http://schemas.microsoft.com/office/word/2012/wordml" xmlns:w16cex="http://schemas.microsoft.com/office/word/2018/wordml/cex" xmlns:w16cid="http://schemas.microsoft.com/office/word/2016/wordml/cid" xmlns:w16="http://schemas.microsoft.com/office/word/2018/wordml" xmlns:w16du="http://schemas.microsoft.com/office/word/2023/wordml/word16du" xmlns:w16sdtdh="http://schemas.microsoft.com/office/word/2020/wordml/sdtdatahash" xmlns:w16sdtfl="http://schemas.microsoft.com/office/word/2024/wordml/sdtformatlock" xmlns:w16se="http://schemas.microsoft.com/office/word/2015/wordml/symex" xmlns:wpg="http://schemas.microsoft.com/office/word/2010/wordprocessingGroup" xmlns:wpi="http://schemas.microsoft.com/office/word/2010/wordprocessingInk" xmlns:wne="http://schemas.microsoft.com/office/word/2006/wordml" xmlns:wps="http://schemas.microsoft.com/office/word/2010/wordprocessingShape" mc:Ignorable="w14 w15 w16se w16cid w16 w16cex w16sdtdh w16sdtfl w16du wp14">
   <w:abstractNum w:abstractNumId="0" w15:restartNumberingAfterBreak="0">
     <w:nsid w:val="181A475C"/>
     <w:multiLevelType w:val="multilevel"/>
@@ -2007,7 +2099,7 @@
         <w:ind w:left="720" w:hanging="360"/>
       </w:pPr>
       <w:rPr>
-        <w:rFonts w:ascii="Noto Sans Symbols" w:hAnsi="Noto Sans Symbols" w:eastAsia="Noto Sans Symbols" w:cs="Noto Sans Symbols"/>
+        <w:rFonts w:ascii="Noto Sans Symbols" w:eastAsia="Noto Sans Symbols" w:hAnsi="Noto Sans Symbols" w:cs="Noto Sans Symbols"/>
       </w:rPr>
     </w:lvl>
     <w:lvl w:ilvl="1">
@@ -2019,7 +2111,7 @@
         <w:ind w:left="1440" w:hanging="360"/>
       </w:pPr>
       <w:rPr>
-        <w:rFonts w:ascii="Courier New" w:hAnsi="Courier New" w:eastAsia="Courier New" w:cs="Courier New"/>
+        <w:rFonts w:ascii="Courier New" w:eastAsia="Courier New" w:hAnsi="Courier New" w:cs="Courier New"/>
       </w:rPr>
     </w:lvl>
     <w:lvl w:ilvl="2">
@@ -2031,7 +2123,7 @@
         <w:ind w:left="2160" w:hanging="360"/>
       </w:pPr>
       <w:rPr>
-        <w:rFonts w:ascii="Noto Sans Symbols" w:hAnsi="Noto Sans Symbols" w:eastAsia="Noto Sans Symbols" w:cs="Noto Sans Symbols"/>
+        <w:rFonts w:ascii="Noto Sans Symbols" w:eastAsia="Noto Sans Symbols" w:hAnsi="Noto Sans Symbols" w:cs="Noto Sans Symbols"/>
       </w:rPr>
     </w:lvl>
     <w:lvl w:ilvl="3">
@@ -2043,7 +2135,7 @@
         <w:ind w:left="2880" w:hanging="360"/>
       </w:pPr>
       <w:rPr>
-        <w:rFonts w:ascii="Noto Sans Symbols" w:hAnsi="Noto Sans Symbols" w:eastAsia="Noto Sans Symbols" w:cs="Noto Sans Symbols"/>
+        <w:rFonts w:ascii="Noto Sans Symbols" w:eastAsia="Noto Sans Symbols" w:hAnsi="Noto Sans Symbols" w:cs="Noto Sans Symbols"/>
       </w:rPr>
     </w:lvl>
     <w:lvl w:ilvl="4">
@@ -2055,7 +2147,7 @@
         <w:ind w:left="3600" w:hanging="360"/>
       </w:pPr>
       <w:rPr>
-        <w:rFonts w:ascii="Courier New" w:hAnsi="Courier New" w:eastAsia="Courier New" w:cs="Courier New"/>
+        <w:rFonts w:ascii="Courier New" w:eastAsia="Courier New" w:hAnsi="Courier New" w:cs="Courier New"/>
       </w:rPr>
     </w:lvl>
     <w:lvl w:ilvl="5">
@@ -2067,7 +2159,7 @@
         <w:ind w:left="4320" w:hanging="360"/>
       </w:pPr>
       <w:rPr>
-        <w:rFonts w:ascii="Noto Sans Symbols" w:hAnsi="Noto Sans Symbols" w:eastAsia="Noto Sans Symbols" w:cs="Noto Sans Symbols"/>
+        <w:rFonts w:ascii="Noto Sans Symbols" w:eastAsia="Noto Sans Symbols" w:hAnsi="Noto Sans Symbols" w:cs="Noto Sans Symbols"/>
       </w:rPr>
     </w:lvl>
     <w:lvl w:ilvl="6">
@@ -2079,7 +2171,7 @@
         <w:ind w:left="5040" w:hanging="360"/>
       </w:pPr>
       <w:rPr>
-        <w:rFonts w:ascii="Noto Sans Symbols" w:hAnsi="Noto Sans Symbols" w:eastAsia="Noto Sans Symbols" w:cs="Noto Sans Symbols"/>
+        <w:rFonts w:ascii="Noto Sans Symbols" w:eastAsia="Noto Sans Symbols" w:hAnsi="Noto Sans Symbols" w:cs="Noto Sans Symbols"/>
       </w:rPr>
     </w:lvl>
     <w:lvl w:ilvl="7">
@@ -2091,7 +2183,7 @@
         <w:ind w:left="5760" w:hanging="360"/>
       </w:pPr>
       <w:rPr>
-        <w:rFonts w:ascii="Courier New" w:hAnsi="Courier New" w:eastAsia="Courier New" w:cs="Courier New"/>
+        <w:rFonts w:ascii="Courier New" w:eastAsia="Courier New" w:hAnsi="Courier New" w:cs="Courier New"/>
       </w:rPr>
     </w:lvl>
     <w:lvl w:ilvl="8">
@@ -2103,7 +2195,7 @@
         <w:ind w:left="6480" w:hanging="360"/>
       </w:pPr>
       <w:rPr>
-        <w:rFonts w:ascii="Noto Sans Symbols" w:hAnsi="Noto Sans Symbols" w:eastAsia="Noto Sans Symbols" w:cs="Noto Sans Symbols"/>
+        <w:rFonts w:ascii="Noto Sans Symbols" w:eastAsia="Noto Sans Symbols" w:hAnsi="Noto Sans Symbols" w:cs="Noto Sans Symbols"/>
       </w:rPr>
     </w:lvl>
   </w:abstractNum>
@@ -2114,11 +2206,11 @@
 </file>
 
 <file path=word/styles.xml><?xml version="1.0" encoding="utf-8"?>
-<w:styles xmlns:wp14="http://schemas.microsoft.com/office/word/2010/wordprocessingDrawing" xmlns:mc="http://schemas.openxmlformats.org/markup-compatibility/2006" xmlns:r="http://schemas.openxmlformats.org/officeDocument/2006/relationships" xmlns:w="http://schemas.openxmlformats.org/wordprocessingml/2006/main" xmlns:w14="http://schemas.microsoft.com/office/word/2010/wordml" xmlns:w15="http://schemas.microsoft.com/office/word/2012/wordml" xmlns:w16cex="http://schemas.microsoft.com/office/word/2018/wordml/cex" xmlns:w16cid="http://schemas.microsoft.com/office/word/2016/wordml/cid" xmlns:w16="http://schemas.microsoft.com/office/word/2018/wordml" xmlns:w16du="http://schemas.microsoft.com/office/word/2023/wordml/word16du" xmlns:w16sdtdh="http://schemas.microsoft.com/office/word/2020/wordml/sdtdatahash" xmlns:w16se="http://schemas.microsoft.com/office/word/2015/wordml/symex" mc:Ignorable="w14 w15 w16se w16cid w16 w16cex w16sdtdh w16du wp14">
+<w:styles xmlns:mc="http://schemas.openxmlformats.org/markup-compatibility/2006" xmlns:r="http://schemas.openxmlformats.org/officeDocument/2006/relationships" xmlns:w="http://schemas.openxmlformats.org/wordprocessingml/2006/main" xmlns:w14="http://schemas.microsoft.com/office/word/2010/wordml" xmlns:w15="http://schemas.microsoft.com/office/word/2012/wordml" xmlns:w16cex="http://schemas.microsoft.com/office/word/2018/wordml/cex" xmlns:w16cid="http://schemas.microsoft.com/office/word/2016/wordml/cid" xmlns:w16="http://schemas.microsoft.com/office/word/2018/wordml" xmlns:w16du="http://schemas.microsoft.com/office/word/2023/wordml/word16du" xmlns:w16sdtdh="http://schemas.microsoft.com/office/word/2020/wordml/sdtdatahash" xmlns:w16sdtfl="http://schemas.microsoft.com/office/word/2024/wordml/sdtformatlock" xmlns:w16se="http://schemas.microsoft.com/office/word/2015/wordml/symex" mc:Ignorable="w14 w15 w16se w16cid w16 w16cex w16sdtdh w16sdtfl w16du">
   <w:docDefaults>
     <w:rPrDefault>
       <w:rPr>
-        <w:rFonts w:ascii="Calibri" w:hAnsi="Calibri" w:eastAsia="Calibri" w:cs="Calibri"/>
+        <w:rFonts w:ascii="Calibri" w:eastAsia="Calibri" w:hAnsi="Calibri" w:cs="Calibri"/>
         <w:sz w:val="22"/>
         <w:szCs w:val="22"/>
         <w:lang w:val="es-CO" w:eastAsia="ja-JP" w:bidi="ar-SA"/>
@@ -2133,14 +2225,14 @@
   <w:latentStyles w:defLockedState="0" w:defUIPriority="99" w:defSemiHidden="0" w:defUnhideWhenUsed="0" w:defQFormat="0" w:count="376">
     <w:lsdException w:name="Normal" w:uiPriority="0" w:qFormat="1"/>
     <w:lsdException w:name="heading 1" w:uiPriority="9" w:qFormat="1"/>
-    <w:lsdException w:name="heading 2" w:uiPriority="9" w:semiHidden="1" w:unhideWhenUsed="1" w:qFormat="1"/>
-    <w:lsdException w:name="heading 3" w:uiPriority="9" w:semiHidden="1" w:unhideWhenUsed="1" w:qFormat="1"/>
-    <w:lsdException w:name="heading 4" w:uiPriority="9" w:semiHidden="1" w:unhideWhenUsed="1" w:qFormat="1"/>
-    <w:lsdException w:name="heading 5" w:uiPriority="9" w:semiHidden="1" w:unhideWhenUsed="1" w:qFormat="1"/>
-    <w:lsdException w:name="heading 6" w:uiPriority="9" w:semiHidden="1" w:unhideWhenUsed="1" w:qFormat="1"/>
-    <w:lsdException w:name="heading 7" w:uiPriority="9" w:semiHidden="1" w:unhideWhenUsed="1" w:qFormat="1"/>
-    <w:lsdException w:name="heading 8" w:uiPriority="9" w:semiHidden="1" w:unhideWhenUsed="1" w:qFormat="1"/>
-    <w:lsdException w:name="heading 9" w:uiPriority="9" w:semiHidden="1" w:unhideWhenUsed="1" w:qFormat="1"/>
+    <w:lsdException w:name="heading 2" w:semiHidden="1" w:uiPriority="9" w:unhideWhenUsed="1" w:qFormat="1"/>
+    <w:lsdException w:name="heading 3" w:semiHidden="1" w:uiPriority="9" w:unhideWhenUsed="1" w:qFormat="1"/>
+    <w:lsdException w:name="heading 4" w:semiHidden="1" w:uiPriority="9" w:unhideWhenUsed="1" w:qFormat="1"/>
+    <w:lsdException w:name="heading 5" w:semiHidden="1" w:uiPriority="9" w:unhideWhenUsed="1" w:qFormat="1"/>
+    <w:lsdException w:name="heading 6" w:semiHidden="1" w:uiPriority="9" w:unhideWhenUsed="1" w:qFormat="1"/>
+    <w:lsdException w:name="heading 7" w:semiHidden="1" w:uiPriority="9" w:unhideWhenUsed="1" w:qFormat="1"/>
+    <w:lsdException w:name="heading 8" w:semiHidden="1" w:uiPriority="9" w:unhideWhenUsed="1" w:qFormat="1"/>
+    <w:lsdException w:name="heading 9" w:semiHidden="1" w:uiPriority="9" w:unhideWhenUsed="1" w:qFormat="1"/>
     <w:lsdException w:name="index 1" w:semiHidden="1" w:unhideWhenUsed="1"/>
     <w:lsdException w:name="index 2" w:semiHidden="1" w:unhideWhenUsed="1"/>
     <w:lsdException w:name="index 3" w:semiHidden="1" w:unhideWhenUsed="1"/>
@@ -2150,22 +2242,22 @@
     <w:lsdException w:name="index 7" w:semiHidden="1" w:unhideWhenUsed="1"/>
     <w:lsdException w:name="index 8" w:semiHidden="1" w:unhideWhenUsed="1"/>
     <w:lsdException w:name="index 9" w:semiHidden="1" w:unhideWhenUsed="1"/>
-    <w:lsdException w:name="toc 1" w:uiPriority="39" w:semiHidden="1" w:unhideWhenUsed="1"/>
-    <w:lsdException w:name="toc 2" w:uiPriority="39" w:semiHidden="1" w:unhideWhenUsed="1"/>
-    <w:lsdException w:name="toc 3" w:uiPriority="39" w:semiHidden="1" w:unhideWhenUsed="1"/>
-    <w:lsdException w:name="toc 4" w:uiPriority="39" w:semiHidden="1" w:unhideWhenUsed="1"/>
-    <w:lsdException w:name="toc 5" w:uiPriority="39" w:semiHidden="1" w:unhideWhenUsed="1"/>
-    <w:lsdException w:name="toc 6" w:uiPriority="39" w:semiHidden="1" w:unhideWhenUsed="1"/>
-    <w:lsdException w:name="toc 7" w:uiPriority="39" w:semiHidden="1" w:unhideWhenUsed="1"/>
-    <w:lsdException w:name="toc 8" w:uiPriority="39" w:semiHidden="1" w:unhideWhenUsed="1"/>
-    <w:lsdException w:name="toc 9" w:uiPriority="39" w:semiHidden="1" w:unhideWhenUsed="1"/>
+    <w:lsdException w:name="toc 1" w:semiHidden="1" w:uiPriority="39" w:unhideWhenUsed="1"/>
+    <w:lsdException w:name="toc 2" w:semiHidden="1" w:uiPriority="39" w:unhideWhenUsed="1"/>
+    <w:lsdException w:name="toc 3" w:semiHidden="1" w:uiPriority="39" w:unhideWhenUsed="1"/>
+    <w:lsdException w:name="toc 4" w:semiHidden="1" w:uiPriority="39" w:unhideWhenUsed="1"/>
+    <w:lsdException w:name="toc 5" w:semiHidden="1" w:uiPriority="39" w:unhideWhenUsed="1"/>
+    <w:lsdException w:name="toc 6" w:semiHidden="1" w:uiPriority="39" w:unhideWhenUsed="1"/>
+    <w:lsdException w:name="toc 7" w:semiHidden="1" w:uiPriority="39" w:unhideWhenUsed="1"/>
+    <w:lsdException w:name="toc 8" w:semiHidden="1" w:uiPriority="39" w:unhideWhenUsed="1"/>
+    <w:lsdException w:name="toc 9" w:semiHidden="1" w:uiPriority="39" w:unhideWhenUsed="1"/>
     <w:lsdException w:name="Normal Indent" w:semiHidden="1" w:unhideWhenUsed="1"/>
     <w:lsdException w:name="footnote text" w:semiHidden="1" w:unhideWhenUsed="1"/>
     <w:lsdException w:name="annotation text" w:semiHidden="1" w:unhideWhenUsed="1"/>
     <w:lsdException w:name="header" w:semiHidden="1" w:unhideWhenUsed="1"/>
     <w:lsdException w:name="footer" w:semiHidden="1" w:unhideWhenUsed="1"/>
     <w:lsdException w:name="index heading" w:semiHidden="1" w:unhideWhenUsed="1"/>
-    <w:lsdException w:name="caption" w:uiPriority="35" w:semiHidden="1" w:unhideWhenUsed="1" w:qFormat="1"/>
+    <w:lsdException w:name="caption" w:semiHidden="1" w:uiPriority="35" w:unhideWhenUsed="1" w:qFormat="1"/>
     <w:lsdException w:name="table of figures" w:semiHidden="1" w:unhideWhenUsed="1"/>
     <w:lsdException w:name="envelope address" w:semiHidden="1" w:unhideWhenUsed="1"/>
     <w:lsdException w:name="envelope return" w:semiHidden="1" w:unhideWhenUsed="1"/>
@@ -2196,7 +2288,7 @@
     <w:lsdException w:name="Title" w:uiPriority="10" w:qFormat="1"/>
     <w:lsdException w:name="Closing" w:semiHidden="1" w:unhideWhenUsed="1"/>
     <w:lsdException w:name="Signature" w:semiHidden="1" w:unhideWhenUsed="1"/>
-    <w:lsdException w:name="Default Paragraph Font" w:uiPriority="1" w:semiHidden="1" w:unhideWhenUsed="1"/>
+    <w:lsdException w:name="Default Paragraph Font" w:semiHidden="1" w:uiPriority="1" w:unhideWhenUsed="1"/>
     <w:lsdException w:name="Body Text" w:semiHidden="1" w:unhideWhenUsed="1"/>
     <w:lsdException w:name="Body Text Indent" w:semiHidden="1" w:unhideWhenUsed="1"/>
     <w:lsdException w:name="List Continue" w:semiHidden="1" w:unhideWhenUsed="1"/>
@@ -2396,8 +2488,8 @@
     <w:lsdException w:name="Subtle Reference" w:uiPriority="31" w:qFormat="1"/>
     <w:lsdException w:name="Intense Reference" w:uiPriority="32" w:qFormat="1"/>
     <w:lsdException w:name="Book Title" w:uiPriority="33" w:qFormat="1"/>
-    <w:lsdException w:name="Bibliography" w:uiPriority="37" w:semiHidden="1" w:unhideWhenUsed="1"/>
-    <w:lsdException w:name="TOC Heading" w:uiPriority="39" w:semiHidden="1" w:unhideWhenUsed="1" w:qFormat="1"/>
+    <w:lsdException w:name="Bibliography" w:semiHidden="1" w:uiPriority="37" w:unhideWhenUsed="1"/>
+    <w:lsdException w:name="TOC Heading" w:semiHidden="1" w:uiPriority="39" w:unhideWhenUsed="1" w:qFormat="1"/>
     <w:lsdException w:name="Plain Table 1" w:uiPriority="41"/>
     <w:lsdException w:name="Plain Table 2" w:uiPriority="42"/>
     <w:lsdException w:name="Plain Table 3" w:uiPriority="43"/>
@@ -2508,7 +2600,7 @@
     <w:lsdException w:name="Unresolved Mention" w:semiHidden="1" w:unhideWhenUsed="1"/>
     <w:lsdException w:name="Smart Link" w:semiHidden="1" w:unhideWhenUsed="1"/>
   </w:latentStyles>
-  <w:style w:type="paragraph" w:styleId="Normal" w:default="1">
+  <w:style w:type="paragraph" w:default="1" w:styleId="Normal">
     <w:name w:val="Normal"/>
     <w:qFormat/>
   </w:style>
@@ -2628,13 +2720,13 @@
       <w:szCs w:val="20"/>
     </w:rPr>
   </w:style>
-  <w:style w:type="character" w:styleId="Fuentedeprrafopredeter" w:default="1">
+  <w:style w:type="character" w:default="1" w:styleId="Fuentedeprrafopredeter">
     <w:name w:val="Default Paragraph Font"/>
     <w:uiPriority w:val="1"/>
     <w:semiHidden/>
     <w:unhideWhenUsed/>
   </w:style>
-  <w:style w:type="table" w:styleId="Tablanormal" w:default="1">
+  <w:style w:type="table" w:default="1" w:styleId="Tablanormal">
     <w:name w:val="Normal Table"/>
     <w:uiPriority w:val="99"/>
     <w:semiHidden/>
@@ -2649,13 +2741,13 @@
       </w:tblCellMar>
     </w:tblPr>
   </w:style>
-  <w:style w:type="numbering" w:styleId="Sinlista" w:default="1">
+  <w:style w:type="numbering" w:default="1" w:styleId="Sinlista">
     <w:name w:val="No List"/>
     <w:uiPriority w:val="99"/>
     <w:semiHidden/>
     <w:unhideWhenUsed/>
   </w:style>
-  <w:style w:type="table" w:styleId="TableNormal" w:customStyle="1">
+  <w:style w:type="table" w:customStyle="1" w:styleId="TableNormal">
     <w:name w:val="Table Normal"/>
     <w:tblPr>
       <w:tblCellMar>
@@ -2698,7 +2790,7 @@
       <w:spacing w:after="0" w:line="240" w:lineRule="auto"/>
     </w:pPr>
   </w:style>
-  <w:style w:type="character" w:styleId="EncabezadoCar" w:customStyle="1">
+  <w:style w:type="character" w:customStyle="1" w:styleId="EncabezadoCar">
     <w:name w:val="Encabezado Car"/>
     <w:basedOn w:val="Fuentedeprrafopredeter"/>
     <w:link w:val="Encabezado"/>
@@ -2720,7 +2812,7 @@
       <w:spacing w:after="0" w:line="240" w:lineRule="auto"/>
     </w:pPr>
   </w:style>
-  <w:style w:type="character" w:styleId="PiedepginaCar" w:customStyle="1">
+  <w:style w:type="character" w:customStyle="1" w:styleId="PiedepginaCar">
     <w:name w:val="Pie de página Car"/>
     <w:basedOn w:val="Fuentedeprrafopredeter"/>
     <w:link w:val="Piedepgina"/>
@@ -2744,7 +2836,7 @@
       <w:szCs w:val="16"/>
     </w:rPr>
   </w:style>
-  <w:style w:type="character" w:styleId="TextodegloboCar" w:customStyle="1">
+  <w:style w:type="character" w:customStyle="1" w:styleId="TextodegloboCar">
     <w:name w:val="Texto de globo Car"/>
     <w:basedOn w:val="Fuentedeprrafopredeter"/>
     <w:link w:val="Textodeglobo"/>
@@ -2778,12 +2870,12 @@
     </w:pPr>
     <w:tblPr>
       <w:tblBorders>
-        <w:top w:val="single" w:color="auto" w:sz="4" w:space="0"/>
-        <w:left w:val="single" w:color="auto" w:sz="4" w:space="0"/>
-        <w:bottom w:val="single" w:color="auto" w:sz="4" w:space="0"/>
-        <w:right w:val="single" w:color="auto" w:sz="4" w:space="0"/>
-        <w:insideH w:val="single" w:color="auto" w:sz="4" w:space="0"/>
-        <w:insideV w:val="single" w:color="auto" w:sz="4" w:space="0"/>
+        <w:top w:val="single" w:sz="4" w:space="0" w:color="auto"/>
+        <w:left w:val="single" w:sz="4" w:space="0" w:color="auto"/>
+        <w:bottom w:val="single" w:sz="4" w:space="0" w:color="auto"/>
+        <w:right w:val="single" w:sz="4" w:space="0" w:color="auto"/>
+        <w:insideH w:val="single" w:sz="4" w:space="0" w:color="auto"/>
+        <w:insideV w:val="single" w:sz="4" w:space="0" w:color="auto"/>
       </w:tblBorders>
     </w:tblPr>
   </w:style>
@@ -2801,7 +2893,7 @@
       <w:lang w:val="es-ES"/>
     </w:rPr>
   </w:style>
-  <w:style w:type="paragraph" w:styleId="Default" w:customStyle="1">
+  <w:style w:type="paragraph" w:customStyle="1" w:styleId="Default">
     <w:name w:val="Default"/>
     <w:rsid w:val="0040144B"/>
     <w:pPr>
@@ -2817,7 +2909,7 @@
       <w:szCs w:val="24"/>
     </w:rPr>
   </w:style>
-  <w:style w:type="character" w:styleId="x-2003744227contentpasted1" w:customStyle="1">
+  <w:style w:type="character" w:customStyle="1" w:styleId="x-2003744227contentpasted1">
     <w:name w:val="x_-2003744227contentpasted1"/>
     <w:basedOn w:val="Fuentedeprrafopredeter"/>
     <w:rsid w:val="003A4595"/>
@@ -2834,22 +2926,20 @@
       <w:spacing w:before="360" w:after="80"/>
     </w:pPr>
     <w:rPr>
-      <w:rFonts w:ascii="Georgia" w:hAnsi="Georgia" w:eastAsia="Georgia" w:cs="Georgia"/>
+      <w:rFonts w:ascii="Georgia" w:eastAsia="Georgia" w:hAnsi="Georgia" w:cs="Georgia"/>
       <w:i/>
       <w:color w:val="666666"/>
       <w:sz w:val="48"/>
       <w:szCs w:val="48"/>
     </w:rPr>
   </w:style>
-  <w:style w:type="table" w:styleId="a" w:customStyle="1">
+  <w:style w:type="table" w:customStyle="1" w:styleId="a">
     <w:basedOn w:val="TableNormal"/>
     <w:tblPr>
       <w:tblStyleRowBandSize w:val="1"/>
       <w:tblStyleColBandSize w:val="1"/>
       <w:tblCellMar>
-        <w:top w:w="0" w:type="dxa"/>
         <w:left w:w="70" w:type="dxa"/>
-        <w:bottom w:w="0" w:type="dxa"/>
         <w:right w:w="70" w:type="dxa"/>
       </w:tblCellMar>
     </w:tblPr>
@@ -3151,8 +3241,8 @@
 <file path=customXml/itemProps1.xml><?xml version="1.0" encoding="utf-8"?>
 <ds:datastoreItem xmlns:ds="http://schemas.openxmlformats.org/officeDocument/2006/customXml" ds:itemID="{11111111-1234-1234-1234-123412341234}">
   <ds:schemaRefs>
+    <ds:schemaRef ds:uri="http://customooxmlschemas.google.com/"/>
     <ds:schemaRef ds:uri="http://schemas.openxmlformats.org/officeDocument/2006/relationships"/>
-    <ds:schemaRef ds:uri="http://customooxmlschemas.google.com/"/>
   </ds:schemaRefs>
 </ds:datastoreItem>
 </file>
</xml_diff>

<commit_message>
se agrega codigo en la linea 881 en crearDocumentos para que aparezca el numero de contenedor
</commit_message>
<xml_diff>
--- a/server/templates/transporte/Entrega_Instrucciones.docx
+++ b/server/templates/transporte/Entrega_Instrucciones.docx
@@ -1033,6 +1033,102 @@
                 <w:szCs w:val="18"/>
               </w:rPr>
               <w:t>°C</w:t>
+            </w:r>
+          </w:p>
+        </w:tc>
+      </w:tr>
+      <w:tr>
+        <w:trPr>
+          <w:gridAfter w:val="1"/>
+          <w:wAfter w:w="567" w:type="dxa"/>
+          <w:trHeight w:val="288"/>
+        </w:trPr>
+        <w:tc>
+          <w:tcPr>
+            <w:tcW w:w="3402" w:type="dxa"/>
+            <w:tcBorders>
+              <w:top w:val="nil"/>
+              <w:left w:val="nil"/>
+              <w:bottom w:val="nil"/>
+              <w:right w:val="nil"/>
+            </w:tcBorders>
+            <w:vAlign w:val="center"/>
+          </w:tcPr>
+          <w:p>
+            <w:pPr>
+              <w:spacing w:after="0" w:line="240" w:lineRule="auto"/>
+              <w:rPr>
+                <w:rFonts w:ascii="Tahoma" w:eastAsia="Tahoma" w:hAnsi="Tahoma" w:cs="Tahoma"/>
+                <w:color w:val="000000"/>
+                <w:sz w:val="18"/>
+                <w:szCs w:val="18"/>
+              </w:rPr>
+            </w:pPr>
+            <w:r>
+              <w:rPr>
+                <w:rFonts w:ascii="Tahoma" w:eastAsia="Tahoma" w:hAnsi="Tahoma" w:cs="Tahoma"/>
+                <w:color w:val="000000"/>
+                <w:sz w:val="18"/>
+                <w:szCs w:val="18"/>
+              </w:rPr>
+              <w:t>PREFIJO DEL COTENEDOR:</w:t>
+            </w:r>
+          </w:p>
+        </w:tc>
+        <w:tc>
+          <w:tcPr>
+            <w:tcW w:w="2552" w:type="dxa"/>
+            <w:gridSpan w:val="2"/>
+            <w:tcBorders>
+              <w:top w:val="nil"/>
+              <w:left w:val="nil"/>
+              <w:bottom w:val="nil"/>
+              <w:right w:val="nil"/>
+            </w:tcBorders>
+            <w:vAlign w:val="center"/>
+          </w:tcPr>
+          <w:p>
+            <w:pPr>
+              <w:spacing w:after="0" w:line="240" w:lineRule="auto"/>
+              <w:rPr>
+                <w:rFonts w:ascii="Tahoma" w:eastAsia="Tahoma" w:hAnsi="Tahoma" w:cs="Tahoma"/>
+                <w:sz w:val="18"/>
+                <w:szCs w:val="18"/>
+              </w:rPr>
+            </w:pPr>
+            <w:r>
+              <w:rPr>
+                <w:rFonts w:ascii="Tahoma" w:eastAsia="Tahoma" w:hAnsi="Tahoma" w:cs="Tahoma"/>
+                <w:sz w:val="18"/>
+                <w:szCs w:val="18"/>
+              </w:rPr>
+              <w:t>{</w:t>
+            </w:r>
+            <w:proofErr w:type="spellStart"/>
+            <w:r>
+              <w:rPr>
+                <w:rFonts w:ascii="Tahoma" w:eastAsia="Tahoma" w:hAnsi="Tahoma" w:cs="Tahoma"/>
+                <w:sz w:val="18"/>
+                <w:szCs w:val="18"/>
+              </w:rPr>
+              <w:t>numeroContenedor</w:t>
+            </w:r>
+            <w:proofErr w:type="spellEnd"/>
+            <w:r>
+              <w:rPr>
+                <w:rFonts w:ascii="Tahoma" w:eastAsia="Tahoma" w:hAnsi="Tahoma" w:cs="Tahoma"/>
+                <w:sz w:val="18"/>
+                <w:szCs w:val="18"/>
+              </w:rPr>
+              <w:t>}</w:t>
+            </w:r>
+            <w:r>
+              <w:rPr>
+                <w:rFonts w:ascii="Tahoma" w:eastAsia="Tahoma" w:hAnsi="Tahoma" w:cs="Tahoma"/>
+                <w:sz w:val="18"/>
+                <w:szCs w:val="18"/>
+              </w:rPr>
+              <w:t>.</w:t>
             </w:r>
           </w:p>
         </w:tc>

</xml_diff>

<commit_message>
correcion en los templates entrega de instrucciones
</commit_message>
<xml_diff>
--- a/server/templates/transporte/Entrega_Instrucciones.docx
+++ b/server/templates/transporte/Entrega_Instrucciones.docx
@@ -63,69 +63,23 @@
           <w:sz w:val="24"/>
           <w:szCs w:val="24"/>
         </w:rPr>
-        <w:t xml:space="preserve">CELIFRUT SAS, identificada con NIT 900.885.896-4, ENCOMIENDA a la empresa trasportadora {transportadora} identificada con </w:t>
-      </w:r>
-      <w:proofErr w:type="spellStart"/>
-      <w:r>
-        <w:rPr>
-          <w:rFonts w:ascii="Tahoma" w:eastAsia="Tahoma" w:hAnsi="Tahoma" w:cs="Tahoma"/>
-          <w:sz w:val="24"/>
-          <w:szCs w:val="24"/>
-        </w:rPr>
-        <w:t>Nit</w:t>
-      </w:r>
-      <w:proofErr w:type="spellEnd"/>
-      <w:r>
-        <w:rPr>
-          <w:rFonts w:ascii="Tahoma" w:eastAsia="Tahoma" w:hAnsi="Tahoma" w:cs="Tahoma"/>
-          <w:sz w:val="24"/>
-          <w:szCs w:val="24"/>
-        </w:rPr>
-        <w:t>.</w:t>
-      </w:r>
-      <w:r>
-        <w:rPr>
-          <w:rFonts w:ascii="Tahoma" w:eastAsia="Tahoma" w:hAnsi="Tahoma" w:cs="Tahoma"/>
-          <w:sz w:val="24"/>
-          <w:szCs w:val="24"/>
-        </w:rPr>
-        <w:t xml:space="preserve"> {</w:t>
-      </w:r>
-      <w:proofErr w:type="spellStart"/>
-      <w:proofErr w:type="gramStart"/>
-      <w:r>
-        <w:rPr>
-          <w:rFonts w:ascii="Tahoma" w:eastAsia="Tahoma" w:hAnsi="Tahoma" w:cs="Tahoma"/>
-          <w:sz w:val="24"/>
-          <w:szCs w:val="24"/>
-        </w:rPr>
-        <w:t>nit</w:t>
-      </w:r>
-      <w:proofErr w:type="spellEnd"/>
-      <w:r>
-        <w:rPr>
-          <w:rFonts w:ascii="Tahoma" w:eastAsia="Tahoma" w:hAnsi="Tahoma" w:cs="Tahoma"/>
-          <w:sz w:val="24"/>
-          <w:szCs w:val="24"/>
-        </w:rPr>
-        <w:t>}</w:t>
-      </w:r>
-      <w:r>
-        <w:rPr>
-          <w:rFonts w:ascii="Tahoma" w:eastAsia="Tahoma" w:hAnsi="Tahoma" w:cs="Tahoma"/>
-          <w:sz w:val="24"/>
-          <w:szCs w:val="24"/>
-        </w:rPr>
-        <w:t xml:space="preserve">  la</w:t>
-      </w:r>
-      <w:proofErr w:type="gramEnd"/>
-      <w:r>
-        <w:rPr>
-          <w:rFonts w:ascii="Tahoma" w:eastAsia="Tahoma" w:hAnsi="Tahoma" w:cs="Tahoma"/>
-          <w:sz w:val="24"/>
-          <w:szCs w:val="24"/>
-        </w:rPr>
-        <w:t xml:space="preserve"> carga relacionada a continuación:</w:t>
+        <w:t>CELIFRUT SAS, identificada con NIT 900.885.896-4, ENCOMIENDA a la empresa trasportadora {transportadora} identificada con Nit.</w:t>
+      </w:r>
+      <w:r>
+        <w:rPr>
+          <w:rFonts w:ascii="Tahoma" w:eastAsia="Tahoma" w:hAnsi="Tahoma" w:cs="Tahoma"/>
+          <w:sz w:val="24"/>
+          <w:szCs w:val="24"/>
+        </w:rPr>
+        <w:t xml:space="preserve"> {nit}</w:t>
+      </w:r>
+      <w:r>
+        <w:rPr>
+          <w:rFonts w:ascii="Tahoma" w:eastAsia="Tahoma" w:hAnsi="Tahoma" w:cs="Tahoma"/>
+          <w:sz w:val="24"/>
+          <w:szCs w:val="24"/>
+        </w:rPr>
+        <w:t xml:space="preserve">  la carga relacionada a continuación:</w:t>
       </w:r>
     </w:p>
     <w:p>
@@ -290,25 +244,7 @@
                 <w:sz w:val="18"/>
                 <w:szCs w:val="18"/>
               </w:rPr>
-              <w:t>{</w:t>
-            </w:r>
-            <w:proofErr w:type="spellStart"/>
-            <w:r>
-              <w:rPr>
-                <w:rFonts w:ascii="Tahoma" w:eastAsia="Tahoma" w:hAnsi="Tahoma" w:cs="Tahoma"/>
-                <w:sz w:val="18"/>
-                <w:szCs w:val="18"/>
-              </w:rPr>
-              <w:t>tipo_fruta</w:t>
-            </w:r>
-            <w:proofErr w:type="spellEnd"/>
-            <w:r>
-              <w:rPr>
-                <w:rFonts w:ascii="Tahoma" w:eastAsia="Tahoma" w:hAnsi="Tahoma" w:cs="Tahoma"/>
-                <w:sz w:val="18"/>
-                <w:szCs w:val="18"/>
-              </w:rPr>
-              <w:t>}</w:t>
+              <w:t>{tipo_fruta}</w:t>
             </w:r>
           </w:p>
         </w:tc>
@@ -523,25 +459,7 @@
                 <w:sz w:val="18"/>
                 <w:szCs w:val="18"/>
               </w:rPr>
-              <w:t>{</w:t>
-            </w:r>
-            <w:proofErr w:type="spellStart"/>
-            <w:r>
-              <w:rPr>
-                <w:rFonts w:ascii="Tahoma" w:eastAsia="Tahoma" w:hAnsi="Tahoma" w:cs="Tahoma"/>
-                <w:sz w:val="18"/>
-                <w:szCs w:val="18"/>
-              </w:rPr>
-              <w:t>trailer</w:t>
-            </w:r>
-            <w:proofErr w:type="spellEnd"/>
-            <w:r>
-              <w:rPr>
-                <w:rFonts w:ascii="Tahoma" w:eastAsia="Tahoma" w:hAnsi="Tahoma" w:cs="Tahoma"/>
-                <w:sz w:val="18"/>
-                <w:szCs w:val="18"/>
-              </w:rPr>
-              <w:t>}</w:t>
+              <w:t>{trailer}</w:t>
             </w:r>
           </w:p>
         </w:tc>
@@ -755,25 +673,7 @@
                 <w:sz w:val="18"/>
                 <w:szCs w:val="18"/>
               </w:rPr>
-              <w:t>{</w:t>
-            </w:r>
-            <w:proofErr w:type="spellStart"/>
-            <w:r>
-              <w:rPr>
-                <w:rFonts w:ascii="Tahoma" w:eastAsia="Tahoma" w:hAnsi="Tahoma" w:cs="Tahoma"/>
-                <w:sz w:val="18"/>
-                <w:szCs w:val="18"/>
-              </w:rPr>
-              <w:t>total_cajas</w:t>
-            </w:r>
-            <w:proofErr w:type="spellEnd"/>
-            <w:r>
-              <w:rPr>
-                <w:rFonts w:ascii="Tahoma" w:eastAsia="Tahoma" w:hAnsi="Tahoma" w:cs="Tahoma"/>
-                <w:sz w:val="18"/>
-                <w:szCs w:val="18"/>
-              </w:rPr>
-              <w:t>}</w:t>
+              <w:t>{total_cajas}</w:t>
             </w:r>
             <w:r>
               <w:rPr>
@@ -853,25 +753,7 @@
                 <w:sz w:val="18"/>
                 <w:szCs w:val="18"/>
               </w:rPr>
-              <w:t>{</w:t>
-            </w:r>
-            <w:proofErr w:type="spellStart"/>
-            <w:r>
-              <w:rPr>
-                <w:rFonts w:ascii="Tahoma" w:eastAsia="Tahoma" w:hAnsi="Tahoma" w:cs="Tahoma"/>
-                <w:sz w:val="18"/>
-                <w:szCs w:val="18"/>
-              </w:rPr>
-              <w:t>total_cajas_net</w:t>
-            </w:r>
-            <w:proofErr w:type="spellEnd"/>
-            <w:r>
-              <w:rPr>
-                <w:rFonts w:ascii="Tahoma" w:eastAsia="Tahoma" w:hAnsi="Tahoma" w:cs="Tahoma"/>
-                <w:sz w:val="18"/>
-                <w:szCs w:val="18"/>
-              </w:rPr>
-              <w:t>}</w:t>
+              <w:t>{total_cajas_net}</w:t>
             </w:r>
             <w:r>
               <w:rPr>
@@ -1071,7 +953,25 @@
                 <w:sz w:val="18"/>
                 <w:szCs w:val="18"/>
               </w:rPr>
-              <w:t>PREFIJO DEL COTENEDOR:</w:t>
+              <w:t>PREFIJO DEL CO</w:t>
+            </w:r>
+            <w:r>
+              <w:rPr>
+                <w:rFonts w:ascii="Tahoma" w:eastAsia="Tahoma" w:hAnsi="Tahoma" w:cs="Tahoma"/>
+                <w:color w:val="000000"/>
+                <w:sz w:val="18"/>
+                <w:szCs w:val="18"/>
+              </w:rPr>
+              <w:t>N</w:t>
+            </w:r>
+            <w:r>
+              <w:rPr>
+                <w:rFonts w:ascii="Tahoma" w:eastAsia="Tahoma" w:hAnsi="Tahoma" w:cs="Tahoma"/>
+                <w:color w:val="000000"/>
+                <w:sz w:val="18"/>
+                <w:szCs w:val="18"/>
+              </w:rPr>
+              <w:t>TENEDOR:</w:t>
             </w:r>
           </w:p>
         </w:tc>
@@ -1102,25 +1002,7 @@
                 <w:sz w:val="18"/>
                 <w:szCs w:val="18"/>
               </w:rPr>
-              <w:t>{</w:t>
-            </w:r>
-            <w:proofErr w:type="spellStart"/>
-            <w:r>
-              <w:rPr>
-                <w:rFonts w:ascii="Tahoma" w:eastAsia="Tahoma" w:hAnsi="Tahoma" w:cs="Tahoma"/>
-                <w:sz w:val="18"/>
-                <w:szCs w:val="18"/>
-              </w:rPr>
-              <w:t>numeroContenedor</w:t>
-            </w:r>
-            <w:proofErr w:type="spellEnd"/>
-            <w:r>
-              <w:rPr>
-                <w:rFonts w:ascii="Tahoma" w:eastAsia="Tahoma" w:hAnsi="Tahoma" w:cs="Tahoma"/>
-                <w:sz w:val="18"/>
-                <w:szCs w:val="18"/>
-              </w:rPr>
-              <w:t>}</w:t>
+              <w:t>{numeroContenedor}</w:t>
             </w:r>
             <w:r>
               <w:rPr>
@@ -1378,25 +1260,7 @@
           <w:sz w:val="24"/>
           <w:szCs w:val="24"/>
         </w:rPr>
-        <w:t>{</w:t>
-      </w:r>
-      <w:proofErr w:type="spellStart"/>
-      <w:r>
-        <w:rPr>
-          <w:rFonts w:ascii="Tahoma" w:eastAsia="Tahoma" w:hAnsi="Tahoma" w:cs="Tahoma"/>
-          <w:sz w:val="24"/>
-          <w:szCs w:val="24"/>
-        </w:rPr>
-        <w:t>fecha_dia_escrito</w:t>
-      </w:r>
-      <w:proofErr w:type="spellEnd"/>
-      <w:r>
-        <w:rPr>
-          <w:rFonts w:ascii="Tahoma" w:eastAsia="Tahoma" w:hAnsi="Tahoma" w:cs="Tahoma"/>
-          <w:sz w:val="24"/>
-          <w:szCs w:val="24"/>
-        </w:rPr>
-        <w:t xml:space="preserve">} </w:t>
+        <w:t xml:space="preserve">{fecha_dia_escrito} </w:t>
       </w:r>
       <w:r>
         <w:rPr>
@@ -1412,25 +1276,7 @@
           <w:sz w:val="24"/>
           <w:szCs w:val="24"/>
         </w:rPr>
-        <w:t>{</w:t>
-      </w:r>
-      <w:proofErr w:type="spellStart"/>
-      <w:r>
-        <w:rPr>
-          <w:rFonts w:ascii="Tahoma" w:eastAsia="Tahoma" w:hAnsi="Tahoma" w:cs="Tahoma"/>
-          <w:sz w:val="24"/>
-          <w:szCs w:val="24"/>
-        </w:rPr>
-        <w:t>fecha_dia</w:t>
-      </w:r>
-      <w:proofErr w:type="spellEnd"/>
-      <w:r>
-        <w:rPr>
-          <w:rFonts w:ascii="Tahoma" w:eastAsia="Tahoma" w:hAnsi="Tahoma" w:cs="Tahoma"/>
-          <w:sz w:val="24"/>
-          <w:szCs w:val="24"/>
-        </w:rPr>
-        <w:t>}</w:t>
+        <w:t>{fecha_dia}</w:t>
       </w:r>
       <w:r>
         <w:rPr>
@@ -1446,16 +1292,7 @@
           <w:sz w:val="24"/>
           <w:szCs w:val="24"/>
         </w:rPr>
-        <w:t>{</w:t>
-      </w:r>
-      <w:proofErr w:type="spellStart"/>
-      <w:r>
-        <w:rPr>
-          <w:rFonts w:ascii="Tahoma" w:eastAsia="Tahoma" w:hAnsi="Tahoma" w:cs="Tahoma"/>
-          <w:sz w:val="24"/>
-          <w:szCs w:val="24"/>
-        </w:rPr>
-        <w:t>fecha</w:t>
+        <w:t>{fecha</w:t>
       </w:r>
       <w:r>
         <w:rPr>
@@ -1471,16 +1308,7 @@
           <w:sz w:val="24"/>
           <w:szCs w:val="24"/>
         </w:rPr>
-        <w:t>mes</w:t>
-      </w:r>
-      <w:proofErr w:type="spellEnd"/>
-      <w:r>
-        <w:rPr>
-          <w:rFonts w:ascii="Tahoma" w:eastAsia="Tahoma" w:hAnsi="Tahoma" w:cs="Tahoma"/>
-          <w:sz w:val="24"/>
-          <w:szCs w:val="24"/>
-        </w:rPr>
-        <w:t xml:space="preserve">} </w:t>
+        <w:t xml:space="preserve">mes} </w:t>
       </w:r>
       <w:r>
         <w:rPr>
@@ -1884,13 +1712,8 @@
       <w:spacing w:after="0" w:line="240" w:lineRule="auto"/>
       <w:jc w:val="center"/>
     </w:pPr>
-    <w:proofErr w:type="gramStart"/>
     <w:r>
-      <w:t>www.celifrut.com  -</w:t>
-    </w:r>
-    <w:proofErr w:type="gramEnd"/>
-    <w:r>
-      <w:t xml:space="preserve">  </w:t>
+      <w:t xml:space="preserve">www.celifrut.com  -  </w:t>
     </w:r>
     <w:hyperlink r:id="rId1">
       <w:r>

</xml_diff>